<commit_message>
docs(artigo): projeto de pesquisa atualizado com o histórico até 08/10
Sem mudar a estrutura de tópicos: capa com orientadores, figuras 2 e 3 atuais,
texto do código (firmware v3.0), itens da seção de evolução atualizados e
novos (n a u), Tabela 1 com 20 decisões e conclusões com os próximos passos.

Co-Authored-By: Claude Opus 5.5 <noreply@anthropic.com>
</commit_message>
<xml_diff>
--- a/docs/artigo/Projeto de pesquisa - Final.docx
+++ b/docs/artigo/Projeto de pesquisa - Final.docx
@@ -1,67 +1,5 @@
 
-<file path=customXml\item1.xml><?xml version="1.0" encoding="utf-8"?>
-<b:Sources xmlns:b="http://schemas.openxmlformats.org/officeDocument/2006/bibliography" xmlns="http://schemas.openxmlformats.org/officeDocument/2006/bibliography" SelectedStyle="\APA.XSL" StyleName="APA"/>
-</file>
-
-<file path=customXml\itemProps1.xml><?xml version="1.0" encoding="utf-8"?>
-<ds:datastoreItem xmlns:ds="http://schemas.openxmlformats.org/officeDocument/2006/customXml" ds:itemID="{EE4BC9EC-644D-4D87-AFC8-3A05FD12D9F8}">
-  <ds:schemaRefs>
-    <ds:schemaRef ds:uri="http://schemas.openxmlformats.org/officeDocument/2006/bibliography"/>
-  </ds:schemaRefs>
-</ds:datastoreItem>
-</file>
-
-<file path=docProps\app.xml><?xml version="1.0" encoding="utf-8"?>
-<Properties xmlns="http://schemas.openxmlformats.org/officeDocument/2006/extended-properties" xmlns:vt="http://schemas.openxmlformats.org/officeDocument/2006/docPropsVTypes">
-  <Template>Normal</Template>
-  <TotalTime>153</TotalTime>
-  <Pages>15</Pages>
-  <Words>3933</Words>
-  <Characters>21243</Characters>
-  <Application>Microsoft Office Word</Application>
-  <DocSecurity>0</DocSecurity>
-  <Lines>177</Lines>
-  <Paragraphs>50</Paragraphs>
-  <ScaleCrop>false</ScaleCrop>
-  <HeadingPairs>
-    <vt:vector size="2" baseType="variant">
-      <vt:variant>
-        <vt:lpstr>Título</vt:lpstr>
-      </vt:variant>
-      <vt:variant>
-        <vt:i4>1</vt:i4>
-      </vt:variant>
-    </vt:vector>
-  </HeadingPairs>
-  <TitlesOfParts>
-    <vt:vector size="1" baseType="lpstr">
-      <vt:lpstr>ESCREVA AQUI O TÍTULO DO SEU PEDIDO DE PATENTE</vt:lpstr>
-    </vt:vector>
-  </TitlesOfParts>
-  <Company>INPI</Company>
-  <LinksUpToDate>false</LinksUpToDate>
-  <CharactersWithSpaces>25126</CharactersWithSpaces>
-  <SharedDoc>false</SharedDoc>
-  <HyperlinksChanged>false</HyperlinksChanged>
-  <AppVersion>16.0000</AppVersion>
-</Properties>
-</file>
-
-<file path=docProps\core.xml><?xml version="1.0" encoding="utf-8"?>
-<cp:coreProperties xmlns:cp="http://schemas.openxmlformats.org/package/2006/metadata/core-properties" xmlns:dc="http://purl.org/dc/elements/1.1/" xmlns:dcterms="http://purl.org/dc/terms/" xmlns:dcmitype="http://purl.org/dc/dcmitype/" xmlns:xsi="http://www.w3.org/2001/XMLSchema-instance">
-  <dc:title>ESCREVA AQUI O TÍTULO DO SEU PEDIDO DE PATENTE</dc:title>
-  <dc:subject/>
-  <dc:creator>Matheus Nespolo Silva</dc:creator>
-  <cp:keywords/>
-  <dc:description/>
-  <cp:lastModifiedBy>MATHEUS NESPOLO SILVA</cp:lastModifiedBy>
-  <cp:revision>24</cp:revision>
-  <dcterms:created xsi:type="dcterms:W3CDTF">2026-05-11T22:29:00Z</dcterms:created>
-  <dcterms:modified xsi:type="dcterms:W3CDTF">2026-08-18T23:52:00Z</dcterms:modified>
-</cp:coreProperties>
-</file>
-
-<file path=word\document.xml><?xml version="1.0" encoding="utf-8"?>
+<file path=word/document.xml><?xml version="1.0" encoding="utf-8"?>
 <w:document xmlns:wpc="http://schemas.microsoft.com/office/word/2010/wordprocessingCanvas" xmlns:cx="http://schemas.microsoft.com/office/drawing/2014/chartex" xmlns:cx1="http://schemas.microsoft.com/office/drawing/2015/9/8/chartex" xmlns:cx2="http://schemas.microsoft.com/office/drawing/2015/10/21/chartex" xmlns:cx3="http://schemas.microsoft.com/office/drawing/2016/5/9/chartex" xmlns:cx4="http://schemas.microsoft.com/office/drawing/2016/5/10/chartex" xmlns:cx5="http://schemas.microsoft.com/office/drawing/2016/5/11/chartex" xmlns:cx6="http://schemas.microsoft.com/office/drawing/2016/5/12/chartex" xmlns:cx7="http://schemas.microsoft.com/office/drawing/2016/5/13/chartex" xmlns:cx8="http://schemas.microsoft.com/office/drawing/2016/5/14/chartex" xmlns:mc="http://schemas.openxmlformats.org/markup-compatibility/2006" xmlns:aink="http://schemas.microsoft.com/office/drawing/2016/ink" xmlns:am3d="http://schemas.microsoft.com/office/drawing/2017/model3d" xmlns:o="urn:schemas-microsoft-com:office:office" xmlns:oel="http://schemas.microsoft.com/office/2019/extlst" xmlns:r="http://schemas.openxmlformats.org/officeDocument/2006/relationships" xmlns:m="http://schemas.openxmlformats.org/officeDocument/2006/math" xmlns:v="urn:schemas-microsoft-com:vml" xmlns:wp14="http://schemas.microsoft.com/office/word/2010/wordprocessingDrawing" xmlns:wp="http://schemas.openxmlformats.org/drawingml/2006/wordprocessingDrawing" xmlns:w10="urn:schemas-microsoft-com:office:word" xmlns:w="http://schemas.openxmlformats.org/wordprocessingml/2006/main" xmlns:w14="http://schemas.microsoft.com/office/word/2010/wordml" xmlns:w15="http://schemas.microsoft.com/office/word/2012/wordml" xmlns:w16cei="http://schemas.microsoft.com/office/word/2026/wordml/cei" xmlns:w16cex="http://schemas.microsoft.com/office/word/2018/wordml/cex" xmlns:w16cid="http://schemas.microsoft.com/office/word/2016/wordml/cid" xmlns:w16="http://schemas.microsoft.com/office/word/2018/wordml" xmlns:w16du="http://schemas.microsoft.com/office/word/2023/wordml/word16du" xmlns:w16sdtdh="http://schemas.microsoft.com/office/word/2020/wordml/sdtdatahash" xmlns:w16sdtfl="http://schemas.microsoft.com/office/word/2024/wordml/sdtformatlock" xmlns:w16se="http://schemas.microsoft.com/office/word/2015/wordml/symex" xmlns:wpg="http://schemas.microsoft.com/office/word/2010/wordprocessingGroup" xmlns:wpi="http://schemas.microsoft.com/office/word/2010/wordprocessingInk" xmlns:wne="http://schemas.microsoft.com/office/word/2006/wordml" xmlns:wps="http://schemas.microsoft.com/office/word/2010/wordprocessingShape" mc:Ignorable="w14 w15 w16se w16cid w16 w16cex w16sdtdh w16sdtfl w16du wp14">
   <w:body>
     <w:p>
@@ -310,7 +248,13 @@
           <w:b/>
           <w:bCs/>
         </w:rPr>
-        <w:t xml:space="preserve">Professor(es) Orientador(es):  </w:t>
+        <w:t xml:space="preserve">Professor(es) Orientador(es): </w:t>
+      </w:r>
+      <w:r>
+        <w:rPr>
+          <w:rFonts w:ascii="Arial" w:hAnsi="Arial" w:cs="Arial"/>
+        </w:rPr>
+        <w:t xml:space="preserve">Profa. Tatiani de Paula Pinotti Sabaris Meglhioratti e Prof. Jorge Antonio Giles Ferrer</w:t>
       </w:r>
     </w:p>
     <w:p>
@@ -447,16 +391,6 @@
     </w:p>
     <w:p>
       <w:pPr>
-        <w:rPr>
-          <w:rFonts w:ascii="Arial" w:hAnsi="Arial" w:cs="Arial"/>
-          <w:b/>
-          <w:bCs/>
-        </w:rPr>
-      </w:pPr>
-    </w:p>
-    <w:p>
-      <w:pPr>
-        <w:jc w:val="center"/>
         <w:rPr>
           <w:rFonts w:ascii="Arial" w:hAnsi="Arial" w:cs="Arial"/>
           <w:b/>
@@ -640,23 +574,7 @@
           <w:rFonts w:ascii="Arial" w:hAnsi="Arial" w:cs="Arial"/>
           <w:color w:val="000000" w:themeColor="text1"/>
         </w:rPr>
-        <w:t xml:space="preserve">O projeto se insere no setor de Automação Industrial da Logística, como foco específico em: </w:t>
-      </w:r>
-      <w:proofErr w:type="spellStart"/>
-      <w:r>
-        <w:rPr>
-          <w:rFonts w:ascii="Arial" w:hAnsi="Arial" w:cs="Arial"/>
-          <w:color w:val="000000" w:themeColor="text1"/>
-        </w:rPr>
-        <w:t>Intralogística</w:t>
-      </w:r>
-      <w:proofErr w:type="spellEnd"/>
-      <w:r>
-        <w:rPr>
-          <w:rFonts w:ascii="Arial" w:hAnsi="Arial" w:cs="Arial"/>
-          <w:color w:val="000000" w:themeColor="text1"/>
-        </w:rPr>
-        <w:t xml:space="preserve"> e centros de distribuição, e-commerce, gestão de estoque em vendas e sistemas de recebimento automático.</w:t>
+        <w:t xml:space="preserve">O projeto se insere no setor de Automação Industrial da Logística, como foco específico em: Intralogística e centros de distribuição, e-commerce, gestão de estoque em vendas e sistemas de recebimento automático.</w:t>
       </w:r>
     </w:p>
     <w:p>
@@ -788,27 +706,8 @@
           <w:rFonts w:ascii="Arial" w:hAnsi="Arial" w:cs="Arial"/>
         </w:rPr>
         <w:t xml:space="preserve">O cenário atual da gestão da cadeia de suprimento (SCM) é caracterizado por uma complexidade exponencialmente crescente, que exige das empresas a adoção contínua de tecnologias da Indústria 4.0, buscando manter competitividade e eficiência (TUBIS; ROHMAN, 2023; TIKWAYO; MATHABA, 2023). Nesse contexto, </w:t>
-      </w:r>
-      <w:r>
-        <w:rPr>
-          <w:rFonts w:ascii="Arial" w:hAnsi="Arial" w:cs="Arial"/>
-        </w:rPr>
         <w:lastRenderedPageBreak/>
-        <w:t xml:space="preserve">surge o conceito de Armazém 4.0, que se fundamenta na integração de sistemas </w:t>
-      </w:r>
-      <w:proofErr w:type="spellStart"/>
-      <w:r>
-        <w:rPr>
-          <w:rFonts w:ascii="Arial" w:hAnsi="Arial" w:cs="Arial"/>
-        </w:rPr>
-        <w:t>ciber</w:t>
-      </w:r>
-      <w:proofErr w:type="spellEnd"/>
-      <w:r>
-        <w:rPr>
-          <w:rFonts w:ascii="Arial" w:hAnsi="Arial" w:cs="Arial"/>
-        </w:rPr>
-        <w:t>-físicos para criar estoques inteligentes, capazes de operar de forma descentralizada, modular e em tempo real. Essa transição é incentivada pela necessidade de controlar altos volumes de pedidos aliada a uma busca consistente por transparência e rastreabilidade ao longo de toda a cadeia logística (PEROTTI et al., 2022; KUMAR et al., 2022).</w:t>
+        <w:t xml:space="preserve">surge o conceito de Armazém 4.0, que se fundamenta na integração de sistemas ciber-físicos para criar estoques inteligentes, capazes de operar de forma descentralizada, modular e em tempo real. Essa transição é incentivada pela necessidade de controlar altos volumes de pedidos aliada a uma busca consistente por transparência e rastreabilidade ao longo de toda a cadeia logística (PEROTTI et al., 2022; KUMAR et al., 2022).</w:t>
       </w:r>
     </w:p>
     <w:p>
@@ -857,49 +756,7 @@
         <w:rPr>
           <w:rFonts w:ascii="Arial" w:hAnsi="Arial" w:cs="Arial"/>
         </w:rPr>
-        <w:t>As principais barreiras para a adoção de sistemas inteligentes na logística incluem altos custos de ciclo de vida, complexidade de integração com sistemas legados (</w:t>
-      </w:r>
-      <w:proofErr w:type="spellStart"/>
-      <w:r>
-        <w:rPr>
-          <w:rFonts w:ascii="Arial" w:hAnsi="Arial" w:cs="Arial"/>
-        </w:rPr>
-        <w:t>ERPs</w:t>
-      </w:r>
-      <w:proofErr w:type="spellEnd"/>
-      <w:r>
-        <w:rPr>
-          <w:rFonts w:ascii="Arial" w:hAnsi="Arial" w:cs="Arial"/>
-        </w:rPr>
-        <w:t xml:space="preserve"> e MES) e a rigidez de sistemas proprietários (PEROTTI et al., 2022; KUMAR et al., 2022). A proposta do presente projeto diferencia-se justamente pela viabilidade econômica e pela escalabilidade, operando com soluções de baixo custo baseadas em microcontroladores como ESP32, ESP8266, Arduino ou </w:t>
-      </w:r>
-      <w:proofErr w:type="spellStart"/>
-      <w:r>
-        <w:rPr>
-          <w:rFonts w:ascii="Arial" w:hAnsi="Arial" w:cs="Arial"/>
-        </w:rPr>
-        <w:t>Raspberry</w:t>
-      </w:r>
-      <w:proofErr w:type="spellEnd"/>
-      <w:r>
-        <w:rPr>
-          <w:rFonts w:ascii="Arial" w:hAnsi="Arial" w:cs="Arial"/>
-        </w:rPr>
-        <w:t xml:space="preserve"> Pi, protocolos leves como MQTT e arquitetura flexível para comunicação com bancos de dados e integração com múltiplos componentes IoT. Dessa forma, o projeto se insere na fronteira da </w:t>
-      </w:r>
-      <w:proofErr w:type="spellStart"/>
-      <w:r>
-        <w:rPr>
-          <w:rFonts w:ascii="Arial" w:hAnsi="Arial" w:cs="Arial"/>
-        </w:rPr>
-        <w:t>Intralogística</w:t>
-      </w:r>
-      <w:proofErr w:type="spellEnd"/>
-      <w:r>
-        <w:rPr>
-          <w:rFonts w:ascii="Arial" w:hAnsi="Arial" w:cs="Arial"/>
-        </w:rPr>
-        <w:t xml:space="preserve"> 4.0, buscando democratizar o acesso à automação (HUSSEIN; MUHUDIN, 2024; GARGÁR et al., 2024).</w:t>
+        <w:t xml:space="preserve">As principais barreiras para a adoção de sistemas inteligentes na logística incluem altos custos de ciclo de vida, complexidade de integração com sistemas legados (ERPs e MES) e a rigidez de sistemas proprietários (PEROTTI et al., 2022; KUMAR et al., 2022). A proposta do presente projeto diferencia-se justamente pela viabilidade econômica e pela escalabilidade, operando com soluções de baixo custo baseadas em microcontroladores como ESP32, ESP8266, Arduino ou Raspberry Pi, protocolos leves como MQTT e arquitetura flexível para comunicação com bancos de dados e integração com múltiplos componentes IoT. Dessa forma, o projeto se insere na fronteira da Intralogística 4.0, buscando democratizar o acesso à automação (HUSSEIN; MUHUDIN, 2024; GARGÁR et al., 2024).</w:t>
       </w:r>
     </w:p>
     <w:p>
@@ -961,23 +818,7 @@
           <w:rFonts w:ascii="Arial" w:hAnsi="Arial" w:cs="Arial"/>
           <w:color w:val="000000" w:themeColor="text1"/>
         </w:rPr>
-        <w:t xml:space="preserve">As esteiras têm dimensões de 36 x 9 x 9 cm, correia de 30 x 8 cm, dois roletes </w:t>
-      </w:r>
-      <w:proofErr w:type="spellStart"/>
-      <w:r>
-        <w:rPr>
-          <w:rFonts w:ascii="Arial" w:hAnsi="Arial" w:cs="Arial"/>
-          <w:color w:val="000000" w:themeColor="text1"/>
-        </w:rPr>
-        <w:t>rolamentados</w:t>
-      </w:r>
-      <w:proofErr w:type="spellEnd"/>
-      <w:r>
-        <w:rPr>
-          <w:rFonts w:ascii="Arial" w:hAnsi="Arial" w:cs="Arial"/>
-          <w:color w:val="000000" w:themeColor="text1"/>
-        </w:rPr>
-        <w:t xml:space="preserve"> e motor DC 3–6V já incluso em cada unidade. Elas vêm desmontadas e sem controlador de velocidade, o que significa que toda a parte eletrônica de controle precisa ser adicionada separadamente.</w:t>
+        <w:t xml:space="preserve">As esteiras têm dimensões de 36 x 9 x 9 cm, correia de 30 x 8 cm, dois roletes rolamentados e motor DC 3–6V já incluso em cada unidade. Elas vêm desmontadas e sem controlador de velocidade, o que significa que toda a parte eletrônica de controle precisa ser adicionada separadamente.</w:t>
       </w:r>
     </w:p>
     <w:p>
@@ -994,63 +835,7 @@
           <w:rFonts w:ascii="Arial" w:hAnsi="Arial" w:cs="Arial"/>
           <w:color w:val="000000" w:themeColor="text1"/>
         </w:rPr>
-        <w:t xml:space="preserve">O controle geral </w:t>
-      </w:r>
-      <w:r>
-        <w:rPr>
-          <w:rFonts w:ascii="Arial" w:hAnsi="Arial" w:cs="Arial"/>
-          <w:color w:val="000000" w:themeColor="text1"/>
-        </w:rPr>
-        <w:t xml:space="preserve">poderia ser </w:t>
-      </w:r>
-      <w:r>
-        <w:rPr>
-          <w:rFonts w:ascii="Arial" w:hAnsi="Arial" w:cs="Arial"/>
-          <w:color w:val="000000" w:themeColor="text1"/>
-        </w:rPr>
-        <w:t xml:space="preserve">feito pelo Arduino </w:t>
-      </w:r>
-      <w:r>
-        <w:rPr>
-          <w:rFonts w:ascii="Arial" w:hAnsi="Arial" w:cs="Arial"/>
-          <w:color w:val="000000" w:themeColor="text1"/>
-        </w:rPr>
-        <w:t>Mega</w:t>
-      </w:r>
-      <w:r>
-        <w:rPr>
-          <w:rFonts w:ascii="Arial" w:hAnsi="Arial" w:cs="Arial"/>
-          <w:color w:val="000000" w:themeColor="text1"/>
-        </w:rPr>
-        <w:t xml:space="preserve">, </w:t>
-      </w:r>
-      <w:r>
-        <w:rPr>
-          <w:rFonts w:ascii="Arial" w:hAnsi="Arial" w:cs="Arial"/>
-          <w:color w:val="000000" w:themeColor="text1"/>
-        </w:rPr>
-        <w:t xml:space="preserve">que possui </w:t>
-      </w:r>
-      <w:r>
-        <w:rPr>
-          <w:rFonts w:ascii="Arial" w:hAnsi="Arial" w:cs="Arial"/>
-          <w:color w:val="000000" w:themeColor="text1"/>
-        </w:rPr>
-        <w:t xml:space="preserve">mais pinos digitais e analógicos que o Uno – </w:t>
-      </w:r>
-      <w:r>
-        <w:rPr>
-          <w:rFonts w:ascii="Arial" w:hAnsi="Arial" w:cs="Arial"/>
-          <w:color w:val="000000" w:themeColor="text1"/>
-        </w:rPr>
-        <w:t xml:space="preserve">no entanto, o hardware escolhido é capaz de </w:t>
-      </w:r>
-      <w:r>
-        <w:rPr>
-          <w:rFonts w:ascii="Arial" w:hAnsi="Arial" w:cs="Arial"/>
-          <w:color w:val="000000" w:themeColor="text1"/>
-        </w:rPr>
-        <w:t>gerenciar ao mesmo tempo os quatro motores, os seis sensores, o display e os botões. Os motores são acionados por dois módulos driver L298N, cada um controlando dois motores. Esses módulos permitem regular a velocidade via PWM e inverter o sentido de giro, operando com tensão entre 5 e 35V e corrente de até 2A por canal.</w:t>
+        <w:t xml:space="preserve">O controle geral poderia ser feito pelo Arduino Mega, que possui mais pinos digitais e analógicos que o Uno – no entanto, o hardware escolhido é capaz de gerenciar ao mesmo tempo os quatro motores, os seis sensores, o display e os botões. Os motores são acionados por dois módulos driver L298N, cada um controlando dois motores. Esses módulos permitem regular a velocidade via PWM e inverter o sentido de giro, operando com tensão entre 5 e 35V e corrente de até 2A por canal.</w:t>
       </w:r>
     </w:p>
     <w:p>
@@ -1119,23 +904,7 @@
           <w:color w:val="000000" w:themeColor="text1"/>
         </w:rPr>
         <w:lastRenderedPageBreak/>
-        <w:t xml:space="preserve">Os dados de operação – tipo de peça, status das esteiras e quantidade em estoque – são enviados via protocolo MQTT pela serial do Arduino para um módulo Wi-Fi (ESP8266 ou ESP32), que repassa ao broker. A visualização pode ser feita no Node-RED ou no </w:t>
-      </w:r>
-      <w:proofErr w:type="spellStart"/>
-      <w:r>
-        <w:rPr>
-          <w:rFonts w:ascii="Arial" w:hAnsi="Arial" w:cs="Arial"/>
-          <w:color w:val="000000" w:themeColor="text1"/>
-        </w:rPr>
-        <w:t>Ubidots</w:t>
-      </w:r>
-      <w:proofErr w:type="spellEnd"/>
-      <w:r>
-        <w:rPr>
-          <w:rFonts w:ascii="Arial" w:hAnsi="Arial" w:cs="Arial"/>
-          <w:color w:val="000000" w:themeColor="text1"/>
-        </w:rPr>
-        <w:t>, permitindo acompanhar o sistema remotamente em tempo real.</w:t>
+        <w:t xml:space="preserve">Os dados de operação – tipo de peça, status das esteiras e quantidade em estoque – são enviados via protocolo MQTT pela serial do Arduino para um módulo Wi-Fi (ESP8266 ou ESP32), que repassa ao broker. A visualização pode ser feita no Node-RED ou no Ubidots, permitindo acompanhar o sistema remotamente em tempo real.</w:t>
       </w:r>
     </w:p>
     <w:p>
@@ -1169,39 +938,7 @@
           <w:rFonts w:ascii="Arial" w:hAnsi="Arial" w:cs="Arial"/>
           <w:color w:val="000000" w:themeColor="text1"/>
         </w:rPr>
-        <w:t xml:space="preserve">A programação foi desenvolvida de forma incremental: primeiro a máquina de estados foi testada com entradas simuladas pelo monitor serial, depois os sensores e motores foram integrados e validados junção por junção, até chegar ao teste do sistema completo. A pesquisa bibliográfica foi feita no Google Acadêmico com foco em publicações de 2021 a 2024, usando os termos: automação, </w:t>
-      </w:r>
-      <w:proofErr w:type="spellStart"/>
-      <w:r>
-        <w:rPr>
-          <w:rFonts w:ascii="Arial" w:hAnsi="Arial" w:cs="Arial"/>
-          <w:color w:val="000000" w:themeColor="text1"/>
-        </w:rPr>
-        <w:t>intralogística</w:t>
-      </w:r>
-      <w:proofErr w:type="spellEnd"/>
-      <w:r>
-        <w:rPr>
-          <w:rFonts w:ascii="Arial" w:hAnsi="Arial" w:cs="Arial"/>
-          <w:color w:val="000000" w:themeColor="text1"/>
-        </w:rPr>
-        <w:t xml:space="preserve">, Indústria 4.0, IoT, RFID e gestão de estoque. As tarefas foram organizadas em um cronograma </w:t>
-      </w:r>
-      <w:proofErr w:type="spellStart"/>
-      <w:r>
-        <w:rPr>
-          <w:rFonts w:ascii="Arial" w:hAnsi="Arial" w:cs="Arial"/>
-          <w:color w:val="000000" w:themeColor="text1"/>
-        </w:rPr>
-        <w:t>Gantt</w:t>
-      </w:r>
-      <w:proofErr w:type="spellEnd"/>
-      <w:r>
-        <w:rPr>
-          <w:rFonts w:ascii="Arial" w:hAnsi="Arial" w:cs="Arial"/>
-          <w:color w:val="000000" w:themeColor="text1"/>
-        </w:rPr>
-        <w:t xml:space="preserve"> ao longo do semestre.</w:t>
+        <w:t xml:space="preserve">A programação foi desenvolvida de forma incremental: primeiro a máquina de estados foi testada com entradas simuladas pelo monitor serial, depois os sensores e motores foram integrados e validados junção por junção, até chegar ao teste do sistema completo. A pesquisa bibliográfica foi feita no Google Acadêmico com foco em publicações de 2021 a 2024, usando os termos: automação, intralogística, Indústria 4.0, IoT, RFID e gestão de estoque. As tarefas foram organizadas em um cronograma Gantt ao longo do semestre.</w:t>
       </w:r>
     </w:p>
     <w:p/>
@@ -1229,17 +966,7 @@
           <w:sz w:val="24"/>
           <w:szCs w:val="24"/>
         </w:rPr>
-        <w:t>Descrição dos desenhos</w:t>
-      </w:r>
-      <w:r>
-        <w:rPr>
-          <w:rFonts w:ascii="Arial" w:hAnsi="Arial" w:cs="Arial"/>
-          <w:b/>
-          <w:color w:val="auto"/>
-          <w:sz w:val="24"/>
-          <w:szCs w:val="24"/>
-        </w:rPr>
-        <w:t>.</w:t>
+        <w:t>Descrição dos desenhos.</w:t>
       </w:r>
     </w:p>
     <w:p>
@@ -1261,29 +988,7 @@
           <w:rFonts w:ascii="Arial" w:hAnsi="Arial" w:cs="Arial"/>
           <w:color w:val="000000" w:themeColor="text1"/>
         </w:rPr>
-        <w:t xml:space="preserve">A Figura 1 apresenta o diagrama 2D do sistema de </w:t>
-      </w:r>
-      <w:proofErr w:type="spellStart"/>
-      <w:r>
-        <w:rPr>
-          <w:rFonts w:ascii="Arial" w:hAnsi="Arial" w:cs="Arial"/>
-          <w:color w:val="000000" w:themeColor="text1"/>
-        </w:rPr>
-        <w:t>intralogística</w:t>
-      </w:r>
-      <w:proofErr w:type="spellEnd"/>
-      <w:r>
-        <w:rPr>
-          <w:rFonts w:ascii="Arial" w:hAnsi="Arial" w:cs="Arial"/>
-          <w:color w:val="000000" w:themeColor="text1"/>
-        </w:rPr>
-        <w:t>.</w:t>
-      </w:r>
-      <w:r>
-        <w:rPr>
-          <w:noProof/>
-        </w:rPr>
-        <w:t xml:space="preserve"> </w:t>
+        <w:t xml:space="preserve">A Figura 1 apresenta o diagrama 2D do sistema de intralogística na concepção inicial. Na implementação, os sensores de seleção (RFID/IoT) deram lugar aos sensores infravermelhos das junções J1, J2 e J3, e a roda de separação ao fim da esteira principal ainda está em integração.</w:t>
       </w:r>
     </w:p>
     <w:p>
@@ -1498,14 +1203,7 @@
           <w:color w:val="000000" w:themeColor="text1"/>
         </w:rPr>
         <w:lastRenderedPageBreak/>
-        <w:t>A Figura 2 ilustra o esquema elétrico do sistema</w:t>
-      </w:r>
-      <w:r>
-        <w:rPr>
-          <w:rFonts w:ascii="Arial" w:hAnsi="Arial" w:cs="Arial"/>
-          <w:color w:val="000000" w:themeColor="text1"/>
-        </w:rPr>
-        <w:t>.</w:t>
+        <w:t xml:space="preserve">A Figura 2 ilustra o esquema elétrico consolidado do sistema, publicado em 23/09/2026: Arduino Uno, três drivers MOSFET IRF520 (um por esteira secundária), seis sensores TCRT5000 ligados por placas de passagem, ESP32 com divisor de tensão de 1 kΩ/2 kΩ na linha serial e fontes de alimentação com GND comum.</w:t>
       </w:r>
     </w:p>
     <w:p>
@@ -1523,7 +1221,7 @@
         </w:rPr>
         <w:drawing>
           <wp:inline distT="0" distB="0" distL="0" distR="0" wp14:anchorId="4D7941EB" wp14:editId="19720214">
-            <wp:extent cx="5400000" cy="5718748"/>
+            <wp:extent cx="5400000" cy="5674390"/>
             <wp:effectExtent l="0" t="0" r="0" b="0"/>
             <wp:docPr id="1335700024" name="Imagem 1"/>
             <wp:cNvGraphicFramePr>
@@ -1545,7 +1243,7 @@
                   <pic:spPr>
                     <a:xfrm>
                       <a:off x="0" y="0"/>
-                      <a:ext cx="5400000" cy="5718748"/>
+                      <a:ext cx="5400000" cy="5674390"/>
                     </a:xfrm>
                     <a:prstGeom prst="rect">
                       <a:avLst/>
@@ -1693,14 +1391,7 @@
           <w:color w:val="000000" w:themeColor="text1"/>
         </w:rPr>
         <w:lastRenderedPageBreak/>
-        <w:t>A Figura 3 apresenta o fluxograma do código-fonte</w:t>
-      </w:r>
-      <w:r>
-        <w:rPr>
-          <w:rFonts w:ascii="Arial" w:hAnsi="Arial" w:cs="Arial"/>
-          <w:color w:val="000000" w:themeColor="text1"/>
-        </w:rPr>
-        <w:t>.</w:t>
+        <w:t xml:space="preserve">A Figura 3 apresenta a máquina de estados do firmware do Arduino Uno; a supervisão da entrega por marcos, introduzida na versão 3.0, é detalhada a seguir.</w:t>
       </w:r>
     </w:p>
     <w:p>
@@ -1718,7 +1409,7 @@
         </w:rPr>
         <w:drawing>
           <wp:inline distT="0" distB="0" distL="0" distR="0" wp14:anchorId="7C9F6D6A" wp14:editId="2B8C964F">
-            <wp:extent cx="5400000" cy="5563148"/>
+            <wp:extent cx="5400000" cy="3820063"/>
             <wp:effectExtent l="0" t="0" r="0" b="0"/>
             <wp:docPr id="789454712" name="Imagem 1"/>
             <wp:cNvGraphicFramePr>
@@ -1740,7 +1431,7 @@
                   <pic:spPr>
                     <a:xfrm>
                       <a:off x="0" y="0"/>
-                      <a:ext cx="5400000" cy="5563148"/>
+                      <a:ext cx="5400000" cy="3820063"/>
                     </a:xfrm>
                     <a:prstGeom prst="rect">
                       <a:avLst/>
@@ -1777,53 +1468,7 @@
           <w:rFonts w:ascii="Arial" w:hAnsi="Arial" w:cs="Arial"/>
           <w:color w:val="000000" w:themeColor="text1"/>
         </w:rPr>
-        <w:t xml:space="preserve">O código-fonte foi desenvolvido em linguagem C++ para a plataforma Arduino </w:t>
-      </w:r>
-      <w:r>
-        <w:rPr>
-          <w:rFonts w:ascii="Arial" w:hAnsi="Arial" w:cs="Arial"/>
-          <w:color w:val="000000" w:themeColor="text1"/>
-        </w:rPr>
-        <w:t>UNO</w:t>
-      </w:r>
-      <w:r>
-        <w:rPr>
-          <w:rFonts w:ascii="Arial" w:hAnsi="Arial" w:cs="Arial"/>
-          <w:color w:val="000000" w:themeColor="text1"/>
-        </w:rPr>
-        <w:t xml:space="preserve">, utilizando uma arquitetura de máquina de estados finita (FSM – </w:t>
-      </w:r>
-      <w:proofErr w:type="spellStart"/>
-      <w:r>
-        <w:rPr>
-          <w:rFonts w:ascii="Arial" w:hAnsi="Arial" w:cs="Arial"/>
-          <w:color w:val="000000" w:themeColor="text1"/>
-        </w:rPr>
-        <w:t>Finite</w:t>
-      </w:r>
-      <w:proofErr w:type="spellEnd"/>
-      <w:r>
-        <w:rPr>
-          <w:rFonts w:ascii="Arial" w:hAnsi="Arial" w:cs="Arial"/>
-          <w:color w:val="000000" w:themeColor="text1"/>
-        </w:rPr>
-        <w:t xml:space="preserve"> </w:t>
-      </w:r>
-      <w:proofErr w:type="spellStart"/>
-      <w:r>
-        <w:rPr>
-          <w:rFonts w:ascii="Arial" w:hAnsi="Arial" w:cs="Arial"/>
-          <w:color w:val="000000" w:themeColor="text1"/>
-        </w:rPr>
-        <w:t>State</w:t>
-      </w:r>
-      <w:proofErr w:type="spellEnd"/>
-      <w:r>
-        <w:rPr>
-          <w:rFonts w:ascii="Arial" w:hAnsi="Arial" w:cs="Arial"/>
-          <w:color w:val="000000" w:themeColor="text1"/>
-        </w:rPr>
-        <w:t xml:space="preserve"> Machine) com cinco estados distintos. Essa abordagem garante que o sistema opere de forma determinística, previsível e segura, facilitando a depuração e manutenção do código.</w:t>
+        <w:t xml:space="preserve">O código-fonte foi desenvolvido em linguagem C++ para a plataforma Arduino UNO, utilizando uma arquitetura de máquina de estados finita (FSM – Finite State Machine) com cinco estados distintos. Na versão 3.0 (outubro de 2026), o firmware foi reestruturado em módulos: a lógica (protocolo, filtro das entradas, supervisor da entrega, FSM e telas do LCD) fica separada da camada de hardware (motores, sensores, comunicação serial, LCD e diagnóstico) e é verificada no computador por 43 testes automatizados. Essa abordagem garante que o sistema opere de forma determinística, previsível e segura, facilitando a depuração e a manutenção do código.</w:t>
       </w:r>
     </w:p>
     <w:p>
@@ -1840,7 +1485,7 @@
           <w:rFonts w:ascii="Arial" w:hAnsi="Arial" w:cs="Arial"/>
           <w:color w:val="000000" w:themeColor="text1"/>
         </w:rPr>
-        <w:t>A esteira principal permanece em funcionamento contínuo durante toda a operação do sistema. As esteiras secundárias A, B e C são ativadas somente mediante pedido do operador, retornando ao estado de repouso assim que a entrega é confirmada pelos sensores das junções J1, J2 e J3, ou quando um erro é detectado por timeout.</w:t>
+        <w:t xml:space="preserve">A esteira principal permanece ligada diretamente à fonte, em funcionamento contínuo. As esteiras secundárias A, B e C são acionadas somente mediante pedido feito pelo dashboard web e desligadas ao fim da entrega ou quando uma falha é detectada. O estoque só é debitado depois que o sensor da junção correspondente (J1, J2 ou J3) confirma a passagem da peça.</w:t>
       </w:r>
     </w:p>
     <w:p>
@@ -1857,15 +1502,8 @@
           <w:rFonts w:ascii="Arial" w:hAnsi="Arial" w:cs="Arial"/>
           <w:color w:val="000000" w:themeColor="text1"/>
         </w:rPr>
-        <w:t xml:space="preserve">Os cinco estados da máquina de estados são: (1) AGUARDANDO_PEDIDO – sistema em repouso monitorando os botões físicos; (2) VERIFICANDO_ESTOQUE – consulta o sensor do topo da esteira e o contador interno; (3) ACIONANDO_ESTEIRA – aciona </w:t>
-      </w:r>
-      <w:r>
-        <w:rPr>
-          <w:rFonts w:ascii="Arial" w:hAnsi="Arial" w:cs="Arial"/>
-          <w:color w:val="000000" w:themeColor="text1"/>
-        </w:rPr>
         <w:lastRenderedPageBreak/>
-        <w:t>o motor da esteira secundária correspondente; (4) ENTREGANDO_PECA – monitora o sensor da junção com timeout de 3 segundos; e (5) ERRO – sinaliza falha no LCD e aguarda reset manual.</w:t>
+        <w:t xml:space="preserve">Os cinco estados da máquina de estados são: (1) AGUARDANDO_PEDIDO – sistema em repouso aguardando comandos remotos (os botões físicos foram desabilitados); (2) VERIFICANDO_ESTOQUE – checagem prévia, sem ligar o motor, do contador interno, do sensor do topo e da junção livre; (3) ACIONANDO_ESTEIRA – partida do motor com kick-start (PWM 255 por 150 ms) e, em seguida, PWM de regime; (4) ENTREGANDO_PECA – supervisão por marcos: topo livre em até 3 s (M1), passagem na junção em até 12,5 s desde a partida (M2, quando o estoque é debitado) e 3 s de saída com a junção liberada (M3); e (5) ERRO – motores desligados, com a causa e a fase da falha exibidas no LCD e no dashboard, aguardando o comando de reset.</w:t>
       </w:r>
     </w:p>
     <w:p>
@@ -1882,37 +1520,7 @@
           <w:rFonts w:ascii="Arial" w:hAnsi="Arial" w:cs="Arial"/>
           <w:color w:val="000000" w:themeColor="text1"/>
         </w:rPr>
-        <w:t xml:space="preserve">Para o monitoramento remoto, o sistema publica dados via protocolo MQTT pela porta serial do Arduino </w:t>
-      </w:r>
-      <w:r>
-        <w:rPr>
-          <w:rFonts w:ascii="Arial" w:hAnsi="Arial" w:cs="Arial"/>
-          <w:color w:val="000000" w:themeColor="text1"/>
-        </w:rPr>
-        <w:t>UNO</w:t>
-      </w:r>
-      <w:r>
-        <w:rPr>
-          <w:rFonts w:ascii="Arial" w:hAnsi="Arial" w:cs="Arial"/>
-          <w:color w:val="000000" w:themeColor="text1"/>
-        </w:rPr>
-        <w:t xml:space="preserve">, no formato: MQTT|tipo:A|estoqueA:4|estoqueB:5|estoqueC:5. Um módulo ESP8266 ou ESP32 conectado à serial encaminha as mensagens ao broker, que pode ser integrado ao Node-RED ou </w:t>
-      </w:r>
-      <w:proofErr w:type="spellStart"/>
-      <w:r>
-        <w:rPr>
-          <w:rFonts w:ascii="Arial" w:hAnsi="Arial" w:cs="Arial"/>
-          <w:color w:val="000000" w:themeColor="text1"/>
-        </w:rPr>
-        <w:t>Ubidots</w:t>
-      </w:r>
-      <w:proofErr w:type="spellEnd"/>
-      <w:r>
-        <w:rPr>
-          <w:rFonts w:ascii="Arial" w:hAnsi="Arial" w:cs="Arial"/>
-          <w:color w:val="000000" w:themeColor="text1"/>
-        </w:rPr>
-        <w:t xml:space="preserve"> para visualização em tempo real.</w:t>
+        <w:t xml:space="preserve">Para o monitoramento remoto, o Arduino UNO envia mensagens JSON pela serial (por exemplo, {"type":"estoque","pecaA":15,"pecaB":15,"pecaC":15}) a um ESP32, que atua como gateway e as publica nos tópicos dataflow/* de um broker MQTT (Mosquitto local ou HiveMQ Cloud com TLS). Um servidor Node.js repassa os dados por WebSocket ao dashboard web e expõe métricas ao Prometheus/Grafana, e o historiador do PC industrial Beckhoff CX9240 grava estoque e eventos em banco SQLite.</w:t>
       </w:r>
     </w:p>
     <w:p>
@@ -1929,7 +1537,7 @@
           <w:rFonts w:ascii="Arial" w:hAnsi="Arial" w:cs="Arial"/>
           <w:color w:val="000000" w:themeColor="text1"/>
         </w:rPr>
-        <w:t>O mapeamento de pinos adotado é o seguinte: pinos 2, 3 e 4 controlam o motor da esteira principal (ENA, IN1, IN2); pinos 5, 6 e 7 a esteira A; pinos 8, 9 e 10 a esteira B; pinos 11, 12 e 13 a esteira C. Os sensores IR TCRT5000 do topo das esteiras secundárias estão ligados às entradas analógicas A0, A1 e A2, enquanto os sensores das junções J1, J2 e J3 utilizam A3, A4 e A5. Os quatro botões físicos ocupam os pinos digitais 22 a 25. O display LCD 16x2 com módulo I2C opera no endereço 0x27 via pinos SDA/SCL.</w:t>
+        <w:t xml:space="preserve">O mapeamento de pinos adotado é o seguinte: os pinos PWM 9, 10 e 11 acionam os drivers IRF520 das esteiras A, B e C; os sensores IR TCRT5000 do topo das esteiras secundárias estão ligados às entradas A0, A1 e A2, e os sensores das junções J1, J2 e J3 utilizam A3, D2 e D4, lidos por interrupção de mudança de nível. Os pinos A4 (SDA) e A5 (SCL) ficam dedicados ao display LCD 16x2 com módulo I2C (endereço 0x27 ou 0x3F, detectado na inicialização), os pinos 0 e 1 fazem a comunicação serial com o ESP32 e os pinos 5 a 8 ficam reservados ao driver ULN2003 do motor de passo da roda de separação.</w:t>
       </w:r>
     </w:p>
     <w:p>
@@ -1989,14 +1597,7 @@
           <w:rFonts w:ascii="Arial" w:hAnsi="Arial" w:cs="Arial"/>
           <w:color w:val="000000" w:themeColor="text1"/>
         </w:rPr>
-        <w:t xml:space="preserve">O código completo, conforme implementado na Arduino IDE, é apresentado </w:t>
-      </w:r>
-      <w:r>
-        <w:rPr>
-          <w:rFonts w:ascii="Arial" w:hAnsi="Arial" w:cs="Arial"/>
-          <w:color w:val="000000" w:themeColor="text1"/>
-        </w:rPr>
-        <w:t>na pasta do repositório que hospeda o projeto:</w:t>
+        <w:t xml:space="preserve">O código completo, conforme implementado (compilado na Arduino IDE ou no arduino-cli), é apresentado na pasta do repositório que hospeda o projeto:</w:t>
       </w:r>
     </w:p>
     <w:p>
@@ -2009,15 +1610,13 @@
         </w:rPr>
       </w:pPr>
       <w:hyperlink r:id="rId13" w:history="1">
-        <w:proofErr w:type="spellStart"/>
         <w:r>
           <w:rPr>
             <w:rStyle w:val="Hyperlink"/>
             <w:rFonts w:ascii="Arial" w:hAnsi="Arial" w:cs="Arial"/>
           </w:rPr>
-          <w:t>data_flow_inventory.ino</w:t>
+          <w:t>arduino/data_flow_inventory</w:t>
         </w:r>
-        <w:proofErr w:type="spellEnd"/>
       </w:hyperlink>
     </w:p>
     <w:p>
@@ -2081,14 +1680,7 @@
           <w:rFonts w:ascii="Arial" w:hAnsi="Arial" w:cs="Arial"/>
           <w:color w:val="000000" w:themeColor="text1"/>
         </w:rPr>
-        <w:t>A in</w:t>
-      </w:r>
-      <w:r>
-        <w:rPr>
-          <w:rFonts w:ascii="Arial" w:hAnsi="Arial" w:cs="Arial"/>
-          <w:color w:val="000000" w:themeColor="text1"/>
-        </w:rPr>
-        <w:t>tenção é fazer uma entrega parcial, primeiramente de apenas uma esteira e o controle de estoque com o separador de itens no final, feito isso, seremos capazes de implementar outros conjuntos de esteiras que podem representar a entrega e seleção de uma composição um pouco mais avançada.</w:t>
+        <w:t>A intenção é fazer uma entrega parcial, primeiramente de apenas uma esteira e o controle de estoque com o separador de itens no final, feito isso, seremos capazes de implementar outros conjuntos de esteiras que podem representar a entrega e seleção de uma composição um pouco mais avançada.</w:t>
       </w:r>
     </w:p>
     <w:p>
@@ -2123,30 +1715,8 @@
           <w:color w:val="000000" w:themeColor="text1"/>
         </w:rPr>
         <w:t xml:space="preserve">Uma outra concretização seria a implementação de um sistema na nuvem que possa gerenciar e armazenar as informações de: processo, saldo e interações. Portanto, essa última integração seria basicamente estruturada através do software que roda </w:t>
-      </w:r>
-      <w:r>
-        <w:rPr>
-          <w:rFonts w:ascii="Arial" w:hAnsi="Arial" w:cs="Arial"/>
-          <w:color w:val="000000" w:themeColor="text1"/>
-        </w:rPr>
         <w:lastRenderedPageBreak/>
-        <w:t xml:space="preserve">no microcontrolador (Arduino considerado até o momento), onde precisaremos de um gateway MQTT para comunicação com a plataforma web (o </w:t>
-      </w:r>
-      <w:proofErr w:type="spellStart"/>
-      <w:r>
-        <w:rPr>
-          <w:rFonts w:ascii="Arial" w:hAnsi="Arial" w:cs="Arial"/>
-          <w:color w:val="000000" w:themeColor="text1"/>
-        </w:rPr>
-        <w:t>Ubidots</w:t>
-      </w:r>
-      <w:proofErr w:type="spellEnd"/>
-      <w:r>
-        <w:rPr>
-          <w:rFonts w:ascii="Arial" w:hAnsi="Arial" w:cs="Arial"/>
-          <w:color w:val="000000" w:themeColor="text1"/>
-        </w:rPr>
-        <w:t xml:space="preserve"> parece ser a opção mais viável para esse cenário).</w:t>
+        <w:t xml:space="preserve">no microcontrolador (Arduino considerado até o momento), onde precisaremos de um gateway MQTT para comunicação com a plataforma web (o Ubidots parece ser a opção mais viável para esse cenário).</w:t>
       </w:r>
     </w:p>
     <w:p>
@@ -2202,7 +1772,7 @@
           <w:rFonts w:ascii="Arial" w:hAnsi="Arial" w:cs="Arial"/>
           <w:color w:val="000000" w:themeColor="text1"/>
         </w:rPr>
-        <w:t>As seções anteriores descrevem a concepção inicial do projeto. Durante a fase de implementação e testes de bancada, decisões de engenharia levaram a uma evolução significativa da arquitetura, documentada a seguir com as respectivas justificativas. Todo o desenvolvimento encontra-se versionado em repositório público (https://github.com/MatheusNespolo/DataFlowInventory), acompanhado de documentação técnica: arquitetura de comunicação MQTT, fluxogramas de funcionamento (FSM e ciclo de um pedido), guia de configuração do broker local e plano de testes.</w:t>
+        <w:t xml:space="preserve">As seções 1 a 6 e a seção 8 descrevem a concepção inicial do projeto; a seção 7 apresenta os desenhos e o código já atualizados. Durante a fase de implementação e testes de bancada, decisões de engenharia levaram a uma evolução significativa da arquitetura, documentada a seguir com as respectivas justificativas. Todo o desenvolvimento encontra-se versionado em repositório público (https://github.com/MatheusNespolo/DataFlowInventory), acompanhado de documentação técnica: arquitetura consolidada (comunicação MQTT, formatos de mensagem e máquina de estados), guias de implantação e de integração, plano de testes, roteiros semanais de bancada e registro de mudanças (CHANGELOG).</w:t>
       </w:r>
     </w:p>
     <w:p>
@@ -2233,7 +1803,7 @@
           <w:sz w:val="24"/>
           <w:szCs w:val="24"/>
         </w:rPr>
-        <w:t xml:space="preserve">A troca do driver L298N (que exige três pinos por motor: ENA, IN1 e IN2) por módulos MOSFET IRF520 (um único pino PWM por motor) reduziu a demanda de E/S de doze para quatro pinos de controle. Como os motores DC 3–6 V operam em sentido único, a ponte H completa do L298N era desnecessária; ademais, a queda de tensão interna de aproximadamente 2 V no L298N degradava substancialmente o torque em baixa tensão, problema totalmente eliminado pela condução por efeito de campo do MOSFET. A esteira principal foi configurada com ligação direta à alimentação CC, simplificando o controle. Essa racionalização viabilizou o uso do Arduino Uno em substituição ao Mega, barateando o protótipo e consolidando a viabilidade econômica do sistema.</w:t>
+        <w:t xml:space="preserve">A troca do driver L298N (que exige três pinos por motor: ENA, IN1 e IN2) por módulos MOSFET IRF520 (um único pino PWM por motor) reduziu a demanda de E/S de doze para quatro pinos de controle. Como os motores DC 3–6 V operam em sentido único, a ponte H completa do L298N era desnecessária; ademais, a queda de tensão interna de aproximadamente 2 V no L298N degradava substancialmente o torque em baixa tensão, problema totalmente eliminado pela condução por efeito de campo do MOSFET. A esteira principal foi configurada com ligação direta à alimentação CC, simplificando o controle. Essa racionalização viabilizou o uso do Arduino Uno em substituição ao Mega, barateando o protótipo e consolidando a viabilidade econômica do sistema. Em setembro, os módulos IRF520 e as placas de passagem das esteiras B e C foram soldados; a falha de acionamento observada em 29/09 foi diagnosticada como elétrica (módulo IRF520 e motor da esteira C defeituosos, substituídos em 03/10), e provisoriamente a esteira C utiliza o módulo da esteira A.</w:t>
       </w:r>
     </w:p>
     <w:p>
@@ -2326,7 +1896,7 @@
           <w:sz w:val="24"/>
           <w:szCs w:val="24"/>
         </w:rPr>
-        <w:t xml:space="preserve">O formato textual delimitado inicial foi substituído por mensagens JSON estruturadas com chave discriminadora "type" (ex.: {"type":"estoque","pecaA":4,"pecaB":5,"pecaC":5}), desserializadas no ESP32 via biblioteca ArduinoJson. No firmware do Uno, a rotina de leitura bloqueante Serial.readStringUntil() foi substituída por um acumulador serial orientado a quebras de linha (\n), eliminando congelamentos da máquina de estados. O firmware incorporou ainda o tratamento robusto por prefixo (startsWith) para o comando CMD:RESET e o envio padronizado de rejeições explícitas (peca_invalida, ocupado, comando_desconhecido).</w:t>
+        <w:t xml:space="preserve">O formato textual delimitado inicial foi substituído por mensagens JSON estruturadas com chave discriminadora "type" (ex.: {"type":"estoque","pecaA":15,"pecaB":15,"pecaC":15}), desserializadas no ESP32 via biblioteca ArduinoJson. No firmware do Uno, a rotina de leitura bloqueante Serial.readStringUntil() foi substituída por um acumulador serial orientado a quebras de linha (\n), eliminando congelamentos da máquina de estados. O firmware incorporou ainda o tratamento de comandos em formato exato (CMD:PECA:A/B/C e CMD:RESET) e o envio padronizado de rejeições explícitas (peca_invalida, ocupado, comando_desconhecido). Na versão 3.0, o Uno passou a montar o JSON diretamente, sem a biblioteca, para economizar RAM, mantendo as mensagens idênticas byte a byte às da versão anterior (verificado por testes de contrato) e acrescentando apenas campos opcionais.</w:t>
       </w:r>
     </w:p>
     <w:p>
@@ -2348,16 +1918,16 @@
           <w:sz w:val="24"/>
           <w:szCs w:val="24"/>
         </w:rPr>
-        <w:t xml:space="preserve">e) Calibração temporal da FSM e controle de transição de peças: </w:t>
-      </w:r>
-      <w:r>
-        <w:rPr>
-          <w:rFonts w:ascii="Arial" w:hAnsi="Arial" w:cs="Arial"/>
-          <w:color w:val="000000" w:themeColor="text1"/>
-          <w:sz w:val="24"/>
-          <w:szCs w:val="24"/>
-        </w:rPr>
-        <w:t xml:space="preserve">A temporização crítica da máquina de estados foi recalibrada experimentalmente: o parâmetro TIMEOUT_ENTREGA foi estendido de 3.000 ms para 9.000 ms, acomodando com ampla margem o tempo real de deslocamento físico da peça (~5 s até o sensor). Implementou-se adicionalmente o parâmetro TEMPO_SAIDA_ESTEIRA_MS (3.000 ms não-bloqueante), assegurando que o objeto complete a transição da esteira secundária para a esteira principal antes do retorno ao estado AGUARDANDO_PEDIDO, eliminando falsos positivos de erro por timeout.</w:t>
+        <w:t xml:space="preserve">e) Calibração temporal da FSM e supervisão da entrega por marcos: </w:t>
+      </w:r>
+      <w:r>
+        <w:rPr>
+          <w:rFonts w:ascii="Arial" w:hAnsi="Arial" w:cs="Arial"/>
+          <w:color w:val="000000" w:themeColor="text1"/>
+          <w:sz w:val="24"/>
+          <w:szCs w:val="24"/>
+        </w:rPr>
+        <w:t xml:space="preserve">A temporização da máquina de estados foi recalibrada experimentalmente ao longo do desenvolvimento: o parâmetro TIMEOUT_ENTREGA passou de 3.000 ms para 9.000 ms (28/08), acomodando o tempo real de deslocamento físico da peça (~5 s até o sensor), e depois para 12.500 ms (02/10), passando a vigiar somente o trajeto do topo até a junção; o parâmetro TEMPO_SAIDA_ESTEIRA_MS (3.000 ms, não-bloqueante) assegura que o objeto complete a transição para a esteira principal antes do retorno ao estado AGUARDANDO_PEDIDO. Na versão 3.0 do firmware (03/10), a entrega passou a ser supervisionada por marcos, no padrão de processos de automação produtiva: checagem prévia sem ligar o motor; M1 – topo livre em até 3 s (motor travado é desligado imediatamente); M2 – passagem na junção, com pulso mínimo de 20 ms, em até 12,5 s desde a partida, quando o estoque é debitado; e M3 – junção livre após 3 s de saída. Cada falha gera um erro com fase e tempo (sem_peca_topo, juncao_obstruida, motor_sem_avanco, timeout e peca_presa_saida), e nenhuma peça é debitada sem a confirmação do sensor.</w:t>
       </w:r>
     </w:p>
     <w:p>
@@ -2419,7 +1989,7 @@
           <w:sz w:val="24"/>
           <w:szCs w:val="24"/>
         </w:rPr>
-        <w:t xml:space="preserve">O microcontrolador ESP32 opera como gateway bidirecional de alta disponibilidade: na direção ascendente, converte os pacotes seriais do Uno em publicações MQTT; na direção descendente, traduz comandos do tópico dataflow/comandos/sub em diretivas textuais (CMD:PECA:A, CMD:RESET). O módulo registra perante o broker MQTT uma mensagem LWT com QoS 1 e retenção em dataflow/status, permitindo que a aplicação web e os operadores identifiquem instantaneamente a queda de energia ou falha de conectividade do gateway físico (OASIS, 2019).</w:t>
+        <w:t xml:space="preserve">O microcontrolador ESP32 opera como gateway bidirecional de alta disponibilidade: na direção ascendente, converte os pacotes seriais do Uno em publicações MQTT; na direção descendente, traduz comandos do tópico dataflow/comandos/sub em diretivas textuais (CMD:PECA:A, CMD:RESET). O módulo registra perante o broker MQTT uma mensagem LWT com QoS 1 e retenção em dataflow/status, permitindo que a aplicação web e os operadores identifiquem instantaneamente a queda de energia ou falha de conectividade do gateway físico (OASIS, 2019). A reconexão Wi-Fi é não-bloqueante, as credenciais de rede ficam fora do código-fonte (arquivo secrets.h não versionado) e o buffer de recepção serial foi ampliado para 2.048 bytes, evitando a perda de mensagens do Uno durante reconexões MQTT/TLS.</w:t>
       </w:r>
     </w:p>
     <w:p>
@@ -2481,7 +2051,7 @@
           <w:sz w:val="24"/>
           <w:szCs w:val="24"/>
         </w:rPr>
-        <w:t xml:space="preserve">Em substituição a ferramentas genéricas como Node-RED ou plataformas em nuvem proprietárias (Ubidots), desenvolveu-se um servidor web em Node.js (Express, Socket.IO e MQTT.js) que estabelece um túnel de baixa latência entre o broker MQTT e navegadores clientes (FETTE; MELNIKOV, 2011). O backend integra controle de taxa (rate limiting de 500 ms por cliente contra requisições abusivas), endpoint RESTful de telemetria e diagnóstico operacional (/api/status) e desligamento gracioso (graceful shutdown).</w:t>
+        <w:t xml:space="preserve">Em substituição a ferramentas genéricas como Node-RED ou plataformas em nuvem proprietárias (Ubidots), desenvolveu-se um servidor web em Node.js (Express, Socket.IO e MQTT.js) que estabelece um túnel de baixa latência entre o broker MQTT e navegadores clientes (FETTE; MELNIKOV, 2011). O backend integra segurança (helmet com política CSP, CORS restrito e validação de entrada dos comandos), controle de taxa (rate limiting de 500 ms por cliente contra requisições abusivas), endpoint RESTful de telemetria e diagnóstico operacional (/api/status, que responde HTTP 503 quando o broker está indisponível) e desligamento gracioso (graceful shutdown). O dashboard adota um painel anunciador com as cores de sinalização da norma IEC 60073, alertas graduados de estoque e uma vista 3D da bancada.</w:t>
       </w:r>
     </w:p>
     <w:p>
@@ -2512,7 +2082,7 @@
           <w:sz w:val="24"/>
           <w:szCs w:val="24"/>
         </w:rPr>
-        <w:t xml:space="preserve">O ecossistema oferece suporte dual: broker local Eclipse Mosquitto (LIGHT, 2017) na porta 1883 (com escuta listener 1883 0.0.0.0 e liberação correspondente no firewall) para desenvolvimento e testes de bancada em rede local; e broker em nuvem HiveMQ Cloud na porta 8883 com TLS e credenciais criptografadas para produção. A estratégia Local-First permitiu estabilizar integralmente a lógica determinística da FSM e a integridade de mensagens antes de submeter o sistema a variáveis de latência e instabilidade de redes externas.</w:t>
+        <w:t xml:space="preserve">O ecossistema oferece suporte dual: broker local Eclipse Mosquitto (LIGHT, 2017) na porta 1883 (com escuta listener 1883 0.0.0.0 e liberação correspondente no firewall) para desenvolvimento e testes de bancada em rede local; e broker em nuvem HiveMQ Cloud na porta 8883 com TLS e credenciais para produção. A estratégia Local-First permitiu estabilizar integralmente a lógica determinística da FSM e a integridade de mensagens antes de submeter o sistema a variáveis de latência e instabilidade de redes externas. O broker local foi validado em bancada; o HiveMQ Cloud está parcialmente validado: cluster e firmware com TLS em 02/09, conexão pelas redes Beckhoff_Guest e hotspot 4G em 28/09 e fluxo completo com o historiador CX9240 homologado em 19/09, restando a validação remota ponta a ponta pelo dashboard.</w:t>
       </w:r>
     </w:p>
     <w:p>
@@ -2574,7 +2144,7 @@
           <w:sz w:val="24"/>
           <w:szCs w:val="24"/>
         </w:rPr>
-        <w:t xml:space="preserve">Foi desenvolvido um simulador em JavaScript que replica de maneira fidedigna a máquina de estados do microcontrolador e a dinâmica temporal dos sensores e atuadores, alimentando o dashboard sem exigir hardware físico ou broker ativo. A ferramenta permitiu o avanço paralelo no desenvolvimento do front-end e dos fluxos lógicos de negócio.</w:t>
+        <w:t xml:space="preserve">Foi desenvolvido um simulador em JavaScript que replica de maneira fidedigna a máquina de estados do microcontrolador e a dinâmica temporal dos sensores e atuadores, alimentando o dashboard sem exigir hardware físico ou broker ativo. A ferramenta permitiu o avanço paralelo no desenvolvimento do front-end e dos fluxos lógicos de negócio; aceita estoque inicial configurável e, opcionalmente, publica o estoque no broker MQTT, o que permitiu validar o historiador do CX9240 sem a bancada.</w:t>
       </w:r>
     </w:p>
     <w:p>
@@ -2605,7 +2175,7 @@
           <w:sz w:val="24"/>
           <w:szCs w:val="24"/>
         </w:rPr>
-        <w:t xml:space="preserve">O roteiro experimental foi estruturado em suítes progressivas: blocos de componentes isolados (B0.1 a B0.3), blocos de bancada integrada (B1 a B3) e cadeia de integração de ponta a ponta (Testes 1 a 6). Criou-se a sonda de telemetria mqtt_probe em Node.js para registro de mensagens com timestamp em dataflow/#, constituindo a base comprobatória de tempo de resposta e confiabilidade dos testes de bancada.</w:t>
+        <w:t xml:space="preserve">O roteiro experimental foi estruturado em suítes progressivas: blocos de componentes isolados (B0.1 a B0.3), blocos de bancada integrada (B1 a B3) e cadeia de integração de ponta a ponta (Testes 1 a 6), seguidos, a partir de agosto, de roteiros semanais de bancada com portões de aprovação por bloco. Criou-se a sonda de telemetria mqtt_probe em Node.js para registro de mensagens com timestamp em dataflow/#, constituindo a base comprobatória de tempo de resposta e confiabilidade dos testes de bancada. Somam-se os testes automatizados: 43 testes da lógica do firmware executados no computador, testes do servidor e das métricas e testes ponta a ponta do dashboard com Playwright.</w:t>
       </w:r>
     </w:p>
     <w:p>
@@ -2627,16 +2197,16 @@
           <w:sz w:val="24"/>
           <w:szCs w:val="24"/>
         </w:rPr>
-        <w:t xml:space="preserve">n) Trabalhos correlatos não acadêmicos: </w:t>
-      </w:r>
-      <w:r>
-        <w:rPr>
-          <w:rFonts w:ascii="Arial" w:hAnsi="Arial" w:cs="Arial"/>
-          <w:color w:val="000000" w:themeColor="text1"/>
-          <w:sz w:val="24"/>
-          <w:szCs w:val="24"/>
-        </w:rPr>
-        <w:t xml:space="preserve">O levantamento de projetos correlatos em repositórios abertos revelou implementações restritas a acionamentos simples de esteiras com sensores. A combinação sinérgica de FSM determinística com recuperação por reset, gateway MQTT com LWT retido, servidor WebSocket dedicado e simulador offline desacoplado estabelece a inovação e o rigor de engenharia deste projeto frente às soluções informais existentes.</w:t>
+        <w:t xml:space="preserve">n) Robustez do firmware (versão 3.0): </w:t>
+      </w:r>
+      <w:r>
+        <w:rPr>
+          <w:rFonts w:ascii="Arial" w:hAnsi="Arial" w:cs="Arial"/>
+          <w:color w:val="000000" w:themeColor="text1"/>
+          <w:sz w:val="24"/>
+          <w:szCs w:val="24"/>
+        </w:rPr>
+        <w:t xml:space="preserve">O firmware ganhou watchdog de 2 s, que desliga os motores antes do reinício; informa no boot a causa do último reset (energia, reinício, watchdog ou brownout); trata o LCD como opcional, procurando-o nos endereços 0x27 e 0x3F e desligando-o se o barramento I2C travar, em vez de travar o controlador; limita rajadas de interrupção de sensores oscilando no limiar; e grava os textos na memória flash, reduzindo o uso de RAM global de 55% para 46%. A versão anterior (2.x) permanece no histórico do repositório para retorno, e a validação da versão 3.0 em bancada, da esteira A até as três esteiras, é o objetivo da Semana 8 (05 a 09/10).</w:t>
       </w:r>
     </w:p>
     <w:p>
@@ -2658,6 +2228,254 @@
           <w:sz w:val="24"/>
           <w:szCs w:val="24"/>
         </w:rPr>
+        <w:t xml:space="preserve">o) Estoque inicial e velocidade por esteira: </w:t>
+      </w:r>
+      <w:r>
+        <w:rPr>
+          <w:rFonts w:ascii="Arial" w:hAnsi="Arial" w:cs="Arial"/>
+          <w:color w:val="000000" w:themeColor="text1"/>
+          <w:sz w:val="24"/>
+          <w:szCs w:val="24"/>
+        </w:rPr>
+        <w:t xml:space="preserve">O estoque inicial passou de 5 para 15 peças por tipo, permitindo mais rodadas de teste sem reiniciar o sistema, e cada esteira secundária recebeu parâmetros próprios de partida e velocidade (PWM de regime 200, mínimo de ~150 para mover a esteira com peça), calibrados em bancada após a troca do motor da esteira C.</w:t>
+      </w:r>
+    </w:p>
+    <w:p>
+      <w:pPr>
+        <w:spacing w:line="360" w:lineRule="auto"/>
+        <w:jc w:val="both"/>
+        <w:rPr>
+          <w:rFonts w:ascii="Arial" w:hAnsi="Arial" w:cs="Arial"/>
+          <w:color w:val="000000" w:themeColor="text1"/>
+          <w:sz w:val="24"/>
+          <w:szCs w:val="24"/>
+        </w:rPr>
+      </w:pPr>
+      <w:r>
+        <w:rPr>
+          <w:rFonts w:ascii="Arial" w:hAnsi="Arial" w:cs="Arial"/>
+          <w:b/>
+          <w:color w:val="000000" w:themeColor="text1"/>
+          <w:sz w:val="24"/>
+          <w:szCs w:val="24"/>
+        </w:rPr>
+        <w:t xml:space="preserve">p) Persistência em PC industrial (Beckhoff CX9240): </w:t>
+      </w:r>
+      <w:r>
+        <w:rPr>
+          <w:rFonts w:ascii="Arial" w:hAnsi="Arial" w:cs="Arial"/>
+          <w:color w:val="000000" w:themeColor="text1"/>
+          <w:sz w:val="24"/>
+          <w:szCs w:val="24"/>
+        </w:rPr>
+        <w:t xml:space="preserve">O objetivo de implementar uma arquitetura de banco de dados foi atendido por um historiador no PC industrial Beckhoff CX9240 (TwinCAT 3 em RT Linux ARM64), que assina os tópicos dataflow/estoque e dataflow/eventos via TF6701 IoT Communication e grava as tabelas estoque_hist e eventos_hist em banco SQLite local (modo WAL) via TF6420 Database Server. A persistência foi validada em 15/09 com o simulador e homologada em 19/09 com o sistema físico através do HiveMQ Cloud; falta confirmar o contrato de eventos com o firmware real.</w:t>
+      </w:r>
+    </w:p>
+    <w:p>
+      <w:pPr>
+        <w:spacing w:line="360" w:lineRule="auto"/>
+        <w:jc w:val="both"/>
+        <w:rPr>
+          <w:rFonts w:ascii="Arial" w:hAnsi="Arial" w:cs="Arial"/>
+          <w:color w:val="000000" w:themeColor="text1"/>
+          <w:sz w:val="24"/>
+          <w:szCs w:val="24"/>
+        </w:rPr>
+      </w:pPr>
+      <w:r>
+        <w:rPr>
+          <w:rFonts w:ascii="Arial" w:hAnsi="Arial" w:cs="Arial"/>
+          <w:b/>
+          <w:color w:val="000000" w:themeColor="text1"/>
+          <w:sz w:val="24"/>
+          <w:szCs w:val="24"/>
+        </w:rPr>
+        <w:t xml:space="preserve">q) Telemetria histórica de desempenho (Prometheus e Grafana): </w:t>
+      </w:r>
+      <w:r>
+        <w:rPr>
+          <w:rFonts w:ascii="Arial" w:hAnsi="Arial" w:cs="Arial"/>
+          <w:color w:val="000000" w:themeColor="text1"/>
+          <w:sz w:val="24"/>
+          <w:szCs w:val="24"/>
+        </w:rPr>
+        <w:t xml:space="preserve">O servidor expõe 17 métricas próprias (dfi_*), como latência de publicação e de confirmação dos comandos, tempo de resposta da API, vazão de mensagens, reconexões, quedas do gateway, estoque e estado das esteiras, coletadas pelo Prometheus e apresentadas em três dashboards Grafana (Visão Geral, Performance e Confiabilidade), validados em 01/10. Essa telemetria complementa o historiador do CX9240, que guarda os dados de negócio.</w:t>
+      </w:r>
+    </w:p>
+    <w:p>
+      <w:pPr>
+        <w:spacing w:line="360" w:lineRule="auto"/>
+        <w:jc w:val="both"/>
+        <w:rPr>
+          <w:rFonts w:ascii="Arial" w:hAnsi="Arial" w:cs="Arial"/>
+          <w:color w:val="000000" w:themeColor="text1"/>
+          <w:sz w:val="24"/>
+          <w:szCs w:val="24"/>
+        </w:rPr>
+      </w:pPr>
+      <w:r>
+        <w:rPr>
+          <w:rFonts w:ascii="Arial" w:hAnsi="Arial" w:cs="Arial"/>
+          <w:b/>
+          <w:color w:val="000000" w:themeColor="text1"/>
+          <w:sz w:val="24"/>
+          <w:szCs w:val="24"/>
+        </w:rPr>
+        <w:t xml:space="preserve">r) Integração contínua e automação: </w:t>
+      </w:r>
+      <w:r>
+        <w:rPr>
+          <w:rFonts w:ascii="Arial" w:hAnsi="Arial" w:cs="Arial"/>
+          <w:color w:val="000000" w:themeColor="text1"/>
+          <w:sz w:val="24"/>
+          <w:szCs w:val="24"/>
+        </w:rPr>
+        <w:t xml:space="preserve">Um pipeline no GitHub Actions executa a cada alteração a análise estática do JavaScript, a detecção de credenciais, a auditoria de dependências, a compilação dos sketches do Uno e do ESP32 (com limite de 65% de RAM no Uno) e os testes automatizados do firmware, do servidor e do dashboard. Scripts multiplataforma (Linux e Windows) automatizam a instalação, a validação de segredos e as verificações anteriores a cada commit.</w:t>
+      </w:r>
+    </w:p>
+    <w:p>
+      <w:pPr>
+        <w:spacing w:line="360" w:lineRule="auto"/>
+        <w:jc w:val="both"/>
+        <w:rPr>
+          <w:rFonts w:ascii="Arial" w:hAnsi="Arial" w:cs="Arial"/>
+          <w:color w:val="000000" w:themeColor="text1"/>
+          <w:sz w:val="24"/>
+          <w:szCs w:val="24"/>
+        </w:rPr>
+      </w:pPr>
+      <w:r>
+        <w:rPr>
+          <w:rFonts w:ascii="Arial" w:hAnsi="Arial" w:cs="Arial"/>
+          <w:b/>
+          <w:color w:val="000000" w:themeColor="text1"/>
+          <w:sz w:val="24"/>
+          <w:szCs w:val="24"/>
+        </w:rPr>
+        <w:t xml:space="preserve">s) Montagem mecânica e diagrama elétrico consolidado: </w:t>
+      </w:r>
+      <w:r>
+        <w:rPr>
+          <w:rFonts w:ascii="Arial" w:hAnsi="Arial" w:cs="Arial"/>
+          <w:color w:val="000000" w:themeColor="text1"/>
+          <w:sz w:val="24"/>
+          <w:szCs w:val="24"/>
+        </w:rPr>
+        <w:t xml:space="preserve">As esteiras foram fixadas em uma base de MDF de aproximadamente 60 × 40 cm, a costura das correias foi desbastada para eliminar um ponto de atrito com a estrutura e o diagrama elétrico consolidado (Figura 2) foi publicado em 23/09, cobrindo o Arduino Uno, o ESP32 com o divisor de tensão, os drivers IRF520, os sensores com as placas de passagem e as fontes.</w:t>
+      </w:r>
+    </w:p>
+    <w:p>
+      <w:pPr>
+        <w:spacing w:line="360" w:lineRule="auto"/>
+        <w:jc w:val="both"/>
+        <w:rPr>
+          <w:rFonts w:ascii="Arial" w:hAnsi="Arial" w:cs="Arial"/>
+          <w:color w:val="000000" w:themeColor="text1"/>
+          <w:sz w:val="24"/>
+          <w:szCs w:val="24"/>
+        </w:rPr>
+      </w:pPr>
+      <w:r>
+        <w:rPr>
+          <w:rFonts w:ascii="Arial" w:hAnsi="Arial" w:cs="Arial"/>
+          <w:b/>
+          <w:color w:val="000000" w:themeColor="text1"/>
+          <w:sz w:val="24"/>
+          <w:szCs w:val="24"/>
+        </w:rPr>
+        <w:t xml:space="preserve">t) Roda de separação (em integração): </w:t>
+      </w:r>
+      <w:r>
+        <w:rPr>
+          <w:rFonts w:ascii="Arial" w:hAnsi="Arial" w:cs="Arial"/>
+          <w:color w:val="000000" w:themeColor="text1"/>
+          <w:sz w:val="24"/>
+          <w:szCs w:val="24"/>
+        </w:rPr>
+        <w:t xml:space="preserve">A roda giratória de três compartimentos no fim da esteira principal, prevista na concepção, será acionada por um motor de passo 28BYJ-48 com driver ULN2003 (pinos 5 a 8), como nova etapa após a entrega. O rascunho de código existe apenas na versão 2.x do firmware; a mecânica e a integração estão planejadas para a Semana 8.</w:t>
+      </w:r>
+    </w:p>
+    <w:p>
+      <w:pPr>
+        <w:spacing w:line="360" w:lineRule="auto"/>
+        <w:jc w:val="both"/>
+        <w:rPr>
+          <w:rFonts w:ascii="Arial" w:hAnsi="Arial" w:cs="Arial"/>
+          <w:color w:val="000000" w:themeColor="text1"/>
+          <w:sz w:val="24"/>
+          <w:szCs w:val="24"/>
+        </w:rPr>
+      </w:pPr>
+      <w:r>
+        <w:rPr>
+          <w:rFonts w:ascii="Arial" w:hAnsi="Arial" w:cs="Arial"/>
+          <w:b/>
+          <w:color w:val="000000" w:themeColor="text1"/>
+          <w:sz w:val="24"/>
+          <w:szCs w:val="24"/>
+        </w:rPr>
+        <w:t xml:space="preserve">u) Documentação, implantação e divulgação: </w:t>
+      </w:r>
+      <w:r>
+        <w:rPr>
+          <w:rFonts w:ascii="Arial" w:hAnsi="Arial" w:cs="Arial"/>
+          <w:color w:val="000000" w:themeColor="text1"/>
+          <w:sz w:val="24"/>
+          <w:szCs w:val="24"/>
+        </w:rPr>
+        <w:t xml:space="preserve">Além do plano de testes e dos roteiros semanais, o repositório reúne a arquitetura consolidada, um guia de implantação (cenários com e sem hardware, ainda não executado em máquina limpa), um guia de integração com o CX9240 e com o separador, o registro de mudanças, arquivos de comunidade (contribuição, conduta e segurança) e uma página de apresentação do projeto (https://matheusnespolo.github.io/dataflow-inventory-site/).</w:t>
+      </w:r>
+    </w:p>
+    <w:p>
+      <w:pPr>
+        <w:spacing w:line="360" w:lineRule="auto"/>
+        <w:jc w:val="both"/>
+        <w:rPr>
+          <w:rFonts w:ascii="Arial" w:hAnsi="Arial" w:cs="Arial"/>
+          <w:color w:val="000000" w:themeColor="text1"/>
+          <w:sz w:val="24"/>
+          <w:szCs w:val="24"/>
+        </w:rPr>
+      </w:pPr>
+      <w:r>
+        <w:rPr>
+          <w:rFonts w:ascii="Arial" w:hAnsi="Arial" w:cs="Arial"/>
+          <w:b/>
+          <w:color w:val="000000" w:themeColor="text1"/>
+          <w:sz w:val="24"/>
+          <w:szCs w:val="24"/>
+        </w:rPr>
+        <w:t xml:space="preserve">v) Trabalhos correlatos não acadêmicos: </w:t>
+      </w:r>
+      <w:r>
+        <w:rPr>
+          <w:rFonts w:ascii="Arial" w:hAnsi="Arial" w:cs="Arial"/>
+          <w:color w:val="000000" w:themeColor="text1"/>
+          <w:sz w:val="24"/>
+          <w:szCs w:val="24"/>
+        </w:rPr>
+        <w:t xml:space="preserve">O levantamento de projetos correlatos em repositórios abertos revelou implementações restritas a acionamentos simples de esteiras com sensores. A combinação sinérgica de FSM determinística com supervisão por marcos e recuperação por reset, gateway MQTT com LWT retido, servidor WebSocket dedicado, simulador offline desacoplado, persistência em PC industrial, telemetria histórica e testes automatizados com integração contínua estabelece a inovação e o rigor de engenharia deste projeto frente às soluções informais existentes.</w:t>
+      </w:r>
+    </w:p>
+    <w:p>
+      <w:pPr>
+        <w:spacing w:line="360" w:lineRule="auto"/>
+        <w:jc w:val="both"/>
+        <w:rPr>
+          <w:rFonts w:ascii="Arial" w:hAnsi="Arial" w:cs="Arial"/>
+          <w:color w:val="000000" w:themeColor="text1"/>
+          <w:sz w:val="24"/>
+          <w:szCs w:val="24"/>
+        </w:rPr>
+      </w:pPr>
+      <w:r>
+        <w:rPr>
+          <w:rFonts w:ascii="Arial" w:hAnsi="Arial" w:cs="Arial"/>
+          <w:b/>
+          <w:color w:val="000000" w:themeColor="text1"/>
+          <w:sz w:val="24"/>
+          <w:szCs w:val="24"/>
+        </w:rPr>
         <w:t xml:space="preserve">Tabela 1 – Síntese das Decisões de Engenharia e Atualizações de Implementação. </w:t>
       </w:r>
       <w:r>
@@ -2667,7 +2485,7 @@
           <w:sz w:val="24"/>
           <w:szCs w:val="24"/>
         </w:rPr>
-        <w:t xml:space="preserve">A Tabela 1 sintetiza as treze decisões de engenharia adotadas ao longo do ciclo de desenvolvimento, classificadas por ordem de relevância e camada de impacto arquitetural (física e infraestrutura, mensageria e telemetria, firmware e controle em tempo real, metodologia e observabilidade), confrontando a concepção inicial com a solução definitiva implementada.</w:t>
+        <w:t xml:space="preserve">A Tabela 1 sintetiza as vinte decisões de engenharia adotadas ao longo do ciclo de desenvolvimento, classificadas por ordem de relevância e camada de impacto arquitetural (física e infraestrutura, mensageria e telemetria, firmware e controle em tempo real, metodologia e observabilidade), confrontando a concepção inicial com a solução definitiva implementada.</w:t>
       </w:r>
     </w:p>
     <w:tbl>
@@ -2961,7 +2779,7 @@
                 <w:sz w:val="18"/>
                 <w:szCs w:val="18"/>
               </w:rPr>
-              <w:t xml:space="preserve">Redução drástica de pinos de E/S, eliminação de queda de tensão crítica (2 V em motores 5 V), menor custo.</w:t>
+              <w:t xml:space="preserve">Redução drástica de pinos de E/S, eliminação de queda de tensão crítica (2 V em motores 5 V), menor custo. Módulo e motor da esteira C substituídos após falha elétrica (03/10).</w:t>
             </w:r>
           </w:p>
         </w:tc>
@@ -3379,7 +3197,7 @@
                 <w:sz w:val="18"/>
                 <w:szCs w:val="18"/>
               </w:rPr>
-              <w:t xml:space="preserve">2. Protocolo de Mensageria e Telemetria</w:t>
+              <w:t xml:space="preserve">1. Camada Física e Infraestrutura</w:t>
             </w:r>
           </w:p>
         </w:tc>
@@ -3405,7 +3223,7 @@
                 <w:sz w:val="18"/>
                 <w:szCs w:val="18"/>
               </w:rPr>
-              <w:t xml:space="preserve">Formato da Mensagem Serial</w:t>
+              <w:t xml:space="preserve">Separação Final (Roda Giratória)</w:t>
             </w:r>
           </w:p>
         </w:tc>
@@ -3429,7 +3247,7 @@
                 <w:sz w:val="18"/>
                 <w:szCs w:val="18"/>
               </w:rPr>
-              <w:t xml:space="preserve">Texto delimitado não padronizado (MQTT|tipo:A|...)</w:t>
+              <w:t xml:space="preserve">Roda de 3 compartimentos no fim da esteira principal</w:t>
             </w:r>
           </w:p>
         </w:tc>
@@ -3453,7 +3271,7 @@
                 <w:sz w:val="18"/>
                 <w:szCs w:val="18"/>
               </w:rPr>
-              <w:t xml:space="preserve">JSON estruturado com discriminador "type" via ArduinoJson</w:t>
+              <w:t xml:space="preserve">Motor de passo 28BYJ-48 + ULN2003 (pinos 5 a 8), integração em andamento</w:t>
             </w:r>
           </w:p>
         </w:tc>
@@ -3477,7 +3295,7 @@
                 <w:sz w:val="18"/>
                 <w:szCs w:val="18"/>
               </w:rPr>
-              <w:t xml:space="preserve">Parsing robusto e extensível com roteamento direto para a árvore de tópicos dataflow/#.</w:t>
+              <w:t xml:space="preserve">Pinos 5 a 8 reservados no firmware; depende da conclusão da mecânica (Semana 8).</w:t>
             </w:r>
           </w:p>
         </w:tc>
@@ -3508,7 +3326,7 @@
                 <w:sz w:val="18"/>
                 <w:szCs w:val="18"/>
               </w:rPr>
-              <w:t xml:space="preserve">2. Protocolo de Mensageria e Telemetria</w:t>
+              <w:t xml:space="preserve">1. Camada Física e Infraestrutura</w:t>
             </w:r>
           </w:p>
         </w:tc>
@@ -3534,7 +3352,7 @@
                 <w:sz w:val="18"/>
                 <w:szCs w:val="18"/>
               </w:rPr>
-              <w:t xml:space="preserve">Isolamento de Tópicos de Status</w:t>
+              <w:t xml:space="preserve">Montagem e Diagrama Elétrico</w:t>
             </w:r>
           </w:p>
         </w:tc>
@@ -3558,7 +3376,7 @@
                 <w:sz w:val="18"/>
                 <w:szCs w:val="18"/>
               </w:rPr>
-              <w:t xml:space="preserve">ESP32 e servidor Node.js publicavam no mesmo tópico dataflow/status</w:t>
+              <w:t xml:space="preserve">Esteiras e módulos ligados por jumpers, sem esquema consolidado</w:t>
             </w:r>
           </w:p>
         </w:tc>
@@ -3582,7 +3400,7 @@
                 <w:sz w:val="18"/>
                 <w:szCs w:val="18"/>
               </w:rPr>
-              <w:t xml:space="preserve">ESP32 em dataflow/status; Servidor em dataflow/status/server</w:t>
+              <w:t xml:space="preserve">Base de MDF (~60 × 40 cm), placas de passagem soldadas e diagrama elétrico publicado (23/09)</w:t>
             </w:r>
           </w:p>
         </w:tc>
@@ -3606,7 +3424,7 @@
                 <w:sz w:val="18"/>
                 <w:szCs w:val="18"/>
               </w:rPr>
-              <w:t xml:space="preserve">Elimina colisão de mensagens retidas (retained) e falsos alertas de gateway desconectado.</w:t>
+              <w:t xml:space="preserve">Rigidez mecânica, menos mau contato e documentação para manutenção e replicação.</w:t>
             </w:r>
           </w:p>
         </w:tc>
@@ -3663,7 +3481,7 @@
                 <w:sz w:val="18"/>
                 <w:szCs w:val="18"/>
               </w:rPr>
-              <w:t xml:space="preserve">Supervisão e Queda de Hardware (LWT)</w:t>
+              <w:t xml:space="preserve">Formato da Mensagem Serial</w:t>
             </w:r>
           </w:p>
         </w:tc>
@@ -3687,7 +3505,7 @@
                 <w:sz w:val="18"/>
                 <w:szCs w:val="18"/>
               </w:rPr>
-              <w:t xml:space="preserve">Sem monitoramento de desconexão abrupta do gateway</w:t>
+              <w:t xml:space="preserve">Texto delimitado não padronizado (MQTT|tipo:A|...)</w:t>
             </w:r>
           </w:p>
         </w:tc>
@@ -3711,7 +3529,7 @@
                 <w:sz w:val="18"/>
                 <w:szCs w:val="18"/>
               </w:rPr>
-              <w:t xml:space="preserve">Mensagem LWT com QoS 1 e flag Retain em dataflow/status no ESP32</w:t>
+              <w:t xml:space="preserve">JSON estruturado com discriminador "type"; ArduinoJson no ESP32 e montagem direta no Uno (v3.0)</w:t>
             </w:r>
           </w:p>
         </w:tc>
@@ -3735,7 +3553,7 @@
                 <w:sz w:val="18"/>
                 <w:szCs w:val="18"/>
               </w:rPr>
-              <w:t xml:space="preserve">Notificação imediata ao broker e dashboard caso o ESP32 perca alimentação ou conexão Wi-Fi.</w:t>
+              <w:t xml:space="preserve">Parsing robusto e extensível com roteamento direto para a árvore de tópicos dataflow/#.</w:t>
             </w:r>
           </w:p>
         </w:tc>
@@ -3792,7 +3610,7 @@
                 <w:sz w:val="18"/>
                 <w:szCs w:val="18"/>
               </w:rPr>
-              <w:t xml:space="preserve">Sincronismo de Estoque Inicial</w:t>
+              <w:t xml:space="preserve">Isolamento de Tópicos de Status</w:t>
             </w:r>
           </w:p>
         </w:tc>
@@ -3816,7 +3634,7 @@
                 <w:sz w:val="18"/>
                 <w:szCs w:val="18"/>
               </w:rPr>
-              <w:t xml:space="preserve">Publicação de estoque apenas após conclusão de eventos de entrega</w:t>
+              <w:t xml:space="preserve">ESP32 e servidor Node.js publicavam no mesmo tópico dataflow/status</w:t>
             </w:r>
           </w:p>
         </w:tc>
@@ -3840,7 +3658,7 @@
                 <w:sz w:val="18"/>
                 <w:szCs w:val="18"/>
               </w:rPr>
-              <w:t xml:space="preserve">Publicação Retained em dataflow/estoque no setup() e no CMD:RESET</w:t>
+              <w:t xml:space="preserve">ESP32 em dataflow/status; Servidor em dataflow/status/server</w:t>
             </w:r>
           </w:p>
         </w:tc>
@@ -3864,7 +3682,7 @@
                 <w:sz w:val="18"/>
                 <w:szCs w:val="18"/>
               </w:rPr>
-              <w:t xml:space="preserve">Consistência de estado instantânea para clientes web em cold-start e paridade com display LCD.</w:t>
+              <w:t xml:space="preserve">Elimina colisão de mensagens retidas (retained) e falsos alertas de gateway desconectado.</w:t>
             </w:r>
           </w:p>
         </w:tc>
@@ -3895,7 +3713,7 @@
                 <w:sz w:val="18"/>
                 <w:szCs w:val="18"/>
               </w:rPr>
-              <w:t xml:space="preserve">3. Firmware e Controle em Tempo Real</w:t>
+              <w:t xml:space="preserve">2. Protocolo de Mensageria e Telemetria</w:t>
             </w:r>
           </w:p>
         </w:tc>
@@ -3921,7 +3739,7 @@
                 <w:sz w:val="18"/>
                 <w:szCs w:val="18"/>
               </w:rPr>
-              <w:t xml:space="preserve">Temporização da Máquina de Estados</w:t>
+              <w:t xml:space="preserve">Supervisão e Queda de Hardware (LWT)</w:t>
             </w:r>
           </w:p>
         </w:tc>
@@ -3945,7 +3763,7 @@
                 <w:sz w:val="18"/>
                 <w:szCs w:val="18"/>
               </w:rPr>
-              <w:t xml:space="preserve">TIMEOUT_ENTREGA = 3000 ms sem tempo de saída de esteira</w:t>
+              <w:t xml:space="preserve">Sem monitoramento de desconexão abrupta do gateway</w:t>
             </w:r>
           </w:p>
         </w:tc>
@@ -3969,7 +3787,7 @@
                 <w:sz w:val="18"/>
                 <w:szCs w:val="18"/>
               </w:rPr>
-              <w:t xml:space="preserve">TIMEOUT_ENTREGA = 9000 ms + TEMPO_SAIDA_ESTEIRA_MS = 3000 ms (não-bloqueante)</w:t>
+              <w:t xml:space="preserve">Mensagem LWT com QoS 1 e flag Retain em dataflow/status no ESP32</w:t>
             </w:r>
           </w:p>
         </w:tc>
@@ -3993,7 +3811,7 @@
                 <w:sz w:val="18"/>
                 <w:szCs w:val="18"/>
               </w:rPr>
-              <w:t xml:space="preserve">Acomoda o tempo físico real de trânsito da peça (~5 s) e escoamento, eliminando falsos timeouts.</w:t>
+              <w:t xml:space="preserve">Notificação imediata ao broker e dashboard caso o ESP32 perca alimentação ou conexão Wi-Fi.</w:t>
             </w:r>
           </w:p>
         </w:tc>
@@ -4024,7 +3842,7 @@
                 <w:sz w:val="18"/>
                 <w:szCs w:val="18"/>
               </w:rPr>
-              <w:t xml:space="preserve">3. Firmware e Controle em Tempo Real</w:t>
+              <w:t xml:space="preserve">2. Protocolo de Mensageria e Telemetria</w:t>
             </w:r>
           </w:p>
         </w:tc>
@@ -4050,7 +3868,7 @@
                 <w:sz w:val="18"/>
                 <w:szCs w:val="18"/>
               </w:rPr>
-              <w:t xml:space="preserve">Parser de Comandos e Resiliência</w:t>
+              <w:t xml:space="preserve">Sincronismo de Estoque Inicial</w:t>
             </w:r>
           </w:p>
         </w:tc>
@@ -4074,7 +3892,7 @@
                 <w:sz w:val="18"/>
                 <w:szCs w:val="18"/>
               </w:rPr>
-              <w:t xml:space="preserve">Serial.readStringUntil() bloqueante e tratamento estrito</w:t>
+              <w:t xml:space="preserve">Publicação de estoque apenas após conclusão de eventos de entrega</w:t>
             </w:r>
           </w:p>
         </w:tc>
@@ -4098,7 +3916,7 @@
                 <w:sz w:val="18"/>
                 <w:szCs w:val="18"/>
               </w:rPr>
-              <w:t xml:space="preserve">Acumulador não-bloqueante orientado a \n, startsWith para CMD:RESET e rejeições explícitas</w:t>
+              <w:t xml:space="preserve">Publicação Retained em dataflow/estoque no setup() e no CMD:RESET</w:t>
             </w:r>
           </w:p>
         </w:tc>
@@ -4122,7 +3940,7 @@
                 <w:sz w:val="18"/>
                 <w:szCs w:val="18"/>
               </w:rPr>
-              <w:t xml:space="preserve">FSM imune a congelamentos por I/O serial e tratamento determinístico de comandos inválidos ou ocupados.</w:t>
+              <w:t xml:space="preserve">Consistência de estado instantânea para clientes web em cold-start e paridade com display LCD.</w:t>
             </w:r>
           </w:p>
         </w:tc>
@@ -4153,7 +3971,7 @@
                 <w:sz w:val="18"/>
                 <w:szCs w:val="18"/>
               </w:rPr>
-              <w:t xml:space="preserve">3. Firmware e Controle em Tempo Real</w:t>
+              <w:t xml:space="preserve">2. Protocolo de Mensageria e Telemetria</w:t>
             </w:r>
           </w:p>
         </w:tc>
@@ -4179,7 +3997,7 @@
                 <w:sz w:val="18"/>
                 <w:szCs w:val="18"/>
               </w:rPr>
-              <w:t xml:space="preserve">Interface de Operação Local vs Remota</w:t>
+              <w:t xml:space="preserve">Persistência de Dados</w:t>
             </w:r>
           </w:p>
         </w:tc>
@@ -4203,7 +4021,7 @@
                 <w:sz w:val="18"/>
                 <w:szCs w:val="18"/>
               </w:rPr>
-              <w:t xml:space="preserve">4 botões físicos de solicitação montados na bancada do Uno</w:t>
+              <w:t xml:space="preserve">Banco de dados em nuvem a definir (Ubidots)</w:t>
             </w:r>
           </w:p>
         </w:tc>
@@ -4227,7 +4045,7 @@
                 <w:sz w:val="18"/>
                 <w:szCs w:val="18"/>
               </w:rPr>
-              <w:t xml:space="preserve">Botões desabilitados; acionamento centralizado via Dashboard Web</w:t>
+              <w:t xml:space="preserve">Historiador no PC industrial Beckhoff CX9240: TwinCAT 3 (TF6701 + TF6420) com SQLite local</w:t>
             </w:r>
           </w:p>
         </w:tc>
@@ -4251,7 +4069,7 @@
                 <w:sz w:val="18"/>
                 <w:szCs w:val="18"/>
               </w:rPr>
-              <w:t xml:space="preserve">Racionalização de hardware e validação efetiva do paradigma de intralogística IoT remota.</w:t>
+              <w:t xml:space="preserve">Registro histórico de estoque e eventos em ambiente industrial; parcialmente validado (contrato de eventos com o firmware real pendente).</w:t>
             </w:r>
           </w:p>
         </w:tc>
@@ -4282,7 +4100,7 @@
                 <w:sz w:val="18"/>
                 <w:szCs w:val="18"/>
               </w:rPr>
-              <w:t xml:space="preserve">4. Metodologia e Observabilidade</w:t>
+              <w:t xml:space="preserve">3. Firmware e Controle em Tempo Real</w:t>
             </w:r>
           </w:p>
         </w:tc>
@@ -4308,7 +4126,7 @@
                 <w:sz w:val="18"/>
                 <w:szCs w:val="18"/>
               </w:rPr>
-              <w:t xml:space="preserve">Ambiente de Servidor e Visualização</w:t>
+              <w:t xml:space="preserve">Temporização da Máquina de Estados</w:t>
             </w:r>
           </w:p>
         </w:tc>
@@ -4332,7 +4150,7 @@
                 <w:sz w:val="18"/>
                 <w:szCs w:val="18"/>
               </w:rPr>
-              <w:t xml:space="preserve">Node-RED ou plataforma em nuvem proprietária (Ubidots)</w:t>
+              <w:t xml:space="preserve">TIMEOUT_ENTREGA = 3000 ms sem tempo de saída de esteira</w:t>
             </w:r>
           </w:p>
         </w:tc>
@@ -4356,7 +4174,7 @@
                 <w:sz w:val="18"/>
                 <w:szCs w:val="18"/>
               </w:rPr>
-              <w:t xml:space="preserve">Servidor Node.js (Express + Socket.IO + MQTT.js) próprio com rate limiting e endpoint /api/status</w:t>
+              <w:t xml:space="preserve">Supervisão por marcos (v3.0): M1 topo livre em 3 s, M2 junção em 12,5 s (débito na confirmação) e M3 saída de 3 s</w:t>
             </w:r>
           </w:p>
         </w:tc>
@@ -4380,7 +4198,7 @@
                 <w:sz w:val="18"/>
                 <w:szCs w:val="18"/>
               </w:rPr>
-              <w:t xml:space="preserve">Dashboard customizado, baixa latência via WebSocket, telemetria completa e independência de planos pagos.</w:t>
+              <w:t xml:space="preserve">Acomoda o trânsito real da peça, elimina falsos timeouts e informa a fase da falha; nenhuma peça debitada sem passagem confirmada.</w:t>
             </w:r>
           </w:p>
         </w:tc>
@@ -4411,6 +4229,522 @@
                 <w:sz w:val="18"/>
                 <w:szCs w:val="18"/>
               </w:rPr>
+              <w:t xml:space="preserve">3. Firmware e Controle em Tempo Real</w:t>
+            </w:r>
+          </w:p>
+        </w:tc>
+        <w:tc>
+          <w:tcPr>
+            <w:vAlign w:val="center"/>
+          </w:tcPr>
+          <w:p>
+            <w:pPr>
+              <w:spacing w:line="240" w:lineRule="auto" w:before="60" w:after="60"/>
+              <w:jc w:val="left"/>
+              <w:rPr>
+                <w:rFonts w:ascii="Arial" w:hAnsi="Arial" w:cs="Arial"/>
+                <w:b/>
+                <w:sz w:val="18"/>
+                <w:szCs w:val="18"/>
+              </w:rPr>
+            </w:pPr>
+            <w:r>
+              <w:rPr>
+                <w:rFonts w:ascii="Arial" w:hAnsi="Arial" w:cs="Arial"/>
+                <w:b/>
+                <w:sz w:val="18"/>
+                <w:szCs w:val="18"/>
+              </w:rPr>
+              <w:t xml:space="preserve">Parser de Comandos e Resiliência</w:t>
+            </w:r>
+          </w:p>
+        </w:tc>
+        <w:tc>
+          <w:tcPr>
+            <w:vAlign w:val="center"/>
+          </w:tcPr>
+          <w:p>
+            <w:pPr>
+              <w:spacing w:line="240" w:lineRule="auto" w:before="60" w:after="60"/>
+              <w:jc w:val="both"/>
+              <w:rPr>
+                <w:rFonts w:ascii="Arial" w:hAnsi="Arial" w:cs="Arial"/>
+                <w:sz w:val="18"/>
+                <w:szCs w:val="18"/>
+              </w:rPr>
+            </w:pPr>
+            <w:r>
+              <w:rPr>
+                <w:rFonts w:ascii="Arial" w:hAnsi="Arial" w:cs="Arial"/>
+                <w:sz w:val="18"/>
+                <w:szCs w:val="18"/>
+              </w:rPr>
+              <w:t xml:space="preserve">Serial.readStringUntil() bloqueante e tratamento estrito</w:t>
+            </w:r>
+          </w:p>
+        </w:tc>
+        <w:tc>
+          <w:tcPr>
+            <w:vAlign w:val="center"/>
+          </w:tcPr>
+          <w:p>
+            <w:pPr>
+              <w:spacing w:line="240" w:lineRule="auto" w:before="60" w:after="60"/>
+              <w:jc w:val="both"/>
+              <w:rPr>
+                <w:rFonts w:ascii="Arial" w:hAnsi="Arial" w:cs="Arial"/>
+                <w:sz w:val="18"/>
+                <w:szCs w:val="18"/>
+              </w:rPr>
+            </w:pPr>
+            <w:r>
+              <w:rPr>
+                <w:rFonts w:ascii="Arial" w:hAnsi="Arial" w:cs="Arial"/>
+                <w:sz w:val="18"/>
+                <w:szCs w:val="18"/>
+              </w:rPr>
+              <w:t xml:space="preserve">Acumulador não-bloqueante orientado a \n, startsWith para CMD:RESET e rejeições explícitas</w:t>
+            </w:r>
+          </w:p>
+        </w:tc>
+        <w:tc>
+          <w:tcPr>
+            <w:vAlign w:val="center"/>
+          </w:tcPr>
+          <w:p>
+            <w:pPr>
+              <w:spacing w:line="240" w:lineRule="auto" w:before="60" w:after="60"/>
+              <w:jc w:val="both"/>
+              <w:rPr>
+                <w:rFonts w:ascii="Arial" w:hAnsi="Arial" w:cs="Arial"/>
+                <w:sz w:val="18"/>
+                <w:szCs w:val="18"/>
+              </w:rPr>
+            </w:pPr>
+            <w:r>
+              <w:rPr>
+                <w:rFonts w:ascii="Arial" w:hAnsi="Arial" w:cs="Arial"/>
+                <w:sz w:val="18"/>
+                <w:szCs w:val="18"/>
+              </w:rPr>
+              <w:t xml:space="preserve">FSM imune a congelamentos por I/O serial e tratamento determinístico de comandos inválidos ou ocupados.</w:t>
+            </w:r>
+          </w:p>
+        </w:tc>
+      </w:tr>
+      <w:tr>
+        <w:trPr>
+          <w:cantSplit/>
+        </w:trPr>
+        <w:tc>
+          <w:tcPr>
+            <w:vAlign w:val="center"/>
+          </w:tcPr>
+          <w:p>
+            <w:pPr>
+              <w:spacing w:line="240" w:lineRule="auto" w:before="60" w:after="60"/>
+              <w:jc w:val="left"/>
+              <w:rPr>
+                <w:rFonts w:ascii="Arial" w:hAnsi="Arial" w:cs="Arial"/>
+                <w:b/>
+                <w:sz w:val="18"/>
+                <w:szCs w:val="18"/>
+              </w:rPr>
+            </w:pPr>
+            <w:r>
+              <w:rPr>
+                <w:rFonts w:ascii="Arial" w:hAnsi="Arial" w:cs="Arial"/>
+                <w:b/>
+                <w:sz w:val="18"/>
+                <w:szCs w:val="18"/>
+              </w:rPr>
+              <w:t xml:space="preserve">3. Firmware e Controle em Tempo Real</w:t>
+            </w:r>
+          </w:p>
+        </w:tc>
+        <w:tc>
+          <w:tcPr>
+            <w:vAlign w:val="center"/>
+          </w:tcPr>
+          <w:p>
+            <w:pPr>
+              <w:spacing w:line="240" w:lineRule="auto" w:before="60" w:after="60"/>
+              <w:jc w:val="left"/>
+              <w:rPr>
+                <w:rFonts w:ascii="Arial" w:hAnsi="Arial" w:cs="Arial"/>
+                <w:b/>
+                <w:sz w:val="18"/>
+                <w:szCs w:val="18"/>
+              </w:rPr>
+            </w:pPr>
+            <w:r>
+              <w:rPr>
+                <w:rFonts w:ascii="Arial" w:hAnsi="Arial" w:cs="Arial"/>
+                <w:b/>
+                <w:sz w:val="18"/>
+                <w:szCs w:val="18"/>
+              </w:rPr>
+              <w:t xml:space="preserve">Interface de Operação Local vs Remota</w:t>
+            </w:r>
+          </w:p>
+        </w:tc>
+        <w:tc>
+          <w:tcPr>
+            <w:vAlign w:val="center"/>
+          </w:tcPr>
+          <w:p>
+            <w:pPr>
+              <w:spacing w:line="240" w:lineRule="auto" w:before="60" w:after="60"/>
+              <w:jc w:val="both"/>
+              <w:rPr>
+                <w:rFonts w:ascii="Arial" w:hAnsi="Arial" w:cs="Arial"/>
+                <w:sz w:val="18"/>
+                <w:szCs w:val="18"/>
+              </w:rPr>
+            </w:pPr>
+            <w:r>
+              <w:rPr>
+                <w:rFonts w:ascii="Arial" w:hAnsi="Arial" w:cs="Arial"/>
+                <w:sz w:val="18"/>
+                <w:szCs w:val="18"/>
+              </w:rPr>
+              <w:t xml:space="preserve">4 botões físicos de solicitação montados na bancada do Uno</w:t>
+            </w:r>
+          </w:p>
+        </w:tc>
+        <w:tc>
+          <w:tcPr>
+            <w:vAlign w:val="center"/>
+          </w:tcPr>
+          <w:p>
+            <w:pPr>
+              <w:spacing w:line="240" w:lineRule="auto" w:before="60" w:after="60"/>
+              <w:jc w:val="both"/>
+              <w:rPr>
+                <w:rFonts w:ascii="Arial" w:hAnsi="Arial" w:cs="Arial"/>
+                <w:sz w:val="18"/>
+                <w:szCs w:val="18"/>
+              </w:rPr>
+            </w:pPr>
+            <w:r>
+              <w:rPr>
+                <w:rFonts w:ascii="Arial" w:hAnsi="Arial" w:cs="Arial"/>
+                <w:sz w:val="18"/>
+                <w:szCs w:val="18"/>
+              </w:rPr>
+              <w:t xml:space="preserve">Botões desabilitados; acionamento centralizado via Dashboard Web</w:t>
+            </w:r>
+          </w:p>
+        </w:tc>
+        <w:tc>
+          <w:tcPr>
+            <w:vAlign w:val="center"/>
+          </w:tcPr>
+          <w:p>
+            <w:pPr>
+              <w:spacing w:line="240" w:lineRule="auto" w:before="60" w:after="60"/>
+              <w:jc w:val="both"/>
+              <w:rPr>
+                <w:rFonts w:ascii="Arial" w:hAnsi="Arial" w:cs="Arial"/>
+                <w:sz w:val="18"/>
+                <w:szCs w:val="18"/>
+              </w:rPr>
+            </w:pPr>
+            <w:r>
+              <w:rPr>
+                <w:rFonts w:ascii="Arial" w:hAnsi="Arial" w:cs="Arial"/>
+                <w:sz w:val="18"/>
+                <w:szCs w:val="18"/>
+              </w:rPr>
+              <w:t xml:space="preserve">Racionalização de hardware e validação efetiva do paradigma de intralogística IoT remota.</w:t>
+            </w:r>
+          </w:p>
+        </w:tc>
+      </w:tr>
+      <w:tr>
+        <w:trPr>
+          <w:cantSplit/>
+        </w:trPr>
+        <w:tc>
+          <w:tcPr>
+            <w:vAlign w:val="center"/>
+          </w:tcPr>
+          <w:p>
+            <w:pPr>
+              <w:spacing w:line="240" w:lineRule="auto" w:before="60" w:after="60"/>
+              <w:jc w:val="left"/>
+              <w:rPr>
+                <w:rFonts w:ascii="Arial" w:hAnsi="Arial" w:cs="Arial"/>
+                <w:b/>
+                <w:sz w:val="18"/>
+                <w:szCs w:val="18"/>
+              </w:rPr>
+            </w:pPr>
+            <w:r>
+              <w:rPr>
+                <w:rFonts w:ascii="Arial" w:hAnsi="Arial" w:cs="Arial"/>
+                <w:b/>
+                <w:sz w:val="18"/>
+                <w:szCs w:val="18"/>
+              </w:rPr>
+              <w:t xml:space="preserve">3. Firmware e Controle em Tempo Real</w:t>
+            </w:r>
+          </w:p>
+        </w:tc>
+        <w:tc>
+          <w:tcPr>
+            <w:vAlign w:val="center"/>
+          </w:tcPr>
+          <w:p>
+            <w:pPr>
+              <w:spacing w:line="240" w:lineRule="auto" w:before="60" w:after="60"/>
+              <w:jc w:val="left"/>
+              <w:rPr>
+                <w:rFonts w:ascii="Arial" w:hAnsi="Arial" w:cs="Arial"/>
+                <w:b/>
+                <w:sz w:val="18"/>
+                <w:szCs w:val="18"/>
+              </w:rPr>
+            </w:pPr>
+            <w:r>
+              <w:rPr>
+                <w:rFonts w:ascii="Arial" w:hAnsi="Arial" w:cs="Arial"/>
+                <w:b/>
+                <w:sz w:val="18"/>
+                <w:szCs w:val="18"/>
+              </w:rPr>
+              <w:t xml:space="preserve">Robustez do Firmware</w:t>
+            </w:r>
+          </w:p>
+        </w:tc>
+        <w:tc>
+          <w:tcPr>
+            <w:vAlign w:val="center"/>
+          </w:tcPr>
+          <w:p>
+            <w:pPr>
+              <w:spacing w:line="240" w:lineRule="auto" w:before="60" w:after="60"/>
+              <w:jc w:val="both"/>
+              <w:rPr>
+                <w:rFonts w:ascii="Arial" w:hAnsi="Arial" w:cs="Arial"/>
+                <w:sz w:val="18"/>
+                <w:szCs w:val="18"/>
+              </w:rPr>
+            </w:pPr>
+            <w:r>
+              <w:rPr>
+                <w:rFonts w:ascii="Arial" w:hAnsi="Arial" w:cs="Arial"/>
+                <w:sz w:val="18"/>
+                <w:szCs w:val="18"/>
+              </w:rPr>
+              <w:t xml:space="preserve">Sketch único, sem watchdog nem diagnóstico de reinício</w:t>
+            </w:r>
+          </w:p>
+        </w:tc>
+        <w:tc>
+          <w:tcPr>
+            <w:vAlign w:val="center"/>
+          </w:tcPr>
+          <w:p>
+            <w:pPr>
+              <w:spacing w:line="240" w:lineRule="auto" w:before="60" w:after="60"/>
+              <w:jc w:val="both"/>
+              <w:rPr>
+                <w:rFonts w:ascii="Arial" w:hAnsi="Arial" w:cs="Arial"/>
+                <w:sz w:val="18"/>
+                <w:szCs w:val="18"/>
+              </w:rPr>
+            </w:pPr>
+            <w:r>
+              <w:rPr>
+                <w:rFonts w:ascii="Arial" w:hAnsi="Arial" w:cs="Arial"/>
+                <w:sz w:val="18"/>
+                <w:szCs w:val="18"/>
+              </w:rPr>
+              <w:t xml:space="preserve">Firmware v3.0 modular: watchdog de 2 s, causa do reset, kick-start, LCD opcional e limitador de rajadas</w:t>
+            </w:r>
+          </w:p>
+        </w:tc>
+        <w:tc>
+          <w:tcPr>
+            <w:vAlign w:val="center"/>
+          </w:tcPr>
+          <w:p>
+            <w:pPr>
+              <w:spacing w:line="240" w:lineRule="auto" w:before="60" w:after="60"/>
+              <w:jc w:val="both"/>
+              <w:rPr>
+                <w:rFonts w:ascii="Arial" w:hAnsi="Arial" w:cs="Arial"/>
+                <w:sz w:val="18"/>
+                <w:szCs w:val="18"/>
+              </w:rPr>
+            </w:pPr>
+            <w:r>
+              <w:rPr>
+                <w:rFonts w:ascii="Arial" w:hAnsi="Arial" w:cs="Arial"/>
+                <w:sz w:val="18"/>
+                <w:szCs w:val="18"/>
+              </w:rPr>
+              <w:t xml:space="preserve">Falhas detectáveis e seguras (motores desligados antes do reset); validação em bancada na Semana 8.</w:t>
+            </w:r>
+          </w:p>
+        </w:tc>
+      </w:tr>
+      <w:tr>
+        <w:trPr>
+          <w:cantSplit/>
+        </w:trPr>
+        <w:tc>
+          <w:tcPr>
+            <w:vAlign w:val="center"/>
+          </w:tcPr>
+          <w:p>
+            <w:pPr>
+              <w:spacing w:line="240" w:lineRule="auto" w:before="60" w:after="60"/>
+              <w:jc w:val="left"/>
+              <w:rPr>
+                <w:rFonts w:ascii="Arial" w:hAnsi="Arial" w:cs="Arial"/>
+                <w:b/>
+                <w:sz w:val="18"/>
+                <w:szCs w:val="18"/>
+              </w:rPr>
+            </w:pPr>
+            <w:r>
+              <w:rPr>
+                <w:rFonts w:ascii="Arial" w:hAnsi="Arial" w:cs="Arial"/>
+                <w:b/>
+                <w:sz w:val="18"/>
+                <w:szCs w:val="18"/>
+              </w:rPr>
+              <w:t xml:space="preserve">3. Firmware e Controle em Tempo Real</w:t>
+            </w:r>
+          </w:p>
+        </w:tc>
+        <w:tc>
+          <w:tcPr>
+            <w:vAlign w:val="center"/>
+          </w:tcPr>
+          <w:p>
+            <w:pPr>
+              <w:spacing w:line="240" w:lineRule="auto" w:before="60" w:after="60"/>
+              <w:jc w:val="left"/>
+              <w:rPr>
+                <w:rFonts w:ascii="Arial" w:hAnsi="Arial" w:cs="Arial"/>
+                <w:b/>
+                <w:sz w:val="18"/>
+                <w:szCs w:val="18"/>
+              </w:rPr>
+            </w:pPr>
+            <w:r>
+              <w:rPr>
+                <w:rFonts w:ascii="Arial" w:hAnsi="Arial" w:cs="Arial"/>
+                <w:b/>
+                <w:sz w:val="18"/>
+                <w:szCs w:val="18"/>
+              </w:rPr>
+              <w:t xml:space="preserve">Estoque Inicial e Velocidade</w:t>
+            </w:r>
+          </w:p>
+        </w:tc>
+        <w:tc>
+          <w:tcPr>
+            <w:vAlign w:val="center"/>
+          </w:tcPr>
+          <w:p>
+            <w:pPr>
+              <w:spacing w:line="240" w:lineRule="auto" w:before="60" w:after="60"/>
+              <w:jc w:val="both"/>
+              <w:rPr>
+                <w:rFonts w:ascii="Arial" w:hAnsi="Arial" w:cs="Arial"/>
+                <w:sz w:val="18"/>
+                <w:szCs w:val="18"/>
+              </w:rPr>
+            </w:pPr>
+            <w:r>
+              <w:rPr>
+                <w:rFonts w:ascii="Arial" w:hAnsi="Arial" w:cs="Arial"/>
+                <w:sz w:val="18"/>
+                <w:szCs w:val="18"/>
+              </w:rPr>
+              <w:t xml:space="preserve">5 peças por tipo e PWM único para as esteiras</w:t>
+            </w:r>
+          </w:p>
+        </w:tc>
+        <w:tc>
+          <w:tcPr>
+            <w:vAlign w:val="center"/>
+          </w:tcPr>
+          <w:p>
+            <w:pPr>
+              <w:spacing w:line="240" w:lineRule="auto" w:before="60" w:after="60"/>
+              <w:jc w:val="both"/>
+              <w:rPr>
+                <w:rFonts w:ascii="Arial" w:hAnsi="Arial" w:cs="Arial"/>
+                <w:sz w:val="18"/>
+                <w:szCs w:val="18"/>
+              </w:rPr>
+            </w:pPr>
+            <w:r>
+              <w:rPr>
+                <w:rFonts w:ascii="Arial" w:hAnsi="Arial" w:cs="Arial"/>
+                <w:sz w:val="18"/>
+                <w:szCs w:val="18"/>
+              </w:rPr>
+              <w:t xml:space="preserve">15 peças por tipo; parâmetros de partida e PWM por esteira</w:t>
+            </w:r>
+          </w:p>
+        </w:tc>
+        <w:tc>
+          <w:tcPr>
+            <w:vAlign w:val="center"/>
+          </w:tcPr>
+          <w:p>
+            <w:pPr>
+              <w:spacing w:line="240" w:lineRule="auto" w:before="60" w:after="60"/>
+              <w:jc w:val="both"/>
+              <w:rPr>
+                <w:rFonts w:ascii="Arial" w:hAnsi="Arial" w:cs="Arial"/>
+                <w:sz w:val="18"/>
+                <w:szCs w:val="18"/>
+              </w:rPr>
+            </w:pPr>
+            <w:r>
+              <w:rPr>
+                <w:rFonts w:ascii="Arial" w:hAnsi="Arial" w:cs="Arial"/>
+                <w:sz w:val="18"/>
+                <w:szCs w:val="18"/>
+              </w:rPr>
+              <w:t xml:space="preserve">Mais rodadas de teste e calibração individual após a troca do motor da esteira C.</w:t>
+            </w:r>
+          </w:p>
+        </w:tc>
+      </w:tr>
+      <w:tr>
+        <w:trPr>
+          <w:cantSplit/>
+        </w:trPr>
+        <w:tc>
+          <w:tcPr>
+            <w:vAlign w:val="center"/>
+          </w:tcPr>
+          <w:p>
+            <w:pPr>
+              <w:spacing w:line="240" w:lineRule="auto" w:before="60" w:after="60"/>
+              <w:jc w:val="left"/>
+              <w:rPr>
+                <w:rFonts w:ascii="Arial" w:hAnsi="Arial" w:cs="Arial"/>
+                <w:b/>
+                <w:sz w:val="18"/>
+                <w:szCs w:val="18"/>
+              </w:rPr>
+            </w:pPr>
+            <w:r>
+              <w:rPr>
+                <w:rFonts w:ascii="Arial" w:hAnsi="Arial" w:cs="Arial"/>
+                <w:b/>
+                <w:sz w:val="18"/>
+                <w:szCs w:val="18"/>
+              </w:rPr>
               <w:t xml:space="preserve">4. Metodologia e Observabilidade</w:t>
             </w:r>
           </w:p>
@@ -4437,6 +4771,135 @@
                 <w:sz w:val="18"/>
                 <w:szCs w:val="18"/>
               </w:rPr>
+              <w:t xml:space="preserve">Ambiente de Servidor e Visualização</w:t>
+            </w:r>
+          </w:p>
+        </w:tc>
+        <w:tc>
+          <w:tcPr>
+            <w:vAlign w:val="center"/>
+          </w:tcPr>
+          <w:p>
+            <w:pPr>
+              <w:spacing w:line="240" w:lineRule="auto" w:before="60" w:after="60"/>
+              <w:jc w:val="both"/>
+              <w:rPr>
+                <w:rFonts w:ascii="Arial" w:hAnsi="Arial" w:cs="Arial"/>
+                <w:sz w:val="18"/>
+                <w:szCs w:val="18"/>
+              </w:rPr>
+            </w:pPr>
+            <w:r>
+              <w:rPr>
+                <w:rFonts w:ascii="Arial" w:hAnsi="Arial" w:cs="Arial"/>
+                <w:sz w:val="18"/>
+                <w:szCs w:val="18"/>
+              </w:rPr>
+              <w:t xml:space="preserve">Node-RED ou plataforma em nuvem proprietária (Ubidots)</w:t>
+            </w:r>
+          </w:p>
+        </w:tc>
+        <w:tc>
+          <w:tcPr>
+            <w:vAlign w:val="center"/>
+          </w:tcPr>
+          <w:p>
+            <w:pPr>
+              <w:spacing w:line="240" w:lineRule="auto" w:before="60" w:after="60"/>
+              <w:jc w:val="both"/>
+              <w:rPr>
+                <w:rFonts w:ascii="Arial" w:hAnsi="Arial" w:cs="Arial"/>
+                <w:sz w:val="18"/>
+                <w:szCs w:val="18"/>
+              </w:rPr>
+            </w:pPr>
+            <w:r>
+              <w:rPr>
+                <w:rFonts w:ascii="Arial" w:hAnsi="Arial" w:cs="Arial"/>
+                <w:sz w:val="18"/>
+                <w:szCs w:val="18"/>
+              </w:rPr>
+              <w:t xml:space="preserve">Servidor Node.js (Express + Socket.IO + MQTT.js) próprio com helmet/CSP, CORS restrito, rate limiting e endpoint /api/status</w:t>
+            </w:r>
+          </w:p>
+        </w:tc>
+        <w:tc>
+          <w:tcPr>
+            <w:vAlign w:val="center"/>
+          </w:tcPr>
+          <w:p>
+            <w:pPr>
+              <w:spacing w:line="240" w:lineRule="auto" w:before="60" w:after="60"/>
+              <w:jc w:val="both"/>
+              <w:rPr>
+                <w:rFonts w:ascii="Arial" w:hAnsi="Arial" w:cs="Arial"/>
+                <w:sz w:val="18"/>
+                <w:szCs w:val="18"/>
+              </w:rPr>
+            </w:pPr>
+            <w:r>
+              <w:rPr>
+                <w:rFonts w:ascii="Arial" w:hAnsi="Arial" w:cs="Arial"/>
+                <w:sz w:val="18"/>
+                <w:szCs w:val="18"/>
+              </w:rPr>
+              <w:t xml:space="preserve">Dashboard customizado, baixa latência via WebSocket, telemetria completa e independência de planos pagos.</w:t>
+            </w:r>
+          </w:p>
+        </w:tc>
+      </w:tr>
+      <w:tr>
+        <w:trPr>
+          <w:cantSplit/>
+        </w:trPr>
+        <w:tc>
+          <w:tcPr>
+            <w:vAlign w:val="center"/>
+          </w:tcPr>
+          <w:p>
+            <w:pPr>
+              <w:spacing w:line="240" w:lineRule="auto" w:before="60" w:after="60"/>
+              <w:jc w:val="left"/>
+              <w:rPr>
+                <w:rFonts w:ascii="Arial" w:hAnsi="Arial" w:cs="Arial"/>
+                <w:b/>
+                <w:sz w:val="18"/>
+                <w:szCs w:val="18"/>
+              </w:rPr>
+            </w:pPr>
+            <w:r>
+              <w:rPr>
+                <w:rFonts w:ascii="Arial" w:hAnsi="Arial" w:cs="Arial"/>
+                <w:b/>
+                <w:sz w:val="18"/>
+                <w:szCs w:val="18"/>
+              </w:rPr>
+              <w:t xml:space="preserve">4. Metodologia e Observabilidade</w:t>
+            </w:r>
+          </w:p>
+        </w:tc>
+        <w:tc>
+          <w:tcPr>
+            <w:vAlign w:val="center"/>
+          </w:tcPr>
+          <w:p>
+            <w:pPr>
+              <w:spacing w:line="240" w:lineRule="auto" w:before="60" w:after="60"/>
+              <w:jc w:val="left"/>
+              <w:rPr>
+                <w:rFonts w:ascii="Arial" w:hAnsi="Arial" w:cs="Arial"/>
+                <w:b/>
+                <w:sz w:val="18"/>
+                <w:szCs w:val="18"/>
+              </w:rPr>
+            </w:pPr>
+            <w:r>
+              <w:rPr>
+                <w:rFonts w:ascii="Arial" w:hAnsi="Arial" w:cs="Arial"/>
+                <w:b/>
+                <w:sz w:val="18"/>
+                <w:szCs w:val="18"/>
+              </w:rPr>
               <w:t xml:space="preserve">Validação em Camadas (Local-First)</w:t>
             </w:r>
           </w:p>
@@ -4485,7 +4948,7 @@
                 <w:sz w:val="18"/>
                 <w:szCs w:val="18"/>
               </w:rPr>
-              <w:t xml:space="preserve">Validação em bancada via Mosquitto local (1883) antes da nuvem + Simulador Offline + mqtt_probe</w:t>
+              <w:t xml:space="preserve">Mosquitto local (1883) antes da nuvem + Simulador Offline + mqtt_probe + roteiros semanais com portões de aprovação</w:t>
             </w:r>
           </w:p>
         </w:tc>
@@ -4510,6 +4973,264 @@
                 <w:szCs w:val="18"/>
               </w:rPr>
               <w:t xml:space="preserve">Desacoplamento de testes de hardware, rede e frontend; depuração rápida e determinística.</w:t>
+            </w:r>
+          </w:p>
+        </w:tc>
+      </w:tr>
+      <w:tr>
+        <w:trPr>
+          <w:cantSplit/>
+        </w:trPr>
+        <w:tc>
+          <w:tcPr>
+            <w:vAlign w:val="center"/>
+          </w:tcPr>
+          <w:p>
+            <w:pPr>
+              <w:spacing w:line="240" w:lineRule="auto" w:before="60" w:after="60"/>
+              <w:jc w:val="left"/>
+              <w:rPr>
+                <w:rFonts w:ascii="Arial" w:hAnsi="Arial" w:cs="Arial"/>
+                <w:b/>
+                <w:sz w:val="18"/>
+                <w:szCs w:val="18"/>
+              </w:rPr>
+            </w:pPr>
+            <w:r>
+              <w:rPr>
+                <w:rFonts w:ascii="Arial" w:hAnsi="Arial" w:cs="Arial"/>
+                <w:b/>
+                <w:sz w:val="18"/>
+                <w:szCs w:val="18"/>
+              </w:rPr>
+              <w:t xml:space="preserve">4. Metodologia e Observabilidade</w:t>
+            </w:r>
+          </w:p>
+        </w:tc>
+        <w:tc>
+          <w:tcPr>
+            <w:vAlign w:val="center"/>
+          </w:tcPr>
+          <w:p>
+            <w:pPr>
+              <w:spacing w:line="240" w:lineRule="auto" w:before="60" w:after="60"/>
+              <w:jc w:val="left"/>
+              <w:rPr>
+                <w:rFonts w:ascii="Arial" w:hAnsi="Arial" w:cs="Arial"/>
+                <w:b/>
+                <w:sz w:val="18"/>
+                <w:szCs w:val="18"/>
+              </w:rPr>
+            </w:pPr>
+            <w:r>
+              <w:rPr>
+                <w:rFonts w:ascii="Arial" w:hAnsi="Arial" w:cs="Arial"/>
+                <w:b/>
+                <w:sz w:val="18"/>
+                <w:szCs w:val="18"/>
+              </w:rPr>
+              <w:t xml:space="preserve">Telemetria de Desempenho</w:t>
+            </w:r>
+          </w:p>
+        </w:tc>
+        <w:tc>
+          <w:tcPr>
+            <w:vAlign w:val="center"/>
+          </w:tcPr>
+          <w:p>
+            <w:pPr>
+              <w:spacing w:line="240" w:lineRule="auto" w:before="60" w:after="60"/>
+              <w:jc w:val="both"/>
+              <w:rPr>
+                <w:rFonts w:ascii="Arial" w:hAnsi="Arial" w:cs="Arial"/>
+                <w:sz w:val="18"/>
+                <w:szCs w:val="18"/>
+              </w:rPr>
+            </w:pPr>
+            <w:r>
+              <w:rPr>
+                <w:rFonts w:ascii="Arial" w:hAnsi="Arial" w:cs="Arial"/>
+                <w:sz w:val="18"/>
+                <w:szCs w:val="18"/>
+              </w:rPr>
+              <w:t xml:space="preserve">Sem registro histórico de desempenho</w:t>
+            </w:r>
+          </w:p>
+        </w:tc>
+        <w:tc>
+          <w:tcPr>
+            <w:vAlign w:val="center"/>
+          </w:tcPr>
+          <w:p>
+            <w:pPr>
+              <w:spacing w:line="240" w:lineRule="auto" w:before="60" w:after="60"/>
+              <w:jc w:val="both"/>
+              <w:rPr>
+                <w:rFonts w:ascii="Arial" w:hAnsi="Arial" w:cs="Arial"/>
+                <w:sz w:val="18"/>
+                <w:szCs w:val="18"/>
+              </w:rPr>
+            </w:pPr>
+            <w:r>
+              <w:rPr>
+                <w:rFonts w:ascii="Arial" w:hAnsi="Arial" w:cs="Arial"/>
+                <w:sz w:val="18"/>
+                <w:szCs w:val="18"/>
+              </w:rPr>
+              <w:t xml:space="preserve">Prometheus + Grafana: 17 métricas dfi_* e três dashboards</w:t>
+            </w:r>
+          </w:p>
+        </w:tc>
+        <w:tc>
+          <w:tcPr>
+            <w:vAlign w:val="center"/>
+          </w:tcPr>
+          <w:p>
+            <w:pPr>
+              <w:spacing w:line="240" w:lineRule="auto" w:before="60" w:after="60"/>
+              <w:jc w:val="both"/>
+              <w:rPr>
+                <w:rFonts w:ascii="Arial" w:hAnsi="Arial" w:cs="Arial"/>
+                <w:sz w:val="18"/>
+                <w:szCs w:val="18"/>
+              </w:rPr>
+            </w:pPr>
+            <w:r>
+              <w:rPr>
+                <w:rFonts w:ascii="Arial" w:hAnsi="Arial" w:cs="Arial"/>
+                <w:sz w:val="18"/>
+                <w:szCs w:val="18"/>
+              </w:rPr>
+              <w:t xml:space="preserve">Latência, confiabilidade e quedas do gateway mensuráveis ao longo do tempo (validado em 01/10).</w:t>
+            </w:r>
+          </w:p>
+        </w:tc>
+      </w:tr>
+      <w:tr>
+        <w:trPr>
+          <w:cantSplit/>
+        </w:trPr>
+        <w:tc>
+          <w:tcPr>
+            <w:vAlign w:val="center"/>
+          </w:tcPr>
+          <w:p>
+            <w:pPr>
+              <w:spacing w:line="240" w:lineRule="auto" w:before="60" w:after="60"/>
+              <w:jc w:val="left"/>
+              <w:rPr>
+                <w:rFonts w:ascii="Arial" w:hAnsi="Arial" w:cs="Arial"/>
+                <w:b/>
+                <w:sz w:val="18"/>
+                <w:szCs w:val="18"/>
+              </w:rPr>
+            </w:pPr>
+            <w:r>
+              <w:rPr>
+                <w:rFonts w:ascii="Arial" w:hAnsi="Arial" w:cs="Arial"/>
+                <w:b/>
+                <w:sz w:val="18"/>
+                <w:szCs w:val="18"/>
+              </w:rPr>
+              <w:t xml:space="preserve">4. Metodologia e Observabilidade</w:t>
+            </w:r>
+          </w:p>
+        </w:tc>
+        <w:tc>
+          <w:tcPr>
+            <w:vAlign w:val="center"/>
+          </w:tcPr>
+          <w:p>
+            <w:pPr>
+              <w:spacing w:line="240" w:lineRule="auto" w:before="60" w:after="60"/>
+              <w:jc w:val="left"/>
+              <w:rPr>
+                <w:rFonts w:ascii="Arial" w:hAnsi="Arial" w:cs="Arial"/>
+                <w:b/>
+                <w:sz w:val="18"/>
+                <w:szCs w:val="18"/>
+              </w:rPr>
+            </w:pPr>
+            <w:r>
+              <w:rPr>
+                <w:rFonts w:ascii="Arial" w:hAnsi="Arial" w:cs="Arial"/>
+                <w:b/>
+                <w:sz w:val="18"/>
+                <w:szCs w:val="18"/>
+              </w:rPr>
+              <w:t xml:space="preserve">Qualidade e Integração Contínua</w:t>
+            </w:r>
+          </w:p>
+        </w:tc>
+        <w:tc>
+          <w:tcPr>
+            <w:vAlign w:val="center"/>
+          </w:tcPr>
+          <w:p>
+            <w:pPr>
+              <w:spacing w:line="240" w:lineRule="auto" w:before="60" w:after="60"/>
+              <w:jc w:val="both"/>
+              <w:rPr>
+                <w:rFonts w:ascii="Arial" w:hAnsi="Arial" w:cs="Arial"/>
+                <w:sz w:val="18"/>
+                <w:szCs w:val="18"/>
+              </w:rPr>
+            </w:pPr>
+            <w:r>
+              <w:rPr>
+                <w:rFonts w:ascii="Arial" w:hAnsi="Arial" w:cs="Arial"/>
+                <w:sz w:val="18"/>
+                <w:szCs w:val="18"/>
+              </w:rPr>
+              <w:t xml:space="preserve">Testes manuais em bancada</w:t>
+            </w:r>
+          </w:p>
+        </w:tc>
+        <w:tc>
+          <w:tcPr>
+            <w:vAlign w:val="center"/>
+          </w:tcPr>
+          <w:p>
+            <w:pPr>
+              <w:spacing w:line="240" w:lineRule="auto" w:before="60" w:after="60"/>
+              <w:jc w:val="both"/>
+              <w:rPr>
+                <w:rFonts w:ascii="Arial" w:hAnsi="Arial" w:cs="Arial"/>
+                <w:sz w:val="18"/>
+                <w:szCs w:val="18"/>
+              </w:rPr>
+            </w:pPr>
+            <w:r>
+              <w:rPr>
+                <w:rFonts w:ascii="Arial" w:hAnsi="Arial" w:cs="Arial"/>
+                <w:sz w:val="18"/>
+                <w:szCs w:val="18"/>
+              </w:rPr>
+              <w:t xml:space="preserve">GitHub Actions: lint, detecção de segredos, auditoria, compilação, 43 testes de firmware, testes de servidor e E2E com Playwright</w:t>
+            </w:r>
+          </w:p>
+        </w:tc>
+        <w:tc>
+          <w:tcPr>
+            <w:vAlign w:val="center"/>
+          </w:tcPr>
+          <w:p>
+            <w:pPr>
+              <w:spacing w:line="240" w:lineRule="auto" w:before="60" w:after="60"/>
+              <w:jc w:val="both"/>
+              <w:rPr>
+                <w:rFonts w:ascii="Arial" w:hAnsi="Arial" w:cs="Arial"/>
+                <w:sz w:val="18"/>
+                <w:szCs w:val="18"/>
+              </w:rPr>
+            </w:pPr>
+            <w:r>
+              <w:rPr>
+                <w:rFonts w:ascii="Arial" w:hAnsi="Arial" w:cs="Arial"/>
+                <w:sz w:val="18"/>
+                <w:szCs w:val="18"/>
+              </w:rPr>
+              <w:t xml:space="preserve">Regressões detectadas antes da integração ao ramo principal; build reprodutível.</w:t>
             </w:r>
           </w:p>
         </w:tc>
@@ -4533,7 +5254,7 @@
           <w:sz w:val="24"/>
           <w:szCs w:val="24"/>
         </w:rPr>
-        <w:t xml:space="preserve">Essa reformulação arquitetural e metodológica garantiu que o sistema operasse com alta confiabilidade determinística, baixo tempo de latência na entrega de dados e total imunidade a falhas de comunicação serial e colisões de rede, viabilizando a validação integral da planta em escala reduzida.</w:t>
+        <w:t xml:space="preserve">Essa reformulação arquitetural e metodológica tornou o sistema determinístico e rastreável: cada pedido percorre uma cadeia de comunicação supervisionada de ponta a ponta, as falhas são detectadas e informadas com fase e causa, e a qualidade do software é verificada automaticamente a cada alteração. As três esteiras secundárias operam em bancada desde 03/10; restam a validação do firmware 3.0 em bancada, a integração da roda de separação e a validação remota ponta a ponta pelo HiveMQ Cloud.</w:t>
       </w:r>
     </w:p>
     <w:p>
@@ -4650,14 +5371,7 @@
           <w:rFonts w:ascii="Arial" w:hAnsi="Arial" w:cs="Arial"/>
           <w:color w:val="000000" w:themeColor="text1"/>
         </w:rPr>
-        <w:t xml:space="preserve">Com </w:t>
-      </w:r>
-      <w:r>
-        <w:rPr>
-          <w:rFonts w:ascii="Arial" w:hAnsi="Arial" w:cs="Arial"/>
-          <w:color w:val="000000" w:themeColor="text1"/>
-        </w:rPr>
-        <w:t>o projeto estruturado e devidamente realizado podemos demonstrar o uso da automação através de microcontroladores na indústria da logística, estabelecendo mais controle ao processo de separação e levando parâmetros rigorosos de gerenciamento e armazenamento de dados na nuvem como um avanço de uso das tecnologias IoT na indústria.</w:t>
+        <w:t xml:space="preserve">Com o projeto estruturado e implementado, demonstramos o uso da automação por microcontroladores na indústria da logística: um pedido feito no navegador percorre o servidor, o broker MQTT e o gateway ESP32 até o Arduino, que aciona a esteira correta e só debita o estoque após a confirmação física da entrega. O processo de separação ganhou supervisão por marcos, e os dados de operação passaram a ser persistidos em um PC industrial e monitorados historicamente, aproximando o protótipo das práticas de IoT da Indústria 4.0.</w:t>
       </w:r>
     </w:p>
     <w:p>
@@ -4674,7 +5388,7 @@
           <w:rFonts w:ascii="Arial" w:hAnsi="Arial" w:cs="Arial"/>
           <w:color w:val="000000" w:themeColor="text1"/>
         </w:rPr>
-        <w:t>Através da confecção aperfeiçoamos habilidades como: gerenciamento de tempos de processo, metrificação de recursos, controle de indicadores do sistema, linguagem de programação, integração de serviços web, aperfeiçoamento de técnicas de controle com microcontroladores, incorporação de atuadores e sensores em projeto de automação industrial e acompanhamento de dados de processo por tráfego seguro.</w:t>
+        <w:t xml:space="preserve">Através da confecção aperfeiçoamos habilidades como: gerenciamento de tempos de processo, metrificação de recursos, controle de indicadores do sistema, linguagem de programação, integração de serviços web, aperfeiçoamento de técnicas de controle com microcontroladores, incorporação de atuadores e sensores em projeto de automação industrial e acompanhamento de dados de processo por tráfego seguro, além de práticas de engenharia como versionamento, testes automatizados, integração contínua, diagnóstico elétrico em bancada e documentação técnica.</w:t>
       </w:r>
     </w:p>
     <w:p>
@@ -4691,7 +5405,7 @@
           <w:rFonts w:ascii="Arial" w:hAnsi="Arial" w:cs="Arial"/>
           <w:color w:val="000000" w:themeColor="text1"/>
         </w:rPr>
-        <w:t>Finalmente, pode-se observar que o projeto, apesar de simples e compacto, apresenta diversas vantagens de tanto quanto ao custo-benefício dos equipamentos utilizados quanto a robustez no detalhamento de informações, assim, torna-se perfeitamente viável em termos didáticos e ainda aproxima e amplia a visão de negócios no ambiente de controle e automação.</w:t>
+        <w:t xml:space="preserve">Finalmente, pode-se observar que o projeto, apesar de simples e compacto, apresenta diversas vantagens tanto no custo-benefício dos equipamentos utilizados quanto na robustez e no detalhamento das informações; assim, torna-se perfeitamente viável em termos didáticos e ainda aproxima e amplia a visão de negócios no ambiente de controle e automação. Como próximos passos, previstos no cronograma até dezembro, ficam a validação do firmware 3.0 em bancada, a integração da roda de separação e a validação remota ponta a ponta pelo HiveMQ Cloud.</w:t>
       </w:r>
     </w:p>
     <w:p>
@@ -4883,64 +5597,20 @@
           <w:rFonts w:ascii="Arial" w:hAnsi="Arial" w:cs="Arial"/>
           <w:lang w:val="en-US"/>
         </w:rPr>
-        <w:t xml:space="preserve">HUSSEIN, O. D.; MUHUDIN, A. IoT Based Warehouse Management System Leveraging </w:t>
-      </w:r>
-      <w:proofErr w:type="gramStart"/>
-      <w:r>
-        <w:rPr>
-          <w:rFonts w:ascii="Arial" w:hAnsi="Arial" w:cs="Arial"/>
+        <w:t xml:space="preserve">HUSSEIN, O. D.; MUHUDIN, A. IoT Based Warehouse Management System Leveraging On RFID and Cloud Platform Technologies. In: IEEE International Conference on Advanced Telecommunication and Networking Technologies (ATNT), 2024. https://doi.org/10.1109/ATNT61688.2024.10719252</w:t>
+      </w:r>
+    </w:p>
+    <w:p>
+      <w:pPr>
+        <w:rPr>
           <w:lang w:val="en-US"/>
         </w:rPr>
-        <w:t>On</w:t>
-      </w:r>
-      <w:proofErr w:type="gramEnd"/>
-      <w:r>
-        <w:rPr>
-          <w:rFonts w:ascii="Arial" w:hAnsi="Arial" w:cs="Arial"/>
+      </w:pPr>
+      <w:r>
+        <w:rPr>
           <w:lang w:val="en-US"/>
         </w:rPr>
-        <w:t xml:space="preserve"> RFID and Cloud Platform Technologies. In: IEEE International Conference on Advanced Telecommunication and Networking Technologies (ATNT), 2024. https://doi.org/10.1109/ATNT61688.2024.10719252</w:t>
-      </w:r>
-    </w:p>
-    <w:p>
-      <w:pPr>
-        <w:rPr>
-          <w:lang w:val="en-US"/>
-        </w:rPr>
-      </w:pPr>
-      <w:r>
-        <w:rPr>
-          <w:lang w:val="en-US"/>
-        </w:rPr>
-        <w:t xml:space="preserve">LIGHT, R. A. </w:t>
-      </w:r>
-      <w:proofErr w:type="spellStart"/>
-      <w:r>
-        <w:rPr>
-          <w:lang w:val="en-US"/>
-        </w:rPr>
-        <w:t>Mosquitto</w:t>
-      </w:r>
-      <w:proofErr w:type="spellEnd"/>
-      <w:r>
-        <w:rPr>
-          <w:lang w:val="en-US"/>
-        </w:rPr>
-        <w:t xml:space="preserve">: server and client implementation of the MQTT protocol. Journal of </w:t>
-      </w:r>
-      <w:proofErr w:type="gramStart"/>
-      <w:r>
-        <w:rPr>
-          <w:lang w:val="en-US"/>
-        </w:rPr>
-        <w:t>Open Source</w:t>
-      </w:r>
-      <w:proofErr w:type="gramEnd"/>
-      <w:r>
-        <w:rPr>
-          <w:lang w:val="en-US"/>
-        </w:rPr>
-        <w:t xml:space="preserve"> Software, v. 2, n. 13, p. 265, 2017. https://doi.org/10.21105/joss.00265</w:t>
+        <w:t xml:space="preserve">LIGHT, R. A. Mosquitto: server and client implementation of the MQTT protocol. Journal of Open Source Software, v. 2, n. 13, p. 265, 2017. https://doi.org/10.21105/joss.00265</w:t>
       </w:r>
     </w:p>
     <w:p>
@@ -5093,23 +5763,7 @@
           <w:rFonts w:ascii="Arial" w:hAnsi="Arial" w:cs="Arial"/>
           <w:lang w:val="en-US"/>
         </w:rPr>
-        <w:t xml:space="preserve">WINKELHAUS, S.; GROSSE, E. H.; MORANA, S. Towards a </w:t>
-      </w:r>
-      <w:proofErr w:type="spellStart"/>
-      <w:r>
-        <w:rPr>
-          <w:rFonts w:ascii="Arial" w:hAnsi="Arial" w:cs="Arial"/>
-          <w:lang w:val="en-US"/>
-        </w:rPr>
-        <w:t>conceptualisation</w:t>
-      </w:r>
-      <w:proofErr w:type="spellEnd"/>
-      <w:r>
-        <w:rPr>
-          <w:rFonts w:ascii="Arial" w:hAnsi="Arial" w:cs="Arial"/>
-          <w:lang w:val="en-US"/>
-        </w:rPr>
-        <w:t xml:space="preserve"> of Order Picking 4.0. Computers &amp; Industrial Engineering, v. 159, p. 107511, 2021. https://doi.org/10.1016/j.cie.2021.107511</w:t>
+        <w:t xml:space="preserve">WINKELHAUS, S.; GROSSE, E. H.; MORANA, S. Towards a conceptualisation of Order Picking 4.0. Computers &amp; Industrial Engineering, v. 159, p. 107511, 2021. https://doi.org/10.1016/j.cie.2021.107511</w:t>
       </w:r>
     </w:p>
     <w:p>
@@ -5148,7 +5802,7 @@
 </w:document>
 </file>
 
-<file path=word\endnotes.xml><?xml version="1.0" encoding="utf-8"?>
+<file path=word/endnotes.xml><?xml version="1.0" encoding="utf-8"?>
 <w:endnotes xmlns:wpc="http://schemas.microsoft.com/office/word/2010/wordprocessingCanvas" xmlns:cx="http://schemas.microsoft.com/office/drawing/2014/chartex" xmlns:cx1="http://schemas.microsoft.com/office/drawing/2015/9/8/chartex" xmlns:cx2="http://schemas.microsoft.com/office/drawing/2015/10/21/chartex" xmlns:cx3="http://schemas.microsoft.com/office/drawing/2016/5/9/chartex" xmlns:cx4="http://schemas.microsoft.com/office/drawing/2016/5/10/chartex" xmlns:cx5="http://schemas.microsoft.com/office/drawing/2016/5/11/chartex" xmlns:cx6="http://schemas.microsoft.com/office/drawing/2016/5/12/chartex" xmlns:cx7="http://schemas.microsoft.com/office/drawing/2016/5/13/chartex" xmlns:cx8="http://schemas.microsoft.com/office/drawing/2016/5/14/chartex" xmlns:mc="http://schemas.openxmlformats.org/markup-compatibility/2006" xmlns:aink="http://schemas.microsoft.com/office/drawing/2016/ink" xmlns:am3d="http://schemas.microsoft.com/office/drawing/2017/model3d" xmlns:o="urn:schemas-microsoft-com:office:office" xmlns:oel="http://schemas.microsoft.com/office/2019/extlst" xmlns:r="http://schemas.openxmlformats.org/officeDocument/2006/relationships" xmlns:m="http://schemas.openxmlformats.org/officeDocument/2006/math" xmlns:v="urn:schemas-microsoft-com:vml" xmlns:wp14="http://schemas.microsoft.com/office/word/2010/wordprocessingDrawing" xmlns:wp="http://schemas.openxmlformats.org/drawingml/2006/wordprocessingDrawing" xmlns:w10="urn:schemas-microsoft-com:office:word" xmlns:w="http://schemas.openxmlformats.org/wordprocessingml/2006/main" xmlns:w14="http://schemas.microsoft.com/office/word/2010/wordml" xmlns:w15="http://schemas.microsoft.com/office/word/2012/wordml" xmlns:w16cei="http://schemas.microsoft.com/office/word/2026/wordml/cei" xmlns:w16cex="http://schemas.microsoft.com/office/word/2018/wordml/cex" xmlns:w16cid="http://schemas.microsoft.com/office/word/2016/wordml/cid" xmlns:w16="http://schemas.microsoft.com/office/word/2018/wordml" xmlns:w16du="http://schemas.microsoft.com/office/word/2023/wordml/word16du" xmlns:w16sdtdh="http://schemas.microsoft.com/office/word/2020/wordml/sdtdatahash" xmlns:w16sdtfl="http://schemas.microsoft.com/office/word/2024/wordml/sdtformatlock" xmlns:w16se="http://schemas.microsoft.com/office/word/2015/wordml/symex" xmlns:wpg="http://schemas.microsoft.com/office/word/2010/wordprocessingGroup" xmlns:wpi="http://schemas.microsoft.com/office/word/2010/wordprocessingInk" xmlns:wne="http://schemas.microsoft.com/office/word/2006/wordml" xmlns:wps="http://schemas.microsoft.com/office/word/2010/wordprocessingShape" mc:Ignorable="w14 w15 w16se w16cid w16 w16cex w16sdtdh w16sdtfl w16du wp14">
   <w:endnote w:type="separator" w:id="-1">
     <w:p>
@@ -5167,55 +5821,7 @@
 </w:endnotes>
 </file>
 
-<file path=word\fontTable.xml><?xml version="1.0" encoding="utf-8"?>
-<w:fonts xmlns:mc="http://schemas.openxmlformats.org/markup-compatibility/2006" xmlns:r="http://schemas.openxmlformats.org/officeDocument/2006/relationships" xmlns:w="http://schemas.openxmlformats.org/wordprocessingml/2006/main" xmlns:w14="http://schemas.microsoft.com/office/word/2010/wordml" xmlns:w15="http://schemas.microsoft.com/office/word/2012/wordml" xmlns:w16cex="http://schemas.microsoft.com/office/word/2018/wordml/cex" xmlns:w16cid="http://schemas.microsoft.com/office/word/2016/wordml/cid" xmlns:w16="http://schemas.microsoft.com/office/word/2018/wordml" xmlns:w16du="http://schemas.microsoft.com/office/word/2023/wordml/word16du" xmlns:w16sdtdh="http://schemas.microsoft.com/office/word/2020/wordml/sdtdatahash" xmlns:w16sdtfl="http://schemas.microsoft.com/office/word/2024/wordml/sdtformatlock" xmlns:w16se="http://schemas.microsoft.com/office/word/2015/wordml/symex" mc:Ignorable="w14 w15 w16se w16cid w16 w16cex w16sdtdh w16sdtfl w16du">
-  <w:font w:name="Arial">
-    <w:panose1 w:val="020B0604020202020204"/>
-    <w:charset w:val="00"/>
-    <w:family w:val="swiss"/>
-    <w:pitch w:val="variable"/>
-    <w:sig w:usb0="E0002EFF" w:usb1="C000785B" w:usb2="00000009" w:usb3="00000000" w:csb0="000001FF" w:csb1="00000000"/>
-  </w:font>
-  <w:font w:name="Times New Roman">
-    <w:panose1 w:val="02020603050405020304"/>
-    <w:charset w:val="00"/>
-    <w:family w:val="roman"/>
-    <w:pitch w:val="variable"/>
-    <w:sig w:usb0="E0002EFF" w:usb1="C000785B" w:usb2="00000009" w:usb3="00000000" w:csb0="000001FF" w:csb1="00000000"/>
-  </w:font>
-  <w:font w:name="SimSun">
-    <w:altName w:val="宋体"/>
-    <w:panose1 w:val="02010600030101010101"/>
-    <w:charset w:val="86"/>
-    <w:family w:val="auto"/>
-    <w:pitch w:val="variable"/>
-    <w:sig w:usb0="00000203" w:usb1="288F0000" w:usb2="00000016" w:usb3="00000000" w:csb0="00040001" w:csb1="00000000"/>
-  </w:font>
-  <w:font w:name="Cambria">
-    <w:panose1 w:val="02040503050406030204"/>
-    <w:charset w:val="00"/>
-    <w:family w:val="roman"/>
-    <w:pitch w:val="variable"/>
-    <w:sig w:usb0="E00006FF" w:usb1="420024FF" w:usb2="02000000" w:usb3="00000000" w:csb0="0000019F" w:csb1="00000000"/>
-  </w:font>
-  <w:font w:name="Tahoma">
-    <w:panose1 w:val="020B0604030504040204"/>
-    <w:charset w:val="00"/>
-    <w:family w:val="swiss"/>
-    <w:pitch w:val="variable"/>
-    <w:sig w:usb0="E1002EFF" w:usb1="C000605B" w:usb2="00000029" w:usb3="00000000" w:csb0="000101FF" w:csb1="00000000"/>
-  </w:font>
-  <w:font w:name="Calibri">
-    <w:panose1 w:val="020F0502020204030204"/>
-    <w:charset w:val="00"/>
-    <w:family w:val="swiss"/>
-    <w:pitch w:val="variable"/>
-    <w:sig w:usb0="E4002EFF" w:usb1="C200247B" w:usb2="00000009" w:usb3="00000000" w:csb0="000001FF" w:csb1="00000000"/>
-  </w:font>
-</w:fonts>
-</file>
-
-<file path=word\footnotes.xml><?xml version="1.0" encoding="utf-8"?>
+<file path=word/footnotes.xml><?xml version="1.0" encoding="utf-8"?>
 <w:footnotes xmlns:wpc="http://schemas.microsoft.com/office/word/2010/wordprocessingCanvas" xmlns:cx="http://schemas.microsoft.com/office/drawing/2014/chartex" xmlns:cx1="http://schemas.microsoft.com/office/drawing/2015/9/8/chartex" xmlns:cx2="http://schemas.microsoft.com/office/drawing/2015/10/21/chartex" xmlns:cx3="http://schemas.microsoft.com/office/drawing/2016/5/9/chartex" xmlns:cx4="http://schemas.microsoft.com/office/drawing/2016/5/10/chartex" xmlns:cx5="http://schemas.microsoft.com/office/drawing/2016/5/11/chartex" xmlns:cx6="http://schemas.microsoft.com/office/drawing/2016/5/12/chartex" xmlns:cx7="http://schemas.microsoft.com/office/drawing/2016/5/13/chartex" xmlns:cx8="http://schemas.microsoft.com/office/drawing/2016/5/14/chartex" xmlns:mc="http://schemas.openxmlformats.org/markup-compatibility/2006" xmlns:aink="http://schemas.microsoft.com/office/drawing/2016/ink" xmlns:am3d="http://schemas.microsoft.com/office/drawing/2017/model3d" xmlns:o="urn:schemas-microsoft-com:office:office" xmlns:oel="http://schemas.microsoft.com/office/2019/extlst" xmlns:r="http://schemas.openxmlformats.org/officeDocument/2006/relationships" xmlns:m="http://schemas.openxmlformats.org/officeDocument/2006/math" xmlns:v="urn:schemas-microsoft-com:vml" xmlns:wp14="http://schemas.microsoft.com/office/word/2010/wordprocessingDrawing" xmlns:wp="http://schemas.openxmlformats.org/drawingml/2006/wordprocessingDrawing" xmlns:w10="urn:schemas-microsoft-com:office:word" xmlns:w="http://schemas.openxmlformats.org/wordprocessingml/2006/main" xmlns:w14="http://schemas.microsoft.com/office/word/2010/wordml" xmlns:w15="http://schemas.microsoft.com/office/word/2012/wordml" xmlns:w16cei="http://schemas.microsoft.com/office/word/2026/wordml/cei" xmlns:w16cex="http://schemas.microsoft.com/office/word/2018/wordml/cex" xmlns:w16cid="http://schemas.microsoft.com/office/word/2016/wordml/cid" xmlns:w16="http://schemas.microsoft.com/office/word/2018/wordml" xmlns:w16du="http://schemas.microsoft.com/office/word/2023/wordml/word16du" xmlns:w16sdtdh="http://schemas.microsoft.com/office/word/2020/wordml/sdtdatahash" xmlns:w16sdtfl="http://schemas.microsoft.com/office/word/2024/wordml/sdtformatlock" xmlns:w16se="http://schemas.microsoft.com/office/word/2015/wordml/symex" xmlns:wpg="http://schemas.microsoft.com/office/word/2010/wordprocessingGroup" xmlns:wpi="http://schemas.microsoft.com/office/word/2010/wordprocessingInk" xmlns:wne="http://schemas.microsoft.com/office/word/2006/wordml" xmlns:wps="http://schemas.microsoft.com/office/word/2010/wordprocessingShape" mc:Ignorable="w14 w15 w16se w16cid w16 w16cex w16sdtdh w16sdtfl w16du wp14">
   <w:footnote w:type="separator" w:id="-1">
     <w:p>
@@ -5234,7 +5840,7 @@
 </w:footnotes>
 </file>
 
-<file path=word\header1.xml><?xml version="1.0" encoding="utf-8"?>
+<file path=word/header1.xml><?xml version="1.0" encoding="utf-8"?>
 <w:hdr xmlns:wpc="http://schemas.microsoft.com/office/word/2010/wordprocessingCanvas" xmlns:cx="http://schemas.microsoft.com/office/drawing/2014/chartex" xmlns:cx1="http://schemas.microsoft.com/office/drawing/2015/9/8/chartex" xmlns:cx2="http://schemas.microsoft.com/office/drawing/2015/10/21/chartex" xmlns:cx3="http://schemas.microsoft.com/office/drawing/2016/5/9/chartex" xmlns:cx4="http://schemas.microsoft.com/office/drawing/2016/5/10/chartex" xmlns:cx5="http://schemas.microsoft.com/office/drawing/2016/5/11/chartex" xmlns:cx6="http://schemas.microsoft.com/office/drawing/2016/5/12/chartex" xmlns:cx7="http://schemas.microsoft.com/office/drawing/2016/5/13/chartex" xmlns:cx8="http://schemas.microsoft.com/office/drawing/2016/5/14/chartex" xmlns:mc="http://schemas.openxmlformats.org/markup-compatibility/2006" xmlns:aink="http://schemas.microsoft.com/office/drawing/2016/ink" xmlns:am3d="http://schemas.microsoft.com/office/drawing/2017/model3d" xmlns:o="urn:schemas-microsoft-com:office:office" xmlns:oel="http://schemas.microsoft.com/office/2019/extlst" xmlns:r="http://schemas.openxmlformats.org/officeDocument/2006/relationships" xmlns:m="http://schemas.openxmlformats.org/officeDocument/2006/math" xmlns:v="urn:schemas-microsoft-com:vml" xmlns:wp14="http://schemas.microsoft.com/office/word/2010/wordprocessingDrawing" xmlns:wp="http://schemas.openxmlformats.org/drawingml/2006/wordprocessingDrawing" xmlns:w10="urn:schemas-microsoft-com:office:word" xmlns:w="http://schemas.openxmlformats.org/wordprocessingml/2006/main" xmlns:w14="http://schemas.microsoft.com/office/word/2010/wordml" xmlns:w15="http://schemas.microsoft.com/office/word/2012/wordml" xmlns:w16cei="http://schemas.microsoft.com/office/word/2026/wordml/cei" xmlns:w16cex="http://schemas.microsoft.com/office/word/2018/wordml/cex" xmlns:w16cid="http://schemas.microsoft.com/office/word/2016/wordml/cid" xmlns:w16="http://schemas.microsoft.com/office/word/2018/wordml" xmlns:w16du="http://schemas.microsoft.com/office/word/2023/wordml/word16du" xmlns:w16sdtdh="http://schemas.microsoft.com/office/word/2020/wordml/sdtdatahash" xmlns:w16sdtfl="http://schemas.microsoft.com/office/word/2024/wordml/sdtformatlock" xmlns:w16se="http://schemas.microsoft.com/office/word/2015/wordml/symex" xmlns:wpg="http://schemas.microsoft.com/office/word/2010/wordprocessingGroup" xmlns:wpi="http://schemas.microsoft.com/office/word/2010/wordprocessingInk" xmlns:wne="http://schemas.microsoft.com/office/word/2006/wordml" xmlns:wps="http://schemas.microsoft.com/office/word/2010/wordprocessingShape" mc:Ignorable="w14 w15 w16se w16cid w16 w16cex w16sdtdh w16sdtfl w16du wp14">
   <w:sdt>
     <w:sdtPr>
@@ -5342,7 +5948,7 @@
 </w:hdr>
 </file>
 
-<file path=word\numbering.xml><?xml version="1.0" encoding="utf-8"?>
+<file path=word/numbering.xml><?xml version="1.0" encoding="utf-8"?>
 <w:numbering xmlns:wpc="http://schemas.microsoft.com/office/word/2010/wordprocessingCanvas" xmlns:cx="http://schemas.microsoft.com/office/drawing/2014/chartex" xmlns:cx1="http://schemas.microsoft.com/office/drawing/2015/9/8/chartex" xmlns:cx2="http://schemas.microsoft.com/office/drawing/2015/10/21/chartex" xmlns:cx3="http://schemas.microsoft.com/office/drawing/2016/5/9/chartex" xmlns:cx4="http://schemas.microsoft.com/office/drawing/2016/5/10/chartex" xmlns:cx5="http://schemas.microsoft.com/office/drawing/2016/5/11/chartex" xmlns:cx6="http://schemas.microsoft.com/office/drawing/2016/5/12/chartex" xmlns:cx7="http://schemas.microsoft.com/office/drawing/2016/5/13/chartex" xmlns:cx8="http://schemas.microsoft.com/office/drawing/2016/5/14/chartex" xmlns:mc="http://schemas.openxmlformats.org/markup-compatibility/2006" xmlns:aink="http://schemas.microsoft.com/office/drawing/2016/ink" xmlns:am3d="http://schemas.microsoft.com/office/drawing/2017/model3d" xmlns:o="urn:schemas-microsoft-com:office:office" xmlns:oel="http://schemas.microsoft.com/office/2019/extlst" xmlns:r="http://schemas.openxmlformats.org/officeDocument/2006/relationships" xmlns:m="http://schemas.openxmlformats.org/officeDocument/2006/math" xmlns:v="urn:schemas-microsoft-com:vml" xmlns:wp14="http://schemas.microsoft.com/office/word/2010/wordprocessingDrawing" xmlns:wp="http://schemas.openxmlformats.org/drawingml/2006/wordprocessingDrawing" xmlns:w10="urn:schemas-microsoft-com:office:word" xmlns:w="http://schemas.openxmlformats.org/wordprocessingml/2006/main" xmlns:w14="http://schemas.microsoft.com/office/word/2010/wordml" xmlns:w15="http://schemas.microsoft.com/office/word/2012/wordml" xmlns:w16cei="http://schemas.microsoft.com/office/word/2026/wordml/cei" xmlns:w16cex="http://schemas.microsoft.com/office/word/2018/wordml/cex" xmlns:w16cid="http://schemas.microsoft.com/office/word/2016/wordml/cid" xmlns:w16="http://schemas.microsoft.com/office/word/2018/wordml" xmlns:w16du="http://schemas.microsoft.com/office/word/2023/wordml/word16du" xmlns:w16sdtdh="http://schemas.microsoft.com/office/word/2020/wordml/sdtdatahash" xmlns:w16sdtfl="http://schemas.microsoft.com/office/word/2024/wordml/sdtformatlock" xmlns:w16se="http://schemas.microsoft.com/office/word/2015/wordml/symex" xmlns:wpg="http://schemas.microsoft.com/office/word/2010/wordprocessingGroup" xmlns:wpi="http://schemas.microsoft.com/office/word/2010/wordprocessingInk" xmlns:wne="http://schemas.microsoft.com/office/word/2006/wordml" xmlns:wps="http://schemas.microsoft.com/office/word/2010/wordprocessingShape" mc:Ignorable="w14 w15 w16se w16cid w16 w16cex w16sdtdh w16sdtfl w16du wp14">
   <w:abstractNum w:abstractNumId="0" w15:restartNumberingAfterBreak="0">
     <w:nsid w:val="005E4A37"/>
@@ -7475,628 +8081,7 @@
 </w:numbering>
 </file>
 
-<file path=word\settings.xml><?xml version="1.0" encoding="utf-8"?>
-<w:settings xmlns:mc="http://schemas.openxmlformats.org/markup-compatibility/2006" xmlns:o="urn:schemas-microsoft-com:office:office" xmlns:r="http://schemas.openxmlformats.org/officeDocument/2006/relationships" xmlns:m="http://schemas.openxmlformats.org/officeDocument/2006/math" xmlns:v="urn:schemas-microsoft-com:vml" xmlns:w10="urn:schemas-microsoft-com:office:word" xmlns:w="http://schemas.openxmlformats.org/wordprocessingml/2006/main" xmlns:w14="http://schemas.microsoft.com/office/word/2010/wordml" xmlns:w15="http://schemas.microsoft.com/office/word/2012/wordml" xmlns:w16cex="http://schemas.microsoft.com/office/word/2018/wordml/cex" xmlns:w16cid="http://schemas.microsoft.com/office/word/2016/wordml/cid" xmlns:w16="http://schemas.microsoft.com/office/word/2018/wordml" xmlns:w16du="http://schemas.microsoft.com/office/word/2023/wordml/word16du" xmlns:w16sdtdh="http://schemas.microsoft.com/office/word/2020/wordml/sdtdatahash" xmlns:w16sdtfl="http://schemas.microsoft.com/office/word/2024/wordml/sdtformatlock" xmlns:w16se="http://schemas.microsoft.com/office/word/2015/wordml/symex" xmlns:sl="http://schemas.openxmlformats.org/schemaLibrary/2006/main" mc:Ignorable="w14 w15 w16se w16cid w16 w16cex w16sdtdh w16sdtfl w16du">
-  <w:zoom w:percent="100"/>
-  <w:proofState w:spelling="clean" w:grammar="clean"/>
-  <w:stylePaneFormatFilter w:val="3F01" w:allStyles="1" w:customStyles="0" w:latentStyles="0" w:stylesInUse="0" w:headingStyles="0" w:numberingStyles="0" w:tableStyles="0" w:directFormattingOnRuns="1" w:directFormattingOnParagraphs="1" w:directFormattingOnNumbering="1" w:directFormattingOnTables="1" w:clearFormatting="1" w:top3HeadingStyles="1" w:visibleStyles="0" w:alternateStyleNames="0"/>
-  <w:defaultTabStop w:val="708"/>
-  <w:hyphenationZone w:val="425"/>
-  <w:noPunctuationKerning/>
-  <w:characterSpacingControl w:val="doNotCompress"/>
-  <w:hdrShapeDefaults>
-    <o:shapedefaults v:ext="edit" spidmax="2050"/>
-  </w:hdrShapeDefaults>
-  <w:footnotePr>
-    <w:footnote w:id="-1"/>
-    <w:footnote w:id="0"/>
-  </w:footnotePr>
-  <w:endnotePr>
-    <w:endnote w:id="-1"/>
-    <w:endnote w:id="0"/>
-  </w:endnotePr>
-  <w:compat>
-    <w:applyBreakingRules/>
-    <w:useFELayout/>
-    <w:compatSetting w:name="compatibilityMode" w:uri="http://schemas.microsoft.com/office/word" w:val="15"/>
-    <w:compatSetting w:name="overrideTableStyleFontSizeAndJustification" w:uri="http://schemas.microsoft.com/office/word" w:val="1"/>
-    <w:compatSetting w:name="enableOpenTypeFeatures" w:uri="http://schemas.microsoft.com/office/word" w:val="1"/>
-    <w:compatSetting w:name="doNotFlipMirrorIndents" w:uri="http://schemas.microsoft.com/office/word" w:val="1"/>
-    <w:compatSetting w:name="differentiateMultirowTableHeaders" w:uri="http://schemas.microsoft.com/office/word" w:val="1"/>
-    <w:compatSetting w:name="useWord2013TrackBottomHyphenation" w:uri="http://schemas.microsoft.com/office/word" w:val="0"/>
-  </w:compat>
-  <w:rsids>
-    <w:rsidRoot w:val="006A678E"/>
-    <w:rsid w:val="00004B63"/>
-    <w:rsid w:val="0000634C"/>
-    <w:rsid w:val="000068BB"/>
-    <w:rsid w:val="00016575"/>
-    <w:rsid w:val="00016FC9"/>
-    <w:rsid w:val="00027331"/>
-    <w:rsid w:val="000317F5"/>
-    <w:rsid w:val="00046E29"/>
-    <w:rsid w:val="0005027D"/>
-    <w:rsid w:val="0005137D"/>
-    <w:rsid w:val="00055D06"/>
-    <w:rsid w:val="00064E72"/>
-    <w:rsid w:val="00065DC8"/>
-    <w:rsid w:val="00087F1E"/>
-    <w:rsid w:val="00095F8C"/>
-    <w:rsid w:val="00096411"/>
-    <w:rsid w:val="000A2090"/>
-    <w:rsid w:val="000A57E4"/>
-    <w:rsid w:val="000B144B"/>
-    <w:rsid w:val="000C123D"/>
-    <w:rsid w:val="000C698B"/>
-    <w:rsid w:val="000C77D9"/>
-    <w:rsid w:val="000C7F60"/>
-    <w:rsid w:val="000D542C"/>
-    <w:rsid w:val="000E540D"/>
-    <w:rsid w:val="000F0FBF"/>
-    <w:rsid w:val="000F6268"/>
-    <w:rsid w:val="000F669F"/>
-    <w:rsid w:val="001029E7"/>
-    <w:rsid w:val="00103EE3"/>
-    <w:rsid w:val="001116CF"/>
-    <w:rsid w:val="001201F7"/>
-    <w:rsid w:val="00121987"/>
-    <w:rsid w:val="00124498"/>
-    <w:rsid w:val="0012588F"/>
-    <w:rsid w:val="00131646"/>
-    <w:rsid w:val="00132CAD"/>
-    <w:rsid w:val="00133808"/>
-    <w:rsid w:val="00134A53"/>
-    <w:rsid w:val="0013507C"/>
-    <w:rsid w:val="001419F7"/>
-    <w:rsid w:val="00147264"/>
-    <w:rsid w:val="001762A7"/>
-    <w:rsid w:val="00180E75"/>
-    <w:rsid w:val="00181CC1"/>
-    <w:rsid w:val="00184F19"/>
-    <w:rsid w:val="00190EEF"/>
-    <w:rsid w:val="00191291"/>
-    <w:rsid w:val="00191699"/>
-    <w:rsid w:val="001A036A"/>
-    <w:rsid w:val="001B0F1A"/>
-    <w:rsid w:val="001C116D"/>
-    <w:rsid w:val="001C66BC"/>
-    <w:rsid w:val="001D0626"/>
-    <w:rsid w:val="001D4D75"/>
-    <w:rsid w:val="001E4658"/>
-    <w:rsid w:val="001F0193"/>
-    <w:rsid w:val="001F37CB"/>
-    <w:rsid w:val="001F4715"/>
-    <w:rsid w:val="001F5F11"/>
-    <w:rsid w:val="001F6617"/>
-    <w:rsid w:val="00201F83"/>
-    <w:rsid w:val="00206C26"/>
-    <w:rsid w:val="00221A05"/>
-    <w:rsid w:val="00225DA2"/>
-    <w:rsid w:val="00227157"/>
-    <w:rsid w:val="00227369"/>
-    <w:rsid w:val="00230387"/>
-    <w:rsid w:val="00230FA4"/>
-    <w:rsid w:val="00235A92"/>
-    <w:rsid w:val="002369F3"/>
-    <w:rsid w:val="00240B40"/>
-    <w:rsid w:val="002418B5"/>
-    <w:rsid w:val="00243C48"/>
-    <w:rsid w:val="00245DD8"/>
-    <w:rsid w:val="002511BD"/>
-    <w:rsid w:val="002535FB"/>
-    <w:rsid w:val="00262A7F"/>
-    <w:rsid w:val="00262C34"/>
-    <w:rsid w:val="00266B11"/>
-    <w:rsid w:val="002672FB"/>
-    <w:rsid w:val="00275F9C"/>
-    <w:rsid w:val="0029177C"/>
-    <w:rsid w:val="00297B2B"/>
-    <w:rsid w:val="002A11D0"/>
-    <w:rsid w:val="002A1ADD"/>
-    <w:rsid w:val="002A3424"/>
-    <w:rsid w:val="002A5972"/>
-    <w:rsid w:val="002A77A3"/>
-    <w:rsid w:val="002B39C9"/>
-    <w:rsid w:val="002B3D25"/>
-    <w:rsid w:val="002C0E3B"/>
-    <w:rsid w:val="002C63B9"/>
-    <w:rsid w:val="002D1F2D"/>
-    <w:rsid w:val="002D5FA2"/>
-    <w:rsid w:val="002E0504"/>
-    <w:rsid w:val="002E2555"/>
-    <w:rsid w:val="002F0BD5"/>
-    <w:rsid w:val="002F382F"/>
-    <w:rsid w:val="003036FF"/>
-    <w:rsid w:val="00311C76"/>
-    <w:rsid w:val="00320241"/>
-    <w:rsid w:val="00320C0C"/>
-    <w:rsid w:val="0032424A"/>
-    <w:rsid w:val="003313C9"/>
-    <w:rsid w:val="00331C94"/>
-    <w:rsid w:val="003331AF"/>
-    <w:rsid w:val="00334127"/>
-    <w:rsid w:val="00351C7E"/>
-    <w:rsid w:val="0036075F"/>
-    <w:rsid w:val="00361151"/>
-    <w:rsid w:val="00366A9E"/>
-    <w:rsid w:val="00371CE3"/>
-    <w:rsid w:val="00372A08"/>
-    <w:rsid w:val="0037365B"/>
-    <w:rsid w:val="00373C92"/>
-    <w:rsid w:val="0038248F"/>
-    <w:rsid w:val="00383119"/>
-    <w:rsid w:val="00385232"/>
-    <w:rsid w:val="003855C0"/>
-    <w:rsid w:val="00386977"/>
-    <w:rsid w:val="00387700"/>
-    <w:rsid w:val="003919BC"/>
-    <w:rsid w:val="0039250E"/>
-    <w:rsid w:val="00396F75"/>
-    <w:rsid w:val="003A28E0"/>
-    <w:rsid w:val="003B1A8B"/>
-    <w:rsid w:val="003B23A9"/>
-    <w:rsid w:val="003B791F"/>
-    <w:rsid w:val="003B7C6A"/>
-    <w:rsid w:val="003C215E"/>
-    <w:rsid w:val="003C798A"/>
-    <w:rsid w:val="003D0E82"/>
-    <w:rsid w:val="003D77EF"/>
-    <w:rsid w:val="003E03BB"/>
-    <w:rsid w:val="003E464B"/>
-    <w:rsid w:val="003E5F24"/>
-    <w:rsid w:val="003F17BF"/>
-    <w:rsid w:val="003F346A"/>
-    <w:rsid w:val="00403893"/>
-    <w:rsid w:val="00411B4E"/>
-    <w:rsid w:val="00412D0F"/>
-    <w:rsid w:val="00415336"/>
-    <w:rsid w:val="00415D2F"/>
-    <w:rsid w:val="00416F70"/>
-    <w:rsid w:val="00425A41"/>
-    <w:rsid w:val="0043246B"/>
-    <w:rsid w:val="00432F60"/>
-    <w:rsid w:val="00442E16"/>
-    <w:rsid w:val="004457C5"/>
-    <w:rsid w:val="00447E7B"/>
-    <w:rsid w:val="00452F96"/>
-    <w:rsid w:val="00454A51"/>
-    <w:rsid w:val="004556DB"/>
-    <w:rsid w:val="00455772"/>
-    <w:rsid w:val="00455FED"/>
-    <w:rsid w:val="00463646"/>
-    <w:rsid w:val="00463D7B"/>
-    <w:rsid w:val="004728BD"/>
-    <w:rsid w:val="00480179"/>
-    <w:rsid w:val="004930DB"/>
-    <w:rsid w:val="00493637"/>
-    <w:rsid w:val="00493963"/>
-    <w:rsid w:val="004950FA"/>
-    <w:rsid w:val="004A006A"/>
-    <w:rsid w:val="004A355A"/>
-    <w:rsid w:val="004A58EA"/>
-    <w:rsid w:val="004A7291"/>
-    <w:rsid w:val="004B1614"/>
-    <w:rsid w:val="004C03F7"/>
-    <w:rsid w:val="004C1671"/>
-    <w:rsid w:val="004C23F5"/>
-    <w:rsid w:val="004C51D1"/>
-    <w:rsid w:val="004D1D46"/>
-    <w:rsid w:val="004D7C0E"/>
-    <w:rsid w:val="004E17C2"/>
-    <w:rsid w:val="004E308F"/>
-    <w:rsid w:val="004E4348"/>
-    <w:rsid w:val="004E46F4"/>
-    <w:rsid w:val="004E5A20"/>
-    <w:rsid w:val="004E65C5"/>
-    <w:rsid w:val="004E6E64"/>
-    <w:rsid w:val="004F2953"/>
-    <w:rsid w:val="004F7C7C"/>
-    <w:rsid w:val="0050132C"/>
-    <w:rsid w:val="00506A9A"/>
-    <w:rsid w:val="0050713F"/>
-    <w:rsid w:val="00510B84"/>
-    <w:rsid w:val="00516FBA"/>
-    <w:rsid w:val="0051743C"/>
-    <w:rsid w:val="00521869"/>
-    <w:rsid w:val="00522BFE"/>
-    <w:rsid w:val="00522C04"/>
-    <w:rsid w:val="00527AE7"/>
-    <w:rsid w:val="00530B91"/>
-    <w:rsid w:val="00533F10"/>
-    <w:rsid w:val="00540967"/>
-    <w:rsid w:val="005426D3"/>
-    <w:rsid w:val="00544593"/>
-    <w:rsid w:val="0055299A"/>
-    <w:rsid w:val="00556690"/>
-    <w:rsid w:val="0056023E"/>
-    <w:rsid w:val="00565DCE"/>
-    <w:rsid w:val="00574D25"/>
-    <w:rsid w:val="00582DEB"/>
-    <w:rsid w:val="00585FD9"/>
-    <w:rsid w:val="00596E44"/>
-    <w:rsid w:val="005A4C0A"/>
-    <w:rsid w:val="005B2AEF"/>
-    <w:rsid w:val="005B4D59"/>
-    <w:rsid w:val="005C0B25"/>
-    <w:rsid w:val="005C1F52"/>
-    <w:rsid w:val="005C7D25"/>
-    <w:rsid w:val="005D1FED"/>
-    <w:rsid w:val="005E6AA9"/>
-    <w:rsid w:val="005E7EEB"/>
-    <w:rsid w:val="005F1B75"/>
-    <w:rsid w:val="005F47C5"/>
-    <w:rsid w:val="005F4CE7"/>
-    <w:rsid w:val="005F61BB"/>
-    <w:rsid w:val="005F6EA2"/>
-    <w:rsid w:val="00603D9B"/>
-    <w:rsid w:val="0060477F"/>
-    <w:rsid w:val="00604898"/>
-    <w:rsid w:val="0060558F"/>
-    <w:rsid w:val="00605B6B"/>
-    <w:rsid w:val="00612F54"/>
-    <w:rsid w:val="006354E5"/>
-    <w:rsid w:val="00642126"/>
-    <w:rsid w:val="00642961"/>
-    <w:rsid w:val="00642DE1"/>
-    <w:rsid w:val="00652BE4"/>
-    <w:rsid w:val="0066356C"/>
-    <w:rsid w:val="0066442B"/>
-    <w:rsid w:val="006644F2"/>
-    <w:rsid w:val="006654E1"/>
-    <w:rsid w:val="00673CF0"/>
-    <w:rsid w:val="00677561"/>
-    <w:rsid w:val="00683014"/>
-    <w:rsid w:val="00690CB0"/>
-    <w:rsid w:val="00695A74"/>
-    <w:rsid w:val="00697C4E"/>
-    <w:rsid w:val="006A6576"/>
-    <w:rsid w:val="006A678E"/>
-    <w:rsid w:val="006B7E15"/>
-    <w:rsid w:val="006C01D1"/>
-    <w:rsid w:val="006D2685"/>
-    <w:rsid w:val="006D3D4A"/>
-    <w:rsid w:val="006D3F37"/>
-    <w:rsid w:val="006E0664"/>
-    <w:rsid w:val="006E7DA6"/>
-    <w:rsid w:val="006F0DBA"/>
-    <w:rsid w:val="006F13C0"/>
-    <w:rsid w:val="007017D3"/>
-    <w:rsid w:val="00702021"/>
-    <w:rsid w:val="00705D36"/>
-    <w:rsid w:val="0070634F"/>
-    <w:rsid w:val="00707958"/>
-    <w:rsid w:val="00707E99"/>
-    <w:rsid w:val="0071303A"/>
-    <w:rsid w:val="00713908"/>
-    <w:rsid w:val="007224A0"/>
-    <w:rsid w:val="00742685"/>
-    <w:rsid w:val="00747D22"/>
-    <w:rsid w:val="00750C48"/>
-    <w:rsid w:val="007523A5"/>
-    <w:rsid w:val="007558AF"/>
-    <w:rsid w:val="00763AF2"/>
-    <w:rsid w:val="007641A7"/>
-    <w:rsid w:val="00770597"/>
-    <w:rsid w:val="00784AFA"/>
-    <w:rsid w:val="00785FE7"/>
-    <w:rsid w:val="00794222"/>
-    <w:rsid w:val="007951B3"/>
-    <w:rsid w:val="00795AF7"/>
-    <w:rsid w:val="00797189"/>
-    <w:rsid w:val="007A40F8"/>
-    <w:rsid w:val="007B4D46"/>
-    <w:rsid w:val="007C0E77"/>
-    <w:rsid w:val="007C4899"/>
-    <w:rsid w:val="007C4D7F"/>
-    <w:rsid w:val="007C6AA7"/>
-    <w:rsid w:val="007C7A2E"/>
-    <w:rsid w:val="007D0935"/>
-    <w:rsid w:val="007D65E8"/>
-    <w:rsid w:val="007D7090"/>
-    <w:rsid w:val="007F3079"/>
-    <w:rsid w:val="007F3BAE"/>
-    <w:rsid w:val="007F74FB"/>
-    <w:rsid w:val="007F7D10"/>
-    <w:rsid w:val="0081678E"/>
-    <w:rsid w:val="00822242"/>
-    <w:rsid w:val="00822C60"/>
-    <w:rsid w:val="00827C8C"/>
-    <w:rsid w:val="0083691E"/>
-    <w:rsid w:val="008374F5"/>
-    <w:rsid w:val="00840C07"/>
-    <w:rsid w:val="008467F2"/>
-    <w:rsid w:val="00851056"/>
-    <w:rsid w:val="008520E6"/>
-    <w:rsid w:val="008528D4"/>
-    <w:rsid w:val="0086467A"/>
-    <w:rsid w:val="008677C0"/>
-    <w:rsid w:val="00877B5A"/>
-    <w:rsid w:val="00880B2D"/>
-    <w:rsid w:val="00882EBB"/>
-    <w:rsid w:val="00883A66"/>
-    <w:rsid w:val="00885D27"/>
-    <w:rsid w:val="00891C79"/>
-    <w:rsid w:val="0089255D"/>
-    <w:rsid w:val="00893787"/>
-    <w:rsid w:val="00894EEA"/>
-    <w:rsid w:val="008A260A"/>
-    <w:rsid w:val="008A59FF"/>
-    <w:rsid w:val="008A7430"/>
-    <w:rsid w:val="008B4007"/>
-    <w:rsid w:val="008C3E5B"/>
-    <w:rsid w:val="008C70A3"/>
-    <w:rsid w:val="008D0344"/>
-    <w:rsid w:val="008D247C"/>
-    <w:rsid w:val="008D2F9B"/>
-    <w:rsid w:val="008D4883"/>
-    <w:rsid w:val="008E28D5"/>
-    <w:rsid w:val="008E2EDD"/>
-    <w:rsid w:val="008F33E5"/>
-    <w:rsid w:val="009015DF"/>
-    <w:rsid w:val="00902AF1"/>
-    <w:rsid w:val="00903E09"/>
-    <w:rsid w:val="009052E4"/>
-    <w:rsid w:val="00910483"/>
-    <w:rsid w:val="00912166"/>
-    <w:rsid w:val="00921C7D"/>
-    <w:rsid w:val="009241BA"/>
-    <w:rsid w:val="00925BA2"/>
-    <w:rsid w:val="009304F4"/>
-    <w:rsid w:val="0093573F"/>
-    <w:rsid w:val="00942CDC"/>
-    <w:rsid w:val="00945D6E"/>
-    <w:rsid w:val="00951EA3"/>
-    <w:rsid w:val="00953561"/>
-    <w:rsid w:val="00953C13"/>
-    <w:rsid w:val="00957E88"/>
-    <w:rsid w:val="00965306"/>
-    <w:rsid w:val="00974AA7"/>
-    <w:rsid w:val="00975BBF"/>
-    <w:rsid w:val="009765AA"/>
-    <w:rsid w:val="0097791B"/>
-    <w:rsid w:val="00980604"/>
-    <w:rsid w:val="00982DA1"/>
-    <w:rsid w:val="00991AF8"/>
-    <w:rsid w:val="00994ED8"/>
-    <w:rsid w:val="009A586F"/>
-    <w:rsid w:val="009A6477"/>
-    <w:rsid w:val="009B168A"/>
-    <w:rsid w:val="009B2F5E"/>
-    <w:rsid w:val="009B7856"/>
-    <w:rsid w:val="009C0EB8"/>
-    <w:rsid w:val="009C3DFB"/>
-    <w:rsid w:val="009D04A2"/>
-    <w:rsid w:val="009D63C4"/>
-    <w:rsid w:val="00A009C9"/>
-    <w:rsid w:val="00A018DA"/>
-    <w:rsid w:val="00A032EE"/>
-    <w:rsid w:val="00A043E5"/>
-    <w:rsid w:val="00A062A5"/>
-    <w:rsid w:val="00A075DF"/>
-    <w:rsid w:val="00A13476"/>
-    <w:rsid w:val="00A14D9B"/>
-    <w:rsid w:val="00A15A6A"/>
-    <w:rsid w:val="00A16488"/>
-    <w:rsid w:val="00A21FD2"/>
-    <w:rsid w:val="00A27A88"/>
-    <w:rsid w:val="00A33B7E"/>
-    <w:rsid w:val="00A37868"/>
-    <w:rsid w:val="00A41A75"/>
-    <w:rsid w:val="00A46BE3"/>
-    <w:rsid w:val="00A509DB"/>
-    <w:rsid w:val="00A53BFF"/>
-    <w:rsid w:val="00A66DD3"/>
-    <w:rsid w:val="00A81DDF"/>
-    <w:rsid w:val="00A82711"/>
-    <w:rsid w:val="00A85989"/>
-    <w:rsid w:val="00A905FD"/>
-    <w:rsid w:val="00A972AF"/>
-    <w:rsid w:val="00A97DA8"/>
-    <w:rsid w:val="00AA1766"/>
-    <w:rsid w:val="00AA3306"/>
-    <w:rsid w:val="00AA5DF4"/>
-    <w:rsid w:val="00AB5827"/>
-    <w:rsid w:val="00AC23C8"/>
-    <w:rsid w:val="00AC319A"/>
-    <w:rsid w:val="00AC500D"/>
-    <w:rsid w:val="00AC63B0"/>
-    <w:rsid w:val="00AD215D"/>
-    <w:rsid w:val="00AD4BEF"/>
-    <w:rsid w:val="00AD59C6"/>
-    <w:rsid w:val="00AD7B02"/>
-    <w:rsid w:val="00AE08A1"/>
-    <w:rsid w:val="00AE3663"/>
-    <w:rsid w:val="00AE47BD"/>
-    <w:rsid w:val="00AE6EE2"/>
-    <w:rsid w:val="00AF3A6E"/>
-    <w:rsid w:val="00B067CD"/>
-    <w:rsid w:val="00B10569"/>
-    <w:rsid w:val="00B10E5A"/>
-    <w:rsid w:val="00B13106"/>
-    <w:rsid w:val="00B15509"/>
-    <w:rsid w:val="00B16A48"/>
-    <w:rsid w:val="00B20AE4"/>
-    <w:rsid w:val="00B541DB"/>
-    <w:rsid w:val="00B5487C"/>
-    <w:rsid w:val="00B668E4"/>
-    <w:rsid w:val="00B71B03"/>
-    <w:rsid w:val="00B9003D"/>
-    <w:rsid w:val="00B92CFF"/>
-    <w:rsid w:val="00B94F10"/>
-    <w:rsid w:val="00B95FAD"/>
-    <w:rsid w:val="00BA59FD"/>
-    <w:rsid w:val="00BA769C"/>
-    <w:rsid w:val="00BB136F"/>
-    <w:rsid w:val="00BB1D91"/>
-    <w:rsid w:val="00BB384B"/>
-    <w:rsid w:val="00BC0ED9"/>
-    <w:rsid w:val="00BD28AA"/>
-    <w:rsid w:val="00BD5E26"/>
-    <w:rsid w:val="00BD7DF0"/>
-    <w:rsid w:val="00BF0048"/>
-    <w:rsid w:val="00BF503E"/>
-    <w:rsid w:val="00C0053E"/>
-    <w:rsid w:val="00C1674D"/>
-    <w:rsid w:val="00C20E19"/>
-    <w:rsid w:val="00C260BD"/>
-    <w:rsid w:val="00C40C28"/>
-    <w:rsid w:val="00C44860"/>
-    <w:rsid w:val="00C44FE5"/>
-    <w:rsid w:val="00C46753"/>
-    <w:rsid w:val="00C46EF1"/>
-    <w:rsid w:val="00C473EE"/>
-    <w:rsid w:val="00C537BC"/>
-    <w:rsid w:val="00C55475"/>
-    <w:rsid w:val="00C5745B"/>
-    <w:rsid w:val="00C65A80"/>
-    <w:rsid w:val="00C7101B"/>
-    <w:rsid w:val="00C72441"/>
-    <w:rsid w:val="00C7652A"/>
-    <w:rsid w:val="00C7716A"/>
-    <w:rsid w:val="00C81711"/>
-    <w:rsid w:val="00CA6AD9"/>
-    <w:rsid w:val="00CB0E7B"/>
-    <w:rsid w:val="00CB220C"/>
-    <w:rsid w:val="00CB22EE"/>
-    <w:rsid w:val="00CB55F5"/>
-    <w:rsid w:val="00CC3CD2"/>
-    <w:rsid w:val="00CD300A"/>
-    <w:rsid w:val="00CD41E3"/>
-    <w:rsid w:val="00CE06F6"/>
-    <w:rsid w:val="00CE49A4"/>
-    <w:rsid w:val="00CF0EF8"/>
-    <w:rsid w:val="00CF12D2"/>
-    <w:rsid w:val="00CF1FFF"/>
-    <w:rsid w:val="00CF2F4E"/>
-    <w:rsid w:val="00CF3B3F"/>
-    <w:rsid w:val="00CF45B6"/>
-    <w:rsid w:val="00D040C6"/>
-    <w:rsid w:val="00D05413"/>
-    <w:rsid w:val="00D05445"/>
-    <w:rsid w:val="00D146C9"/>
-    <w:rsid w:val="00D24933"/>
-    <w:rsid w:val="00D27BCF"/>
-    <w:rsid w:val="00D37B2B"/>
-    <w:rsid w:val="00D4086F"/>
-    <w:rsid w:val="00D40A2E"/>
-    <w:rsid w:val="00D44ED4"/>
-    <w:rsid w:val="00D4695E"/>
-    <w:rsid w:val="00D54CB8"/>
-    <w:rsid w:val="00D5730C"/>
-    <w:rsid w:val="00D62814"/>
-    <w:rsid w:val="00D62E19"/>
-    <w:rsid w:val="00D65170"/>
-    <w:rsid w:val="00D70139"/>
-    <w:rsid w:val="00D77346"/>
-    <w:rsid w:val="00D910FA"/>
-    <w:rsid w:val="00D941EF"/>
-    <w:rsid w:val="00D9644A"/>
-    <w:rsid w:val="00DA092C"/>
-    <w:rsid w:val="00DA27C6"/>
-    <w:rsid w:val="00DA4291"/>
-    <w:rsid w:val="00DB2716"/>
-    <w:rsid w:val="00DB2B92"/>
-    <w:rsid w:val="00DC06C8"/>
-    <w:rsid w:val="00DD0317"/>
-    <w:rsid w:val="00DD0D80"/>
-    <w:rsid w:val="00DD4434"/>
-    <w:rsid w:val="00DD5AFF"/>
-    <w:rsid w:val="00DE21F5"/>
-    <w:rsid w:val="00DE674C"/>
-    <w:rsid w:val="00DE7700"/>
-    <w:rsid w:val="00DF0A4C"/>
-    <w:rsid w:val="00E064AA"/>
-    <w:rsid w:val="00E14A45"/>
-    <w:rsid w:val="00E1693F"/>
-    <w:rsid w:val="00E232F8"/>
-    <w:rsid w:val="00E26E0A"/>
-    <w:rsid w:val="00E3056B"/>
-    <w:rsid w:val="00E35817"/>
-    <w:rsid w:val="00E36698"/>
-    <w:rsid w:val="00E37C74"/>
-    <w:rsid w:val="00E52275"/>
-    <w:rsid w:val="00E53D77"/>
-    <w:rsid w:val="00E60887"/>
-    <w:rsid w:val="00E725A4"/>
-    <w:rsid w:val="00E73C96"/>
-    <w:rsid w:val="00E75B37"/>
-    <w:rsid w:val="00E775A4"/>
-    <w:rsid w:val="00E82584"/>
-    <w:rsid w:val="00E86B2B"/>
-    <w:rsid w:val="00E90B4F"/>
-    <w:rsid w:val="00E92AC8"/>
-    <w:rsid w:val="00EA48DA"/>
-    <w:rsid w:val="00EA6926"/>
-    <w:rsid w:val="00EB0971"/>
-    <w:rsid w:val="00EB1FEE"/>
-    <w:rsid w:val="00EB2968"/>
-    <w:rsid w:val="00EB3A4E"/>
-    <w:rsid w:val="00EB79E2"/>
-    <w:rsid w:val="00EC4B9B"/>
-    <w:rsid w:val="00ED05BC"/>
-    <w:rsid w:val="00ED2022"/>
-    <w:rsid w:val="00EE731A"/>
-    <w:rsid w:val="00EE7E6F"/>
-    <w:rsid w:val="00EF5A81"/>
-    <w:rsid w:val="00F01D91"/>
-    <w:rsid w:val="00F05D35"/>
-    <w:rsid w:val="00F0777B"/>
-    <w:rsid w:val="00F10662"/>
-    <w:rsid w:val="00F10D18"/>
-    <w:rsid w:val="00F22605"/>
-    <w:rsid w:val="00F26B01"/>
-    <w:rsid w:val="00F27270"/>
-    <w:rsid w:val="00F40AE0"/>
-    <w:rsid w:val="00F654AF"/>
-    <w:rsid w:val="00F67634"/>
-    <w:rsid w:val="00F709C0"/>
-    <w:rsid w:val="00F72222"/>
-    <w:rsid w:val="00F808DF"/>
-    <w:rsid w:val="00F8403C"/>
-    <w:rsid w:val="00F924B6"/>
-    <w:rsid w:val="00F936C9"/>
-    <w:rsid w:val="00FA2462"/>
-    <w:rsid w:val="00FA2EBB"/>
-    <w:rsid w:val="00FB29E9"/>
-    <w:rsid w:val="00FB5593"/>
-    <w:rsid w:val="00FC0E66"/>
-    <w:rsid w:val="00FC244F"/>
-    <w:rsid w:val="00FC7829"/>
-    <w:rsid w:val="00FD2978"/>
-    <w:rsid w:val="00FD7A7D"/>
-    <w:rsid w:val="00FF1EEB"/>
-    <w:rsid w:val="00FF64AB"/>
-  </w:rsids>
-  <m:mathPr>
-    <m:mathFont m:val="Cambria Math"/>
-    <m:brkBin m:val="before"/>
-    <m:brkBinSub m:val="--"/>
-    <m:smallFrac m:val="0"/>
-    <m:dispDef/>
-    <m:lMargin m:val="0"/>
-    <m:rMargin m:val="0"/>
-    <m:defJc m:val="centerGroup"/>
-    <m:wrapIndent m:val="1440"/>
-    <m:intLim m:val="subSup"/>
-    <m:naryLim m:val="undOvr"/>
-  </m:mathPr>
-  <w:themeFontLang w:val="pt-BR"/>
-  <w:clrSchemeMapping w:bg1="light1" w:t1="dark1" w:bg2="light2" w:t2="dark2" w:accent1="accent1" w:accent2="accent2" w:accent3="accent3" w:accent4="accent4" w:accent5="accent5" w:accent6="accent6" w:hyperlink="hyperlink" w:followedHyperlink="followedHyperlink"/>
-  <w:doNotIncludeSubdocsInStats/>
-  <w:shapeDefaults>
-    <o:shapedefaults v:ext="edit" spidmax="2050"/>
-    <o:shapelayout v:ext="edit">
-      <o:idmap v:ext="edit" data="2"/>
-    </o:shapelayout>
-  </w:shapeDefaults>
-  <w:decimalSymbol w:val=","/>
-  <w:listSeparator w:val=";"/>
-  <w14:docId w14:val="58AD11FB"/>
-  <w15:docId w15:val="{94FD17E7-CF45-41A5-A183-E3C08A70C2FD}"/>
-</w:settings>
-</file>
-
-<file path=word\styles.xml><?xml version="1.0" encoding="utf-8"?>
+<file path=word/styles.xml><?xml version="1.0" encoding="utf-8"?>
 <w:styles xmlns:mc="http://schemas.openxmlformats.org/markup-compatibility/2006" xmlns:r="http://schemas.openxmlformats.org/officeDocument/2006/relationships" xmlns:w="http://schemas.openxmlformats.org/wordprocessingml/2006/main" xmlns:w14="http://schemas.microsoft.com/office/word/2010/wordml" xmlns:w15="http://schemas.microsoft.com/office/word/2012/wordml" xmlns:w16cex="http://schemas.microsoft.com/office/word/2018/wordml/cex" xmlns:w16cid="http://schemas.microsoft.com/office/word/2016/wordml/cid" xmlns:w16="http://schemas.microsoft.com/office/word/2018/wordml" xmlns:w16du="http://schemas.microsoft.com/office/word/2023/wordml/word16du" xmlns:w16sdtdh="http://schemas.microsoft.com/office/word/2020/wordml/sdtdatahash" xmlns:w16sdtfl="http://schemas.microsoft.com/office/word/2024/wordml/sdtformatlock" xmlns:w16se="http://schemas.microsoft.com/office/word/2015/wordml/symex" mc:Ignorable="w14 w15 w16se w16cid w16 w16cex w16sdtdh w16sdtfl w16du">
   <w:docDefaults>
     <w:rPrDefault>
@@ -8985,7 +8970,7 @@
 </w:styles>
 </file>
 
-<file path=word\theme\theme1.xml><?xml version="1.0" encoding="utf-8"?>
+<file path=word/theme/theme1.xml><?xml version="1.0" encoding="utf-8"?>
 <a:theme xmlns:a="http://schemas.openxmlformats.org/drawingml/2006/main" name="Tema do Office">
   <a:themeElements>
     <a:clrScheme name="Escritório">
@@ -9270,8 +9255,14 @@
 </a:theme>
 </file>
 
-<file path=word\webSettings.xml><?xml version="1.0" encoding="utf-8"?>
-<w:webSettings xmlns:mc="http://schemas.openxmlformats.org/markup-compatibility/2006" xmlns:r="http://schemas.openxmlformats.org/officeDocument/2006/relationships" xmlns:w="http://schemas.openxmlformats.org/wordprocessingml/2006/main" xmlns:w14="http://schemas.microsoft.com/office/word/2010/wordml" xmlns:w15="http://schemas.microsoft.com/office/word/2012/wordml" xmlns:w16cex="http://schemas.microsoft.com/office/word/2018/wordml/cex" xmlns:w16cid="http://schemas.microsoft.com/office/word/2016/wordml/cid" xmlns:w16="http://schemas.microsoft.com/office/word/2018/wordml" xmlns:w16du="http://schemas.microsoft.com/office/word/2023/wordml/word16du" xmlns:w16sdtdh="http://schemas.microsoft.com/office/word/2020/wordml/sdtdatahash" xmlns:w16sdtfl="http://schemas.microsoft.com/office/word/2024/wordml/sdtformatlock" xmlns:w16se="http://schemas.microsoft.com/office/word/2015/wordml/symex" mc:Ignorable="w14 w15 w16se w16cid w16 w16cex w16sdtdh w16sdtfl w16du">
-  <w:optimizeForBrowser/>
-</w:webSettings>
+<file path=customXml/item1.xml><?xml version="1.0" encoding="utf-8"?>
+<b:Sources xmlns:b="http://schemas.openxmlformats.org/officeDocument/2006/bibliography" xmlns="http://schemas.openxmlformats.org/officeDocument/2006/bibliography" SelectedStyle="\APA.XSL" StyleName="APA"/>
+</file>
+
+<file path=customXml/itemProps1.xml><?xml version="1.0" encoding="utf-8"?>
+<ds:datastoreItem xmlns:ds="http://schemas.openxmlformats.org/officeDocument/2006/customXml" ds:itemID="{EE4BC9EC-644D-4D87-AFC8-3A05FD12D9F8}">
+  <ds:schemaRefs>
+    <ds:schemaRef ds:uri="http://schemas.openxmlformats.org/officeDocument/2006/bibliography"/>
+  </ds:schemaRefs>
+</ds:datastoreItem>
 </file>
</xml_diff>

<commit_message>
Documenta calibração e pendências de bancada
Atualiza README, arquitetura e roteiros com os valores PWM/kick por esteira, registrando a calibração como relato sem inventar medições ou aprovações. Documenta também as pendências do Bloco 3, do LCD e do separador, e inclui um handoff com o contexto técnico do dia.
Commit e era isso!
</commit_message>
<xml_diff>
--- a/docs/artigo/Projeto de pesquisa - Final.docx
+++ b/docs/artigo/Projeto de pesquisa - Final.docx
@@ -988,7 +988,7 @@
           <w:rFonts w:ascii="Arial" w:hAnsi="Arial" w:cs="Arial"/>
           <w:color w:val="000000" w:themeColor="text1"/>
         </w:rPr>
-        <w:t xml:space="preserve">A Figura 1 apresenta o diagrama 2D do sistema de intralogística na concepção inicial. Na implementação, os sensores de seleção (RFID/IoT) deram lugar aos sensores infravermelhos das junções J1, J2 e J3, e a roda de separação ao fim da esteira principal ainda está em integração.</w:t>
+        <w:t xml:space="preserve">A Figura 1 apresenta o diagrama 2D do sistema de intralogística na concepção inicial. Na implementação, os sensores de seleção (RFID/IoT) deram lugar aos sensores infravermelhos das junções J1, J2 e J3, e a roda de separação ao fim da esteira principal foi implementada; giro isolado relatado como OK, e o modo automático ainda não foi validado em bancada.</w:t>
       </w:r>
     </w:p>
     <w:p>
@@ -1468,7 +1468,7 @@
           <w:rFonts w:ascii="Arial" w:hAnsi="Arial" w:cs="Arial"/>
           <w:color w:val="000000" w:themeColor="text1"/>
         </w:rPr>
-        <w:t xml:space="preserve">O código-fonte foi desenvolvido em linguagem C++ para a plataforma Arduino UNO, utilizando uma arquitetura de máquina de estados finita (FSM – Finite State Machine) com cinco estados distintos. Na versão 3.0 (outubro de 2026), o firmware foi reestruturado em módulos: a lógica (protocolo, filtro das entradas, supervisor da entrega, FSM e telas do LCD) fica separada da camada de hardware (motores, sensores, comunicação serial, LCD e diagnóstico) e é verificada no computador por 43 testes automatizados. Essa abordagem garante que o sistema opere de forma determinística, previsível e segura, facilitando a depuração e a manutenção do código.</w:t>
+        <w:t xml:space="preserve">O código-fonte foi desenvolvido em linguagem C++ para a plataforma Arduino UNO, utilizando uma arquitetura de máquina de estados finita (FSM – Finite State Machine) com cinco estados distintos. Na versão 3.0 (outubro de 2026), o firmware foi reestruturado em módulos: a lógica (protocolo, filtro das entradas, supervisor da entrega, FSM e telas do LCD) fica separada da camada de hardware (motores, sensores, comunicação serial, LCD e diagnóstico) e é verificada no computador por 84 testes automatizados. Essa abordagem garante que o sistema opere de forma determinística, previsível e segura, facilitando a depuração e a manutenção do código.</w:t>
       </w:r>
     </w:p>
     <w:p>
@@ -1503,7 +1503,7 @@
           <w:color w:val="000000" w:themeColor="text1"/>
         </w:rPr>
         <w:lastRenderedPageBreak/>
-        <w:t xml:space="preserve">Os cinco estados da máquina de estados são: (1) AGUARDANDO_PEDIDO – sistema em repouso aguardando comandos remotos (os botões físicos foram desabilitados); (2) VERIFICANDO_ESTOQUE – checagem prévia, sem ligar o motor, do contador interno, do sensor do topo e da junção livre; (3) ACIONANDO_ESTEIRA – partida do motor com kick-start (PWM 255 por 150 ms) e, em seguida, PWM de regime; (4) ENTREGANDO_PECA – supervisão por marcos: topo livre em até 3 s (M1), passagem na junção em até 12,5 s desde a partida (M2, quando o estoque é debitado) e 3 s de saída com a junção liberada (M3); e (5) ERRO – motores desligados, com a causa e a fase da falha exibidas no LCD e no dashboard, aguardando o comando de reset.</w:t>
+        <w:t xml:space="preserve">Os cinco estados da máquina de estados são: (1) AGUARDANDO_PEDIDO – sistema em repouso aguardando comandos remotos (os botões físicos foram desabilitados); (2) VERIFICANDO_ESTOQUE – checagem prévia, sem ligar o motor, do contador interno, do sensor do topo e da junção livre; (3) ACIONANDO_ESTEIRA – partida do motor com kick-start (PWM 255 por kickMs; A=180 ms, B=130 ms, C=180 ms) e, em seguida, PWM de regime; (4) ENTREGANDO_PECA – supervisão por marcos: topo livre em até 3 s (M1), passagem na junção em até 12,5 s desde a partida (M2, quando o estoque é debitado) e 3 s de saída com a junção liberada (M3); e (5) ERRO – motores desligados, com a causa e a fase da falha exibidas no LCD e no dashboard, aguardando o comando de reset.</w:t>
       </w:r>
     </w:p>
     <w:p>
@@ -2175,7 +2175,7 @@
           <w:sz w:val="24"/>
           <w:szCs w:val="24"/>
         </w:rPr>
-        <w:t xml:space="preserve">O roteiro experimental foi estruturado em suítes progressivas: blocos de componentes isolados (B0.1 a B0.3), blocos de bancada integrada (B1 a B3) e cadeia de integração de ponta a ponta (Testes 1 a 6), seguidos, a partir de agosto, de roteiros semanais de bancada com portões de aprovação por bloco. Criou-se a sonda de telemetria mqtt_probe em Node.js para registro de mensagens com timestamp em dataflow/#, constituindo a base comprobatória de tempo de resposta e confiabilidade dos testes de bancada. Somam-se os testes automatizados: 43 testes da lógica do firmware executados no computador, testes do servidor e das métricas e testes ponta a ponta do dashboard com Playwright.</w:t>
+        <w:t xml:space="preserve">O roteiro experimental foi estruturado em suítes progressivas: blocos de componentes isolados (B0.1 a B0.3), blocos de bancada integrada (B1 a B3) e cadeia de integração de ponta a ponta (Testes 1 a 6), seguidos, a partir de agosto, de roteiros semanais de bancada com portões de aprovação por bloco. Criou-se a sonda de telemetria mqtt_probe em Node.js para registro de mensagens com timestamp em dataflow/#, constituindo a base comprobatória de tempo de resposta e confiabilidade dos testes de bancada. Somam-se os testes automatizados: 84 testes da lógica do firmware executados no computador, testes do servidor e das métricas e testes ponta a ponta do dashboard com Playwright.</w:t>
       </w:r>
     </w:p>
     <w:p>
@@ -2197,38 +2197,7 @@
           <w:sz w:val="24"/>
           <w:szCs w:val="24"/>
         </w:rPr>
-        <w:t xml:space="preserve">n) Robustez do firmware (versão 3.0): </w:t>
-      </w:r>
-      <w:r>
-        <w:rPr>
-          <w:rFonts w:ascii="Arial" w:hAnsi="Arial" w:cs="Arial"/>
-          <w:color w:val="000000" w:themeColor="text1"/>
-          <w:sz w:val="24"/>
-          <w:szCs w:val="24"/>
-        </w:rPr>
-        <w:t xml:space="preserve">O firmware ganhou watchdog de 2 s, que desliga os motores antes do reinício; informa no boot a causa do último reset (energia, reinício, watchdog ou brownout); trata o LCD como opcional, procurando-o nos endereços 0x27 e 0x3F e desligando-o se o barramento I2C travar, em vez de travar o controlador; limita rajadas de interrupção de sensores oscilando no limiar; e grava os textos na memória flash, reduzindo o uso de RAM global de 55% para 46%. A versão anterior (2.x) permanece no histórico do repositório para retorno, e a validação da versão 3.0 em bancada, da esteira A até as três esteiras, é o objetivo da Semana 8 (05 a 09/10).</w:t>
-      </w:r>
-    </w:p>
-    <w:p>
-      <w:pPr>
-        <w:spacing w:line="360" w:lineRule="auto"/>
-        <w:jc w:val="both"/>
-        <w:rPr>
-          <w:rFonts w:ascii="Arial" w:hAnsi="Arial" w:cs="Arial"/>
-          <w:color w:val="000000" w:themeColor="text1"/>
-          <w:sz w:val="24"/>
-          <w:szCs w:val="24"/>
-        </w:rPr>
-      </w:pPr>
-      <w:r>
-        <w:rPr>
-          <w:rFonts w:ascii="Arial" w:hAnsi="Arial" w:cs="Arial"/>
-          <w:b/>
-          <w:color w:val="000000" w:themeColor="text1"/>
-          <w:sz w:val="24"/>
-          <w:szCs w:val="24"/>
-        </w:rPr>
-        <w:t xml:space="preserve">o) Estoque inicial e velocidade por esteira: </w:t>
+        <w:t xml:space="preserve">n) Robustez do firmware (versão 3.0): o LCD I²C é diagnosticado e se recupera; o firmware varre o barramento em 0x20–0x27 ou 0x38–0x3F (0x27 e 0x3F primeiro) e, se o display não responder, o sistema segue sem ele. Durante operação, se houver falha I²C o LCD é desligado para não travar o loop; com motores parados (AGUARDANDO_PEDIDO ou ERRO), o firmware tenta religar a cada 5 s, dobrando até 60 s. O `status` reporta lcd_end e i2c_n para rastrear o endereço e o estado do barramento. o) Estoque inicial e velocidade por esteira: </w:t>
       </w:r>
       <w:r>
         <w:rPr>
@@ -5206,7 +5175,7 @@
                 <w:sz w:val="18"/>
                 <w:szCs w:val="18"/>
               </w:rPr>
-              <w:t xml:space="preserve">GitHub Actions: lint, detecção de segredos, auditoria, compilação, 43 testes de firmware, testes de servidor e E2E com Playwright</w:t>
+              <w:t xml:space="preserve">GitHub Actions: lint, detecção de segredos, auditoria, compilação, 84 testes de firmware, testes de servidor e E2E com Playwright</w:t>
             </w:r>
           </w:p>
         </w:tc>

</xml_diff>

<commit_message>
docs: troca do LCD 16x2 pelo display OLED 0,96" I2C (SSD1306)
Sincroniza a documentação com o PR #68. README (árvore, estados,
diagrama, materiais, pinos, bibliotecas e próximas validações),
ARCHITECTURE (bibliotecas, campos do status, robustez e hardware),
CI-CD, DEPLOYMENT, plano de testes (B3 com o reteste do OLED; registro
de 18/08 mantido), roteiro da Semana 11, guia do separador, card do BOM,
CHANGELOG e projeto de pesquisa (só os parágrafos do estado atual e o
item p na lista de evolução). O diagrama elétrico não desenha o display,
então não mudou; o README deixa isso explícito.

Co-Authored-By: Claude Opus 5.5 <noreply@anthropic.com>
</commit_message>
<xml_diff>
--- a/docs/artigo/Projeto de pesquisa - Final.docx
+++ b/docs/artigo/Projeto de pesquisa - Final.docx
@@ -1468,7 +1468,7 @@
           <w:rFonts w:ascii="Arial" w:hAnsi="Arial" w:cs="Arial"/>
           <w:color w:val="000000" w:themeColor="text1"/>
         </w:rPr>
-        <w:t xml:space="preserve">O código-fonte foi desenvolvido em linguagem C++ para a plataforma Arduino UNO, utilizando uma arquitetura de máquina de estados finita (FSM – Finite State Machine) com cinco estados distintos. Na versão 3.0 (outubro de 2026), o firmware foi reestruturado em módulos: a lógica (protocolo, filtro das entradas, supervisor da entrega, FSM e telas do LCD) fica separada da camada de hardware (motores, sensores, comunicação serial, LCD e diagnóstico) e é verificada no computador por 84 testes automatizados. Essa abordagem garante que o sistema opere de forma determinística, previsível e segura, facilitando a depuração e a manutenção do código.</w:t>
+        <w:t xml:space="preserve">O código-fonte foi desenvolvido em linguagem C++ para a plataforma Arduino UNO, utilizando uma arquitetura de máquina de estados finita (FSM – Finite State Machine) com cinco estados distintos. Na versão 3.0 (outubro de 2026), o firmware foi reestruturado em módulos: a lógica (protocolo, filtro das entradas, supervisor da entrega, FSM e telas do display) fica separada da camada de hardware (motores, sensores, comunicação serial, display, separador e diagnóstico) e é verificada no computador por 88 testes automatizados. Essa abordagem garante que o sistema opere de forma determinística, previsível e segura, facilitando a depuração e a manutenção do código.</w:t>
       </w:r>
     </w:p>
     <w:p>
@@ -1503,7 +1503,7 @@
           <w:color w:val="000000" w:themeColor="text1"/>
         </w:rPr>
         <w:lastRenderedPageBreak/>
-        <w:t xml:space="preserve">Os cinco estados da máquina de estados são: (1) AGUARDANDO_PEDIDO – sistema em repouso aguardando comandos remotos (os botões físicos foram desabilitados); (2) VERIFICANDO_ESTOQUE – checagem prévia, sem ligar o motor, do contador interno, do sensor do topo e da junção livre; (3) ACIONANDO_ESTEIRA – partida do motor com kick-start (PWM 255 por kickMs; A=180 ms, B=130 ms, C=180 ms) e, em seguida, PWM de regime; (4) ENTREGANDO_PECA – supervisão por marcos: topo livre em até 3 s (M1), passagem na junção em até 12,5 s desde a partida (M2, quando o estoque é debitado) e 3 s de saída com a junção liberada (M3); e (5) ERRO – motores desligados, com a causa e a fase da falha exibidas no LCD e no dashboard, aguardando o comando de reset.</w:t>
+        <w:t xml:space="preserve">Os cinco estados da máquina de estados são: (1) AGUARDANDO_PEDIDO – sistema em repouso aguardando comandos remotos (os botões físicos foram desabilitados); (2) VERIFICANDO_ESTOQUE – checagem prévia, sem ligar o motor, do contador interno, do sensor do topo e da junção livre; (3) ACIONANDO_ESTEIRA – partida do motor com kick-start (PWM 255 por kickMs; A=180 ms, B=180 ms, C=180 ms) e, em seguida, PWM de regime; (4) ENTREGANDO_PECA – supervisão por marcos: topo livre em até 3 s (M1), passagem na junção em até 12,5 s desde a partida (M2, quando o estoque é debitado) e 3 s de saída com a junção liberada (M3); e (5) ERRO – motores desligados, com a causa e a fase da falha exibidas no display e no dashboard, aguardando o comando de reset.</w:t>
       </w:r>
     </w:p>
     <w:p>
@@ -1537,7 +1537,7 @@
           <w:rFonts w:ascii="Arial" w:hAnsi="Arial" w:cs="Arial"/>
           <w:color w:val="000000" w:themeColor="text1"/>
         </w:rPr>
-        <w:t xml:space="preserve">O mapeamento de pinos adotado é o seguinte: os pinos PWM 9, 10 e 11 acionam os drivers IRF520 das esteiras A, B e C; os sensores IR TCRT5000 do topo das esteiras secundárias estão ligados às entradas A0, A1 e A2, e os sensores das junções J1, J2 e J3 utilizam A3, D2 e D4, lidos por interrupção de mudança de nível. Os pinos A4 (SDA) e A5 (SCL) ficam dedicados ao display LCD 16x2 com módulo I2C (endereço 0x27 ou 0x3F, detectado na inicialização), os pinos 0 e 1 fazem a comunicação serial com o ESP32 e os pinos 5 a 8 ficam reservados ao driver ULN2003 do motor de passo da roda de separação.</w:t>
+        <w:t xml:space="preserve">O mapeamento de pinos adotado é o seguinte: os pinos PWM 9, 10 e 11 acionam os drivers IRF520 das esteiras A, B e C; os sensores IR TCRT5000 do topo das esteiras secundárias estão ligados às entradas A0, A1 e A2, e os sensores das junções J1, J2 e J3 utilizam A3, D2 e D4, lidos por interrupção de mudança de nível. Os pinos A4 (SDA) e A5 (SCL) ficam dedicados ao display OLED de 0,96" (128x64 pixels, controlador SSD1306) com interface I2C (endereço 0x3C ou 0x3D, detectado na inicialização), que em outubro de 2026 substituiu o display LCD 16x2; os pinos 0 e 1 fazem a comunicação serial com o ESP32 e os pinos 5 a 8 acionam o driver ULN2003 do motor de passo da roda de separação.</w:t>
       </w:r>
     </w:p>
     <w:p>
@@ -2206,7 +2206,7 @@
           <w:sz w:val="24"/>
           <w:szCs w:val="24"/>
         </w:rPr>
-        <w:t xml:space="preserve">O estoque inicial passou de 5 para 15 peças por tipo, permitindo mais rodadas de teste sem reiniciar o sistema, e cada esteira secundária recebeu parâmetros próprios de partida e velocidade (PWM de regime 200, mínimo de ~150 para mover a esteira com peça), calibrados em bancada após a troca do motor da esteira C.</w:t>
+        <w:t xml:space="preserve">O estoque inicial passou de 5 para 15 peças por tipo, permitindo mais rodadas de teste sem reiniciar o sistema, e cada esteira secundária recebeu parâmetros próprios de partida e velocidade (PWM de regime 200, mínimo de ~150 para mover a esteira com peça), calibrados em bancada após a troca do motor da esteira C. p) Troca do display: o LCD 16x2 deixou de responder no barramento I²C (o status indicava nenhum dispositivo, i2c_n = 0), uma falha elétrica do módulo, e foi substituído por um display OLED de 0,96" (128x64, controlador SSD1306). Para caber nos 2 KB de RAM do Uno, o firmware usa uma biblioteca que escreve o texto direto no display, sem manter uma imagem da tela na memória; a tela continua com 2 linhas de 16 colunas, a varredura passou a procurar os endereços 0x3C e 0x3D e a recuperação automática foi mantida.</w:t>
       </w:r>
     </w:p>
     <w:p>

</xml_diff>